<commit_message>
Update FloodSense manuscript, diagrams, and supporting documents
</commit_message>
<xml_diff>
--- a/1. FLOODSENSE-MAIN/MAIN FILESS/DIAGRAMS/Context Diagram.docx
+++ b/1. FLOODSENSE-MAIN/MAIN FILESS/DIAGRAMS/Context Diagram.docx
@@ -12,18 +12,18 @@
         <mc:AlternateContent>
           <mc:Choice Requires="wps">
             <w:drawing>
-              <wp:anchor distT="0" distB="0" distL="114300" distR="114300" simplePos="0" relativeHeight="251852288" behindDoc="0" locked="0" layoutInCell="0" allowOverlap="1" wp14:anchorId="04ACFA10" wp14:editId="6ECA6D54">
+              <wp:anchor distT="0" distB="0" distL="114300" distR="114300" simplePos="0" relativeHeight="251716096" behindDoc="0" locked="0" layoutInCell="0" allowOverlap="1" wp14:anchorId="2774A086" wp14:editId="4302A49D">
                 <wp:simplePos x="0" y="0"/>
                 <wp:positionH relativeFrom="page">
-                  <wp:posOffset>4364576</wp:posOffset>
+                  <wp:posOffset>4513694</wp:posOffset>
                 </wp:positionH>
                 <wp:positionV relativeFrom="page">
-                  <wp:posOffset>2738590</wp:posOffset>
+                  <wp:posOffset>5555805</wp:posOffset>
                 </wp:positionV>
-                <wp:extent cx="1168400" cy="271306"/>
-                <wp:effectExtent l="0" t="0" r="0" b="0"/>
+                <wp:extent cx="1422400" cy="228600"/>
+                <wp:effectExtent l="0" t="0" r="6350" b="0"/>
                 <wp:wrapNone/>
-                <wp:docPr id="54" name="Text Box 54"/>
+                <wp:docPr id="61" name="Text Box 61"/>
                 <wp:cNvGraphicFramePr/>
                 <a:graphic xmlns:a="http://schemas.openxmlformats.org/drawingml/2006/main">
                   <a:graphicData uri="http://schemas.microsoft.com/office/word/2010/wordprocessingShape">
@@ -32,7 +32,7 @@
                       <wps:spPr>
                         <a:xfrm>
                           <a:off x="0" y="0"/>
-                          <a:ext cx="1168400" cy="271306"/>
+                          <a:ext cx="1422400" cy="228600"/>
                         </a:xfrm>
                         <a:prstGeom prst="rect">
                           <a:avLst/>
@@ -67,24 +67,7 @@
                                 <w:color w:val="000000"/>
                                 <w:sz w:val="13"/>
                               </w:rPr>
-                              <w:t>Approved Rainfall</w:t>
-                            </w:r>
-                          </w:p>
-                          <w:p>
-                            <w:pPr>
-                              <w:spacing w:after="0"/>
-                              <w:jc w:val="center"/>
-                              <w:rPr>
-                                <w:color w:val="000000"/>
-                                <w:sz w:val="13"/>
-                              </w:rPr>
-                            </w:pPr>
-                            <w:r>
-                              <w:rPr>
-                                <w:color w:val="000000"/>
-                                <w:sz w:val="13"/>
-                              </w:rPr>
-                              <w:t xml:space="preserve"> References</w:t>
+                              <w:t>Permitted Activity Summary</w:t>
                             </w:r>
                           </w:p>
                         </w:txbxContent>
@@ -98,19 +81,16 @@
                     </wps:wsp>
                   </a:graphicData>
                 </a:graphic>
-                <wp14:sizeRelV relativeFrom="margin">
-                  <wp14:pctHeight>0</wp14:pctHeight>
-                </wp14:sizeRelV>
               </wp:anchor>
             </w:drawing>
           </mc:Choice>
           <mc:Fallback>
             <w:pict>
-              <v:shapetype w14:anchorId="04ACFA10" id="_x0000_t202" coordsize="21600,21600" o:spt="202" path="m,l,21600r21600,l21600,xe">
+              <v:shapetype w14:anchorId="2774A086" id="_x0000_t202" coordsize="21600,21600" o:spt="202" path="m,l,21600r21600,l21600,xe">
                 <v:stroke joinstyle="miter"/>
                 <v:path gradientshapeok="t" o:connecttype="rect"/>
               </v:shapetype>
-              <v:shape id="Text Box 54" o:spid="_x0000_s1026" type="#_x0000_t202" style="position:absolute;margin-left:343.65pt;margin-top:215.65pt;width:92pt;height:21.35pt;z-index:251852288;visibility:visible;mso-wrap-style:square;mso-height-percent:0;mso-wrap-distance-left:9pt;mso-wrap-distance-top:0;mso-wrap-distance-right:9pt;mso-wrap-distance-bottom:0;mso-position-horizontal:absolute;mso-position-horizontal-relative:page;mso-position-vertical:absolute;mso-position-vertical-relative:page;mso-height-percent:0;mso-height-relative:margin;v-text-anchor:middle" o:gfxdata="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" o:allowincell="f" filled="f" stroked="f" strokeweight=".5pt">
+              <v:shape id="Text Box 61" o:spid="_x0000_s1026" type="#_x0000_t202" style="position:absolute;margin-left:355.4pt;margin-top:437.45pt;width:112pt;height:18pt;z-index:251716096;visibility:visible;mso-wrap-style:square;mso-wrap-distance-left:9pt;mso-wrap-distance-top:0;mso-wrap-distance-right:9pt;mso-wrap-distance-bottom:0;mso-position-horizontal:absolute;mso-position-horizontal-relative:page;mso-position-vertical:absolute;mso-position-vertical-relative:page;v-text-anchor:middle" o:gfxdata="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" o:allowincell="f" filled="f" stroked="f" strokeweight=".5pt">
                 <v:textbox inset="2pt,1pt,2pt,1pt">
                   <w:txbxContent>
                     <w:p>
@@ -127,24 +107,7 @@
                           <w:color w:val="000000"/>
                           <w:sz w:val="13"/>
                         </w:rPr>
-                        <w:t>Approved Rainfall</w:t>
-                      </w:r>
-                    </w:p>
-                    <w:p>
-                      <w:pPr>
-                        <w:spacing w:after="0"/>
-                        <w:jc w:val="center"/>
-                        <w:rPr>
-                          <w:color w:val="000000"/>
-                          <w:sz w:val="13"/>
-                        </w:rPr>
-                      </w:pPr>
-                      <w:r>
-                        <w:rPr>
-                          <w:color w:val="000000"/>
-                          <w:sz w:val="13"/>
-                        </w:rPr>
-                        <w:t xml:space="preserve"> References</w:t>
+                        <w:t>Permitted Activity Summary</w:t>
                       </w:r>
                     </w:p>
                   </w:txbxContent>
@@ -162,18 +125,18 @@
         <mc:AlternateContent>
           <mc:Choice Requires="wps">
             <w:drawing>
-              <wp:anchor distT="0" distB="0" distL="114300" distR="114300" simplePos="0" relativeHeight="251883008" behindDoc="0" locked="0" layoutInCell="0" allowOverlap="1" wp14:anchorId="5B395E49" wp14:editId="18FF8E24">
+              <wp:anchor distT="0" distB="0" distL="114300" distR="114300" simplePos="0" relativeHeight="251705856" behindDoc="0" locked="0" layoutInCell="0" allowOverlap="1" wp14:anchorId="4F472559" wp14:editId="56DA19C3">
                 <wp:simplePos x="0" y="0"/>
                 <wp:positionH relativeFrom="page">
-                  <wp:posOffset>4749358</wp:posOffset>
+                  <wp:posOffset>4458875</wp:posOffset>
                 </wp:positionH>
                 <wp:positionV relativeFrom="page">
-                  <wp:posOffset>3095597</wp:posOffset>
+                  <wp:posOffset>4669420</wp:posOffset>
                 </wp:positionV>
-                <wp:extent cx="1473200" cy="152400"/>
-                <wp:effectExtent l="0" t="0" r="0" b="0"/>
+                <wp:extent cx="1879600" cy="279400"/>
+                <wp:effectExtent l="0" t="0" r="6350" b="6350"/>
                 <wp:wrapNone/>
-                <wp:docPr id="55" name="Text Box 55"/>
+                <wp:docPr id="60" name="Text Box 60"/>
                 <wp:cNvGraphicFramePr/>
                 <a:graphic xmlns:a="http://schemas.openxmlformats.org/drawingml/2006/main">
                   <a:graphicData uri="http://schemas.microsoft.com/office/word/2010/wordprocessingShape">
@@ -182,7 +145,7 @@
                       <wps:spPr>
                         <a:xfrm>
                           <a:off x="0" y="0"/>
-                          <a:ext cx="1473200" cy="152400"/>
+                          <a:ext cx="1879600" cy="279400"/>
                         </a:xfrm>
                         <a:prstGeom prst="rect">
                           <a:avLst/>
@@ -217,7 +180,7 @@
                                 <w:color w:val="000000"/>
                                 <w:sz w:val="13"/>
                               </w:rPr>
-                              <w:t>Rule and Content Validation</w:t>
+                              <w:t>Record Status and Source Metadata</w:t>
                             </w:r>
                           </w:p>
                         </w:txbxContent>
@@ -236,7 +199,7 @@
           </mc:Choice>
           <mc:Fallback>
             <w:pict>
-              <v:shape w14:anchorId="5B395E49" id="Text Box 55" o:spid="_x0000_s1027" type="#_x0000_t202" style="position:absolute;margin-left:373.95pt;margin-top:243.75pt;width:116pt;height:12pt;z-index:251883008;visibility:visible;mso-wrap-style:square;mso-wrap-distance-left:9pt;mso-wrap-distance-top:0;mso-wrap-distance-right:9pt;mso-wrap-distance-bottom:0;mso-position-horizontal:absolute;mso-position-horizontal-relative:page;mso-position-vertical:absolute;mso-position-vertical-relative:page;v-text-anchor:middle" o:gfxdata="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" o:allowincell="f" filled="f" stroked="f" strokeweight=".5pt">
+              <v:shape w14:anchorId="4F472559" id="Text Box 60" o:spid="_x0000_s1027" type="#_x0000_t202" style="position:absolute;margin-left:351.1pt;margin-top:367.65pt;width:148pt;height:22pt;z-index:251705856;visibility:visible;mso-wrap-style:square;mso-wrap-distance-left:9pt;mso-wrap-distance-top:0;mso-wrap-distance-right:9pt;mso-wrap-distance-bottom:0;mso-position-horizontal:absolute;mso-position-horizontal-relative:page;mso-position-vertical:absolute;mso-position-vertical-relative:page;v-text-anchor:middle" o:gfxdata="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" o:allowincell="f" filled="f" stroked="f" strokeweight=".5pt">
                 <v:textbox inset="2pt,1pt,2pt,1pt">
                   <w:txbxContent>
                     <w:p>
@@ -253,7 +216,7 @@
                           <w:color w:val="000000"/>
                           <w:sz w:val="13"/>
                         </w:rPr>
-                        <w:t>Rule and Content Validation</w:t>
+                        <w:t>Record Status and Source Metadata</w:t>
                       </w:r>
                     </w:p>
                   </w:txbxContent>
@@ -271,18 +234,226 @@
         <mc:AlternateContent>
           <mc:Choice Requires="wps">
             <w:drawing>
-              <wp:anchor distT="0" distB="0" distL="114300" distR="114300" simplePos="0" relativeHeight="251987456" behindDoc="0" locked="0" layoutInCell="0" allowOverlap="1" wp14:anchorId="47B445D4" wp14:editId="17BE3268">
+              <wp:anchor distT="0" distB="0" distL="114300" distR="114300" simplePos="0" relativeHeight="251746816" behindDoc="0" locked="0" layoutInCell="1" allowOverlap="1" wp14:anchorId="66B1891D" wp14:editId="3E0482F1">
+                <wp:simplePos x="0" y="0"/>
+                <wp:positionH relativeFrom="column">
+                  <wp:posOffset>3665855</wp:posOffset>
+                </wp:positionH>
+                <wp:positionV relativeFrom="paragraph">
+                  <wp:posOffset>3588375</wp:posOffset>
+                </wp:positionV>
+                <wp:extent cx="6824" cy="1859129"/>
+                <wp:effectExtent l="76200" t="0" r="69850" b="65405"/>
+                <wp:wrapNone/>
+                <wp:docPr id="65" name="Straight Arrow Connector 65"/>
+                <wp:cNvGraphicFramePr/>
+                <a:graphic xmlns:a="http://schemas.openxmlformats.org/drawingml/2006/main">
+                  <a:graphicData uri="http://schemas.microsoft.com/office/word/2010/wordprocessingShape">
+                    <wps:wsp>
+                      <wps:cNvCnPr/>
+                      <wps:spPr>
+                        <a:xfrm flipV="1">
+                          <a:off x="0" y="0"/>
+                          <a:ext cx="6824" cy="1859129"/>
+                        </a:xfrm>
+                        <a:prstGeom prst="straightConnector1">
+                          <a:avLst/>
+                        </a:prstGeom>
+                        <a:ln w="12700">
+                          <a:headEnd type="triangle" w="med" len="med"/>
+                          <a:tailEnd type="none" w="med" len="med"/>
+                        </a:ln>
+                      </wps:spPr>
+                      <wps:style>
+                        <a:lnRef idx="1">
+                          <a:schemeClr val="dk1"/>
+                        </a:lnRef>
+                        <a:fillRef idx="0">
+                          <a:schemeClr val="dk1"/>
+                        </a:fillRef>
+                        <a:effectRef idx="0">
+                          <a:schemeClr val="dk1"/>
+                        </a:effectRef>
+                        <a:fontRef idx="minor">
+                          <a:schemeClr val="tx1"/>
+                        </a:fontRef>
+                      </wps:style>
+                      <wps:bodyPr/>
+                    </wps:wsp>
+                  </a:graphicData>
+                </a:graphic>
+              </wp:anchor>
+            </w:drawing>
+          </mc:Choice>
+          <mc:Fallback>
+            <w:pict>
+              <v:shapetype w14:anchorId="5BC37D51" id="_x0000_t32" coordsize="21600,21600" o:spt="32" o:oned="t" path="m,l21600,21600e" filled="f">
+                <v:path arrowok="t" fillok="f" o:connecttype="none"/>
+                <o:lock v:ext="edit" shapetype="t"/>
+              </v:shapetype>
+              <v:shape id="Straight Arrow Connector 65" o:spid="_x0000_s1026" type="#_x0000_t32" style="position:absolute;margin-left:288.65pt;margin-top:282.55pt;width:.55pt;height:146.4pt;flip:y;z-index:251746816;visibility:visible;mso-wrap-style:square;mso-wrap-distance-left:9pt;mso-wrap-distance-top:0;mso-wrap-distance-right:9pt;mso-wrap-distance-bottom:0;mso-position-horizontal:absolute;mso-position-horizontal-relative:text;mso-position-vertical:absolute;mso-position-vertical-relative:text" o:gfxdata="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" strokecolor="black [3040]" strokeweight="1pt">
+                <v:stroke startarrow="block"/>
+              </v:shape>
+            </w:pict>
+          </mc:Fallback>
+        </mc:AlternateContent>
+      </w:r>
+      <w:r>
+        <w:rPr>
+          <w:noProof/>
+        </w:rPr>
+        <mc:AlternateContent>
+          <mc:Choice Requires="wps">
+            <w:drawing>
+              <wp:anchor distT="0" distB="0" distL="114300" distR="114300" simplePos="0" relativeHeight="251615744" behindDoc="0" locked="0" layoutInCell="0" allowOverlap="1" wp14:anchorId="04DDC7ED" wp14:editId="3F52012E">
                 <wp:simplePos x="0" y="0"/>
                 <wp:positionH relativeFrom="page">
-                  <wp:posOffset>1621762</wp:posOffset>
+                  <wp:posOffset>4314778</wp:posOffset>
                 </wp:positionH>
                 <wp:positionV relativeFrom="page">
-                  <wp:posOffset>5188585</wp:posOffset>
+                  <wp:posOffset>4492767</wp:posOffset>
                 </wp:positionV>
-                <wp:extent cx="2082800" cy="292100"/>
+                <wp:extent cx="0" cy="1854200"/>
+                <wp:effectExtent l="76200" t="0" r="76200" b="50800"/>
+                <wp:wrapNone/>
+                <wp:docPr id="42" name="Straight Connector 42"/>
+                <wp:cNvGraphicFramePr/>
+                <a:graphic xmlns:a="http://schemas.openxmlformats.org/drawingml/2006/main">
+                  <a:graphicData uri="http://schemas.microsoft.com/office/word/2010/wordprocessingShape">
+                    <wps:wsp>
+                      <wps:cNvCnPr/>
+                      <wps:spPr>
+                        <a:xfrm>
+                          <a:off x="0" y="0"/>
+                          <a:ext cx="0" cy="1854200"/>
+                        </a:xfrm>
+                        <a:prstGeom prst="line">
+                          <a:avLst/>
+                        </a:prstGeom>
+                        <a:ln w="10795">
+                          <a:solidFill>
+                            <a:srgbClr val="000000"/>
+                          </a:solidFill>
+                          <a:headEnd type="none"/>
+                          <a:tailEnd type="triangle"/>
+                        </a:ln>
+                      </wps:spPr>
+                      <wps:style>
+                        <a:lnRef idx="1">
+                          <a:schemeClr val="accent1"/>
+                        </a:lnRef>
+                        <a:fillRef idx="0">
+                          <a:schemeClr val="accent1"/>
+                        </a:fillRef>
+                        <a:effectRef idx="0">
+                          <a:schemeClr val="accent1"/>
+                        </a:effectRef>
+                        <a:fontRef idx="minor">
+                          <a:schemeClr val="tx1"/>
+                        </a:fontRef>
+                      </wps:style>
+                      <wps:bodyPr/>
+                    </wps:wsp>
+                  </a:graphicData>
+                </a:graphic>
+              </wp:anchor>
+            </w:drawing>
+          </mc:Choice>
+          <mc:Fallback>
+            <w:pict>
+              <v:line w14:anchorId="339569EB" id="Straight Connector 42" o:spid="_x0000_s1026" style="position:absolute;z-index:251615744;visibility:visible;mso-wrap-style:square;mso-wrap-distance-left:9pt;mso-wrap-distance-top:0;mso-wrap-distance-right:9pt;mso-wrap-distance-bottom:0;mso-position-horizontal:absolute;mso-position-horizontal-relative:page;mso-position-vertical:absolute;mso-position-vertical-relative:page" from="339.75pt,353.75pt" to="339.75pt,499.75pt" o:gfxdata="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" o:allowincell="f" strokeweight=".85pt">
+                <v:stroke endarrow="block"/>
+                <w10:wrap anchorx="page" anchory="page"/>
+              </v:line>
+            </w:pict>
+          </mc:Fallback>
+        </mc:AlternateContent>
+      </w:r>
+      <w:r>
+        <w:rPr>
+          <w:noProof/>
+        </w:rPr>
+        <mc:AlternateContent>
+          <mc:Choice Requires="wps">
+            <w:drawing>
+              <wp:anchor distT="0" distB="0" distL="114300" distR="114300" simplePos="0" relativeHeight="251740672" behindDoc="0" locked="0" layoutInCell="1" allowOverlap="1" wp14:anchorId="16EB5F01" wp14:editId="1E0B68B6">
+                <wp:simplePos x="0" y="0"/>
+                <wp:positionH relativeFrom="column">
+                  <wp:posOffset>3091218</wp:posOffset>
+                </wp:positionH>
+                <wp:positionV relativeFrom="paragraph">
+                  <wp:posOffset>3579504</wp:posOffset>
+                </wp:positionV>
+                <wp:extent cx="6824" cy="1859129"/>
+                <wp:effectExtent l="76200" t="38100" r="69850" b="27305"/>
+                <wp:wrapNone/>
+                <wp:docPr id="27" name="Straight Arrow Connector 27"/>
+                <wp:cNvGraphicFramePr/>
+                <a:graphic xmlns:a="http://schemas.openxmlformats.org/drawingml/2006/main">
+                  <a:graphicData uri="http://schemas.microsoft.com/office/word/2010/wordprocessingShape">
+                    <wps:wsp>
+                      <wps:cNvCnPr/>
+                      <wps:spPr>
+                        <a:xfrm flipV="1">
+                          <a:off x="0" y="0"/>
+                          <a:ext cx="6824" cy="1859129"/>
+                        </a:xfrm>
+                        <a:prstGeom prst="straightConnector1">
+                          <a:avLst/>
+                        </a:prstGeom>
+                        <a:ln w="12700">
+                          <a:tailEnd type="triangle"/>
+                        </a:ln>
+                      </wps:spPr>
+                      <wps:style>
+                        <a:lnRef idx="1">
+                          <a:schemeClr val="dk1"/>
+                        </a:lnRef>
+                        <a:fillRef idx="0">
+                          <a:schemeClr val="dk1"/>
+                        </a:fillRef>
+                        <a:effectRef idx="0">
+                          <a:schemeClr val="dk1"/>
+                        </a:effectRef>
+                        <a:fontRef idx="minor">
+                          <a:schemeClr val="tx1"/>
+                        </a:fontRef>
+                      </wps:style>
+                      <wps:bodyPr/>
+                    </wps:wsp>
+                  </a:graphicData>
+                </a:graphic>
+              </wp:anchor>
+            </w:drawing>
+          </mc:Choice>
+          <mc:Fallback>
+            <w:pict>
+              <v:shape w14:anchorId="6195DF3A" id="Straight Arrow Connector 27" o:spid="_x0000_s1026" type="#_x0000_t32" style="position:absolute;margin-left:243.4pt;margin-top:281.85pt;width:.55pt;height:146.4pt;flip:y;z-index:251740672;visibility:visible;mso-wrap-style:square;mso-wrap-distance-left:9pt;mso-wrap-distance-top:0;mso-wrap-distance-right:9pt;mso-wrap-distance-bottom:0;mso-position-horizontal:absolute;mso-position-horizontal-relative:text;mso-position-vertical:absolute;mso-position-vertical-relative:text" o:gfxdata="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" strokecolor="black [3040]" strokeweight="1pt">
+                <v:stroke endarrow="block"/>
+              </v:shape>
+            </w:pict>
+          </mc:Fallback>
+        </mc:AlternateContent>
+      </w:r>
+      <w:r>
+        <w:rPr>
+          <w:noProof/>
+        </w:rPr>
+        <mc:AlternateContent>
+          <mc:Choice Requires="wps">
+            <w:drawing>
+              <wp:anchor distT="0" distB="0" distL="114300" distR="114300" simplePos="0" relativeHeight="251666944" behindDoc="0" locked="0" layoutInCell="0" allowOverlap="1" wp14:anchorId="04ACFA10" wp14:editId="6ECA6D54">
+                <wp:simplePos x="0" y="0"/>
+                <wp:positionH relativeFrom="page">
+                  <wp:posOffset>4364576</wp:posOffset>
+                </wp:positionH>
+                <wp:positionV relativeFrom="page">
+                  <wp:posOffset>2738590</wp:posOffset>
+                </wp:positionV>
+                <wp:extent cx="1168400" cy="271306"/>
                 <wp:effectExtent l="0" t="0" r="0" b="0"/>
                 <wp:wrapNone/>
-                <wp:docPr id="58" name="Text Box 58"/>
+                <wp:docPr id="54" name="Text Box 54"/>
                 <wp:cNvGraphicFramePr/>
                 <a:graphic xmlns:a="http://schemas.openxmlformats.org/drawingml/2006/main">
                   <a:graphicData uri="http://schemas.microsoft.com/office/word/2010/wordprocessingShape">
@@ -291,7 +462,7 @@
                       <wps:spPr>
                         <a:xfrm>
                           <a:off x="0" y="0"/>
-                          <a:ext cx="2082800" cy="292100"/>
+                          <a:ext cx="1168400" cy="271306"/>
                         </a:xfrm>
                         <a:prstGeom prst="rect">
                           <a:avLst/>
@@ -326,24 +497,7 @@
                                 <w:color w:val="000000"/>
                                 <w:sz w:val="13"/>
                               </w:rPr>
-                              <w:t>Manage Rules, Maps, DSS, Sources,</w:t>
-                            </w:r>
-                          </w:p>
-                          <w:p>
-                            <w:pPr>
-                              <w:spacing w:after="0"/>
-                              <w:jc w:val="center"/>
-                              <w:rPr>
-                                <w:color w:val="000000"/>
-                                <w:sz w:val="13"/>
-                              </w:rPr>
-                            </w:pPr>
-                            <w:r>
-                              <w:rPr>
-                                <w:color w:val="000000"/>
-                                <w:sz w:val="13"/>
-                              </w:rPr>
-                              <w:t>Centers, and Users</w:t>
+                              <w:t>Rainfall references</w:t>
                             </w:r>
                           </w:p>
                         </w:txbxContent>
@@ -357,12 +511,15 @@
                     </wps:wsp>
                   </a:graphicData>
                 </a:graphic>
+                <wp14:sizeRelV relativeFrom="margin">
+                  <wp14:pctHeight>0</wp14:pctHeight>
+                </wp14:sizeRelV>
               </wp:anchor>
             </w:drawing>
           </mc:Choice>
           <mc:Fallback>
             <w:pict>
-              <v:shape w14:anchorId="47B445D4" id="Text Box 58" o:spid="_x0000_s1028" type="#_x0000_t202" style="position:absolute;margin-left:127.7pt;margin-top:408.55pt;width:164pt;height:23pt;z-index:251987456;visibility:visible;mso-wrap-style:square;mso-wrap-distance-left:9pt;mso-wrap-distance-top:0;mso-wrap-distance-right:9pt;mso-wrap-distance-bottom:0;mso-position-horizontal:absolute;mso-position-horizontal-relative:page;mso-position-vertical:absolute;mso-position-vertical-relative:page;v-text-anchor:middle" o:gfxdata="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" o:allowincell="f" filled="f" stroked="f" strokeweight=".5pt">
+              <v:shape w14:anchorId="04ACFA10" id="Text Box 54" o:spid="_x0000_s1028" type="#_x0000_t202" style="position:absolute;margin-left:343.65pt;margin-top:215.65pt;width:92pt;height:21.35pt;z-index:251666944;visibility:visible;mso-wrap-style:square;mso-height-percent:0;mso-wrap-distance-left:9pt;mso-wrap-distance-top:0;mso-wrap-distance-right:9pt;mso-wrap-distance-bottom:0;mso-position-horizontal:absolute;mso-position-horizontal-relative:page;mso-position-vertical:absolute;mso-position-vertical-relative:page;mso-height-percent:0;mso-height-relative:margin;v-text-anchor:middle" o:gfxdata="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" o:allowincell="f" filled="f" stroked="f" strokeweight=".5pt">
                 <v:textbox inset="2pt,1pt,2pt,1pt">
                   <w:txbxContent>
                     <w:p>
@@ -379,24 +536,7 @@
                           <w:color w:val="000000"/>
                           <w:sz w:val="13"/>
                         </w:rPr>
-                        <w:t>Manage Rules, Maps, DSS, Sources,</w:t>
-                      </w:r>
-                    </w:p>
-                    <w:p>
-                      <w:pPr>
-                        <w:spacing w:after="0"/>
-                        <w:jc w:val="center"/>
-                        <w:rPr>
-                          <w:color w:val="000000"/>
-                          <w:sz w:val="13"/>
-                        </w:rPr>
-                      </w:pPr>
-                      <w:r>
-                        <w:rPr>
-                          <w:color w:val="000000"/>
-                          <w:sz w:val="13"/>
-                        </w:rPr>
-                        <w:t>Centers, and Users</w:t>
+                        <w:t>Rainfall references</w:t>
                       </w:r>
                     </w:p>
                   </w:txbxContent>
@@ -414,18 +554,18 @@
         <mc:AlternateContent>
           <mc:Choice Requires="wps">
             <w:drawing>
-              <wp:anchor distT="0" distB="0" distL="114300" distR="114300" simplePos="0" relativeHeight="252026368" behindDoc="0" locked="0" layoutInCell="0" allowOverlap="1" wp14:anchorId="1AE8435C" wp14:editId="5BDBE962">
+              <wp:anchor distT="0" distB="0" distL="114300" distR="114300" simplePos="0" relativeHeight="251673088" behindDoc="0" locked="0" layoutInCell="0" allowOverlap="1" wp14:anchorId="5B395E49" wp14:editId="18FF8E24">
                 <wp:simplePos x="0" y="0"/>
                 <wp:positionH relativeFrom="page">
-                  <wp:posOffset>1543657</wp:posOffset>
+                  <wp:posOffset>4749358</wp:posOffset>
                 </wp:positionH>
                 <wp:positionV relativeFrom="page">
-                  <wp:posOffset>5927698</wp:posOffset>
+                  <wp:posOffset>3095597</wp:posOffset>
                 </wp:positionV>
-                <wp:extent cx="1803400" cy="228600"/>
-                <wp:effectExtent l="0" t="0" r="6350" b="0"/>
+                <wp:extent cx="1473200" cy="152400"/>
+                <wp:effectExtent l="0" t="0" r="0" b="0"/>
                 <wp:wrapNone/>
-                <wp:docPr id="59" name="Text Box 59"/>
+                <wp:docPr id="55" name="Text Box 55"/>
                 <wp:cNvGraphicFramePr/>
                 <a:graphic xmlns:a="http://schemas.openxmlformats.org/drawingml/2006/main">
                   <a:graphicData uri="http://schemas.microsoft.com/office/word/2010/wordprocessingShape">
@@ -434,7 +574,7 @@
                       <wps:spPr>
                         <a:xfrm>
                           <a:off x="0" y="0"/>
-                          <a:ext cx="1803400" cy="228600"/>
+                          <a:ext cx="1473200" cy="152400"/>
                         </a:xfrm>
                         <a:prstGeom prst="rect">
                           <a:avLst/>
@@ -469,7 +609,7 @@
                                 <w:color w:val="000000"/>
                                 <w:sz w:val="13"/>
                               </w:rPr>
-                              <w:t>Review / Approve / Publish / Roll Back</w:t>
+                              <w:t>Expert review input</w:t>
                             </w:r>
                           </w:p>
                         </w:txbxContent>
@@ -488,7 +628,7 @@
           </mc:Choice>
           <mc:Fallback>
             <w:pict>
-              <v:shape w14:anchorId="1AE8435C" id="Text Box 59" o:spid="_x0000_s1029" type="#_x0000_t202" style="position:absolute;margin-left:121.55pt;margin-top:466.75pt;width:142pt;height:18pt;z-index:252026368;visibility:visible;mso-wrap-style:square;mso-wrap-distance-left:9pt;mso-wrap-distance-top:0;mso-wrap-distance-right:9pt;mso-wrap-distance-bottom:0;mso-position-horizontal:absolute;mso-position-horizontal-relative:page;mso-position-vertical:absolute;mso-position-vertical-relative:page;v-text-anchor:middle" o:gfxdata="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" o:allowincell="f" filled="f" stroked="f" strokeweight=".5pt">
+              <v:shape w14:anchorId="5B395E49" id="Text Box 55" o:spid="_x0000_s1029" type="#_x0000_t202" style="position:absolute;margin-left:373.95pt;margin-top:243.75pt;width:116pt;height:12pt;z-index:251673088;visibility:visible;mso-wrap-style:square;mso-wrap-distance-left:9pt;mso-wrap-distance-top:0;mso-wrap-distance-right:9pt;mso-wrap-distance-bottom:0;mso-position-horizontal:absolute;mso-position-horizontal-relative:page;mso-position-vertical:absolute;mso-position-vertical-relative:page;v-text-anchor:middle" o:gfxdata="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" o:allowincell="f" filled="f" stroked="f" strokeweight=".5pt">
                 <v:textbox inset="2pt,1pt,2pt,1pt">
                   <w:txbxContent>
                     <w:p>
@@ -505,7 +645,7 @@
                           <w:color w:val="000000"/>
                           <w:sz w:val="13"/>
                         </w:rPr>
-                        <w:t>Review / Approve / Publish / Roll Back</w:t>
+                        <w:t>Expert review input</w:t>
                       </w:r>
                     </w:p>
                   </w:txbxContent>
@@ -523,7 +663,293 @@
         <mc:AlternateContent>
           <mc:Choice Requires="wps">
             <w:drawing>
-              <wp:anchor distT="0" distB="0" distL="114300" distR="114300" simplePos="0" relativeHeight="251948544" behindDoc="0" locked="0" layoutInCell="0" allowOverlap="1" wp14:anchorId="4E0BF446" wp14:editId="5A8DD929">
+              <wp:anchor distT="0" distB="0" distL="114300" distR="114300" simplePos="0" relativeHeight="251687424" behindDoc="0" locked="0" layoutInCell="0" allowOverlap="1" wp14:anchorId="47B445D4" wp14:editId="17BE3268">
+                <wp:simplePos x="0" y="0"/>
+                <wp:positionH relativeFrom="page">
+                  <wp:posOffset>1621762</wp:posOffset>
+                </wp:positionH>
+                <wp:positionV relativeFrom="page">
+                  <wp:posOffset>5188585</wp:posOffset>
+                </wp:positionV>
+                <wp:extent cx="2082800" cy="292100"/>
+                <wp:effectExtent l="0" t="0" r="0" b="0"/>
+                <wp:wrapNone/>
+                <wp:docPr id="58" name="Text Box 58"/>
+                <wp:cNvGraphicFramePr/>
+                <a:graphic xmlns:a="http://schemas.openxmlformats.org/drawingml/2006/main">
+                  <a:graphicData uri="http://schemas.microsoft.com/office/word/2010/wordprocessingShape">
+                    <wps:wsp>
+                      <wps:cNvSpPr txBox="1"/>
+                      <wps:spPr>
+                        <a:xfrm>
+                          <a:off x="0" y="0"/>
+                          <a:ext cx="2082800" cy="292100"/>
+                        </a:xfrm>
+                        <a:prstGeom prst="rect">
+                          <a:avLst/>
+                        </a:prstGeom>
+                        <a:noFill/>
+                        <a:ln w="6350">
+                          <a:noFill/>
+                        </a:ln>
+                        <a:extLst>
+                          <a:ext uri="{91240B29-F687-4F45-9708-019B960494DF}">
+                            <a14:hiddenLine xmlns:a14="http://schemas.microsoft.com/office/drawing/2010/main" w="6350">
+                              <a:solidFill>
+                                <a:prstClr val="black"/>
+                              </a:solidFill>
+                            </a14:hiddenLine>
+                          </a:ext>
+                        </a:extLst>
+                      </wps:spPr>
+                      <wps:txbx>
+                        <w:txbxContent>
+                          <w:p>
+                            <w:pPr>
+                              <w:spacing w:after="0"/>
+                              <w:jc w:val="center"/>
+                              <w:rPr>
+                                <w:color w:val="000000"/>
+                                <w:sz w:val="13"/>
+                              </w:rPr>
+                            </w:pPr>
+                            <w:r>
+                              <w:rPr>
+                                <w:color w:val="000000"/>
+                                <w:sz w:val="13"/>
+                              </w:rPr>
+                              <w:t>Review sources, maps,</w:t>
+                            </w:r>
+                          </w:p>
+                          <w:p>
+                            <w:pPr>
+                              <w:spacing w:after="0"/>
+                              <w:jc w:val="center"/>
+                              <w:rPr>
+                                <w:color w:val="000000"/>
+                                <w:sz w:val="13"/>
+                              </w:rPr>
+                            </w:pPr>
+                            <w:r>
+                              <w:rPr>
+                                <w:color w:val="000000"/>
+                                <w:sz w:val="13"/>
+                              </w:rPr>
+                              <w:t>DSS, and centers</w:t>
+                            </w:r>
+                          </w:p>
+                        </w:txbxContent>
+                      </wps:txbx>
+                      <wps:bodyPr rot="0" spcFirstLastPara="0" vertOverflow="overflow" horzOverflow="overflow" vert="horz" wrap="square" lIns="25400" tIns="12700" rIns="25400" bIns="12700" numCol="1" spcCol="0" rtlCol="0" fromWordArt="0" anchor="ctr" anchorCtr="0" forceAA="0" compatLnSpc="1">
+                        <a:prstTxWarp prst="textNoShape">
+                          <a:avLst/>
+                        </a:prstTxWarp>
+                        <a:noAutofit/>
+                      </wps:bodyPr>
+                    </wps:wsp>
+                  </a:graphicData>
+                </a:graphic>
+              </wp:anchor>
+            </w:drawing>
+          </mc:Choice>
+          <mc:Fallback>
+            <w:pict>
+              <v:shape w14:anchorId="47B445D4" id="Text Box 58" o:spid="_x0000_s1030" type="#_x0000_t202" style="position:absolute;margin-left:127.7pt;margin-top:408.55pt;width:164pt;height:23pt;z-index:251687424;visibility:visible;mso-wrap-style:square;mso-wrap-distance-left:9pt;mso-wrap-distance-top:0;mso-wrap-distance-right:9pt;mso-wrap-distance-bottom:0;mso-position-horizontal:absolute;mso-position-horizontal-relative:page;mso-position-vertical:absolute;mso-position-vertical-relative:page;v-text-anchor:middle" o:gfxdata="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" o:allowincell="f" filled="f" stroked="f" strokeweight=".5pt">
+                <v:textbox inset="2pt,1pt,2pt,1pt">
+                  <w:txbxContent>
+                    <w:p>
+                      <w:pPr>
+                        <w:spacing w:after="0"/>
+                        <w:jc w:val="center"/>
+                        <w:rPr>
+                          <w:color w:val="000000"/>
+                          <w:sz w:val="13"/>
+                        </w:rPr>
+                      </w:pPr>
+                      <w:r>
+                        <w:rPr>
+                          <w:color w:val="000000"/>
+                          <w:sz w:val="13"/>
+                        </w:rPr>
+                        <w:t>Review sources, maps,</w:t>
+                      </w:r>
+                    </w:p>
+                    <w:p>
+                      <w:pPr>
+                        <w:spacing w:after="0"/>
+                        <w:jc w:val="center"/>
+                        <w:rPr>
+                          <w:color w:val="000000"/>
+                          <w:sz w:val="13"/>
+                        </w:rPr>
+                      </w:pPr>
+                      <w:r>
+                        <w:rPr>
+                          <w:color w:val="000000"/>
+                          <w:sz w:val="13"/>
+                        </w:rPr>
+                        <w:t>DSS, and centers</w:t>
+                      </w:r>
+                    </w:p>
+                  </w:txbxContent>
+                </v:textbox>
+                <w10:wrap anchorx="page" anchory="page"/>
+              </v:shape>
+            </w:pict>
+          </mc:Fallback>
+        </mc:AlternateContent>
+      </w:r>
+      <w:r>
+        <w:rPr>
+          <w:noProof/>
+        </w:rPr>
+        <mc:AlternateContent>
+          <mc:Choice Requires="wps">
+            <w:drawing>
+              <wp:anchor distT="0" distB="0" distL="114300" distR="114300" simplePos="0" relativeHeight="251693568" behindDoc="0" locked="0" layoutInCell="0" allowOverlap="1" wp14:anchorId="1AE8435C" wp14:editId="5BDBE962">
+                <wp:simplePos x="0" y="0"/>
+                <wp:positionH relativeFrom="page">
+                  <wp:posOffset>1543657</wp:posOffset>
+                </wp:positionH>
+                <wp:positionV relativeFrom="page">
+                  <wp:posOffset>5927698</wp:posOffset>
+                </wp:positionV>
+                <wp:extent cx="1803400" cy="228600"/>
+                <wp:effectExtent l="0" t="0" r="6350" b="0"/>
+                <wp:wrapNone/>
+                <wp:docPr id="59" name="Text Box 59"/>
+                <wp:cNvGraphicFramePr/>
+                <a:graphic xmlns:a="http://schemas.openxmlformats.org/drawingml/2006/main">
+                  <a:graphicData uri="http://schemas.microsoft.com/office/word/2010/wordprocessingShape">
+                    <wps:wsp>
+                      <wps:cNvSpPr txBox="1"/>
+                      <wps:spPr>
+                        <a:xfrm>
+                          <a:off x="0" y="0"/>
+                          <a:ext cx="1803400" cy="228600"/>
+                        </a:xfrm>
+                        <a:prstGeom prst="rect">
+                          <a:avLst/>
+                        </a:prstGeom>
+                        <a:noFill/>
+                        <a:ln w="6350">
+                          <a:noFill/>
+                        </a:ln>
+                        <a:extLst>
+                          <a:ext uri="{91240B29-F687-4F45-9708-019B960494DF}">
+                            <a14:hiddenLine xmlns:a14="http://schemas.microsoft.com/office/drawing/2010/main" w="6350">
+                              <a:solidFill>
+                                <a:prstClr val="black"/>
+                              </a:solidFill>
+                            </a14:hiddenLine>
+                          </a:ext>
+                        </a:extLst>
+                      </wps:spPr>
+                      <wps:txbx>
+                        <w:txbxContent>
+                          <w:p>
+                            <w:pPr>
+                              <w:spacing w:after="0"/>
+                              <w:jc w:val="center"/>
+                              <w:rPr>
+                                <w:color w:val="000000"/>
+                                <w:sz w:val="13"/>
+                              </w:rPr>
+                            </w:pPr>
+                            <w:r>
+                              <w:rPr>
+                                <w:color w:val="000000"/>
+                                <w:sz w:val="13"/>
+                              </w:rPr>
+                              <w:t>Review / publish</w:t>
+                            </w:r>
+                          </w:p>
+                          <w:p>
+                            <w:pPr>
+                              <w:spacing w:after="0"/>
+                              <w:jc w:val="center"/>
+                              <w:rPr>
+                                <w:color w:val="000000"/>
+                                <w:sz w:val="13"/>
+                              </w:rPr>
+                            </w:pPr>
+                            <w:r>
+                              <w:rPr>
+                                <w:color w:val="000000"/>
+                                <w:sz w:val="13"/>
+                              </w:rPr>
+                              <w:t>eligible content</w:t>
+                            </w:r>
+                          </w:p>
+                        </w:txbxContent>
+                      </wps:txbx>
+                      <wps:bodyPr rot="0" spcFirstLastPara="0" vertOverflow="overflow" horzOverflow="overflow" vert="horz" wrap="square" lIns="25400" tIns="12700" rIns="25400" bIns="12700" numCol="1" spcCol="0" rtlCol="0" fromWordArt="0" anchor="ctr" anchorCtr="0" forceAA="0" compatLnSpc="1">
+                        <a:prstTxWarp prst="textNoShape">
+                          <a:avLst/>
+                        </a:prstTxWarp>
+                        <a:noAutofit/>
+                      </wps:bodyPr>
+                    </wps:wsp>
+                  </a:graphicData>
+                </a:graphic>
+              </wp:anchor>
+            </w:drawing>
+          </mc:Choice>
+          <mc:Fallback>
+            <w:pict>
+              <v:shape w14:anchorId="1AE8435C" id="Text Box 59" o:spid="_x0000_s1031" type="#_x0000_t202" style="position:absolute;margin-left:121.55pt;margin-top:466.75pt;width:142pt;height:18pt;z-index:251693568;visibility:visible;mso-wrap-style:square;mso-wrap-distance-left:9pt;mso-wrap-distance-top:0;mso-wrap-distance-right:9pt;mso-wrap-distance-bottom:0;mso-position-horizontal:absolute;mso-position-horizontal-relative:page;mso-position-vertical:absolute;mso-position-vertical-relative:page;v-text-anchor:middle" o:gfxdata="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" o:allowincell="f" filled="f" stroked="f" strokeweight=".5pt">
+                <v:textbox inset="2pt,1pt,2pt,1pt">
+                  <w:txbxContent>
+                    <w:p>
+                      <w:pPr>
+                        <w:spacing w:after="0"/>
+                        <w:jc w:val="center"/>
+                        <w:rPr>
+                          <w:color w:val="000000"/>
+                          <w:sz w:val="13"/>
+                        </w:rPr>
+                      </w:pPr>
+                      <w:r>
+                        <w:rPr>
+                          <w:color w:val="000000"/>
+                          <w:sz w:val="13"/>
+                        </w:rPr>
+                        <w:t>Review / publish</w:t>
+                      </w:r>
+                    </w:p>
+                    <w:p>
+                      <w:pPr>
+                        <w:spacing w:after="0"/>
+                        <w:jc w:val="center"/>
+                        <w:rPr>
+                          <w:color w:val="000000"/>
+                          <w:sz w:val="13"/>
+                        </w:rPr>
+                      </w:pPr>
+                      <w:r>
+                        <w:rPr>
+                          <w:color w:val="000000"/>
+                          <w:sz w:val="13"/>
+                        </w:rPr>
+                        <w:t>eligible content</w:t>
+                      </w:r>
+                    </w:p>
+                  </w:txbxContent>
+                </v:textbox>
+                <w10:wrap anchorx="page" anchory="page"/>
+              </v:shape>
+            </w:pict>
+          </mc:Fallback>
+        </mc:AlternateContent>
+      </w:r>
+      <w:r>
+        <w:rPr>
+          <w:noProof/>
+        </w:rPr>
+        <mc:AlternateContent>
+          <mc:Choice Requires="wps">
+            <w:drawing>
+              <wp:anchor distT="0" distB="0" distL="114300" distR="114300" simplePos="0" relativeHeight="251681280" behindDoc="0" locked="0" layoutInCell="0" allowOverlap="1" wp14:anchorId="4E0BF446" wp14:editId="5A8DD929">
                 <wp:simplePos x="0" y="0"/>
                 <wp:positionH relativeFrom="page">
                   <wp:posOffset>2011238</wp:posOffset>
@@ -597,7 +1023,7 @@
           </mc:Choice>
           <mc:Fallback>
             <w:pict>
-              <v:shape w14:anchorId="4E0BF446" id="Text Box 57" o:spid="_x0000_s1030" type="#_x0000_t202" style="position:absolute;margin-left:158.35pt;margin-top:378.85pt;width:145pt;height:12pt;z-index:251948544;visibility:visible;mso-wrap-style:square;mso-wrap-distance-left:9pt;mso-wrap-distance-top:0;mso-wrap-distance-right:9pt;mso-wrap-distance-bottom:0;mso-position-horizontal:absolute;mso-position-horizontal-relative:page;mso-position-vertical:absolute;mso-position-vertical-relative:page;v-text-anchor:middle" o:gfxdata="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" o:allowincell="f" filled="f" stroked="f" strokeweight=".5pt">
+              <v:shape w14:anchorId="4E0BF446" id="Text Box 57" o:spid="_x0000_s1032" type="#_x0000_t202" style="position:absolute;margin-left:158.35pt;margin-top:378.85pt;width:145pt;height:12pt;z-index:251681280;visibility:visible;mso-wrap-style:square;mso-wrap-distance-left:9pt;mso-wrap-distance-top:0;mso-wrap-distance-right:9pt;mso-wrap-distance-bottom:0;mso-position-horizontal:absolute;mso-position-horizontal-relative:page;mso-position-vertical:absolute;mso-position-vertical-relative:page;v-text-anchor:middle" o:gfxdata="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" o:allowincell="f" filled="f" stroked="f" strokeweight=".5pt">
                 <v:textbox inset="2pt,1pt,2pt,1pt">
                   <w:txbxContent>
                     <w:p>
@@ -632,7 +1058,7 @@
         <mc:AlternateContent>
           <mc:Choice Requires="wps">
             <w:drawing>
-              <wp:anchor distT="0" distB="0" distL="114300" distR="114300" simplePos="0" relativeHeight="251329024" behindDoc="0" locked="0" layoutInCell="0" allowOverlap="1" wp14:anchorId="27302A30" wp14:editId="2EE22649">
+              <wp:anchor distT="0" distB="0" distL="114300" distR="114300" simplePos="0" relativeHeight="251598336" behindDoc="0" locked="0" layoutInCell="0" allowOverlap="1" wp14:anchorId="27302A30" wp14:editId="2EE22649">
                 <wp:simplePos x="0" y="0"/>
                 <wp:positionH relativeFrom="page">
                   <wp:posOffset>4727574</wp:posOffset>
@@ -694,7 +1120,7 @@
           </mc:Choice>
           <mc:Fallback>
             <w:pict>
-              <v:line w14:anchorId="7F52D311" id="Straight Connector 26" o:spid="_x0000_s1026" style="position:absolute;flip:x;z-index:251329024;visibility:visible;mso-wrap-style:square;mso-width-percent:0;mso-height-percent:0;mso-wrap-distance-left:9pt;mso-wrap-distance-top:0;mso-wrap-distance-right:9pt;mso-wrap-distance-bottom:0;mso-position-horizontal:absolute;mso-position-horizontal-relative:page;mso-position-vertical:absolute;mso-position-vertical-relative:page;mso-width-percent:0;mso-height-percent:0;mso-width-relative:margin;mso-height-relative:margin" from="372.25pt,236pt" to="438pt,236pt" o:gfxdata="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" o:allowincell="f" strokeweight=".85pt">
+              <v:line w14:anchorId="4B0AC424" id="Straight Connector 26" o:spid="_x0000_s1026" style="position:absolute;flip:x;z-index:251598336;visibility:visible;mso-wrap-style:square;mso-width-percent:0;mso-height-percent:0;mso-wrap-distance-left:9pt;mso-wrap-distance-top:0;mso-wrap-distance-right:9pt;mso-wrap-distance-bottom:0;mso-position-horizontal:absolute;mso-position-horizontal-relative:page;mso-position-vertical:absolute;mso-position-vertical-relative:page;mso-width-percent:0;mso-height-percent:0;mso-width-relative:margin;mso-height-relative:margin" from="372.25pt,236pt" to="438pt,236pt" o:gfxdata="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" o:allowincell="f" strokeweight=".85pt">
                 <w10:wrap anchorx="page" anchory="page"/>
               </v:line>
             </w:pict>
@@ -708,7 +1134,7 @@
         <mc:AlternateContent>
           <mc:Choice Requires="wps">
             <w:drawing>
-              <wp:anchor distT="0" distB="0" distL="114300" distR="114300" simplePos="0" relativeHeight="251368960" behindDoc="0" locked="0" layoutInCell="0" allowOverlap="1" wp14:anchorId="3752A51A" wp14:editId="048AECC2">
+              <wp:anchor distT="0" distB="0" distL="114300" distR="114300" simplePos="0" relativeHeight="251604480" behindDoc="0" locked="0" layoutInCell="0" allowOverlap="1" wp14:anchorId="3752A51A" wp14:editId="048AECC2">
                 <wp:simplePos x="0" y="0"/>
                 <wp:positionH relativeFrom="page">
                   <wp:posOffset>4730750</wp:posOffset>
@@ -770,7 +1196,7 @@
           </mc:Choice>
           <mc:Fallback>
             <w:pict>
-              <v:line w14:anchorId="48D659F9" id="Straight Connector 28" o:spid="_x0000_s1026" style="position:absolute;flip:x;z-index:251368960;visibility:visible;mso-wrap-style:square;mso-width-percent:0;mso-height-percent:0;mso-wrap-distance-left:9pt;mso-wrap-distance-top:0;mso-wrap-distance-right:9pt;mso-wrap-distance-bottom:0;mso-position-horizontal:absolute;mso-position-horizontal-relative:page;mso-position-vertical:absolute;mso-position-vertical-relative:page;mso-width-percent:0;mso-height-percent:0;mso-width-relative:margin;mso-height-relative:margin" from="372.5pt,236pt" to="372.5pt,286.25pt" o:gfxdata="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" o:allowincell="f" strokeweight=".85pt">
+              <v:line w14:anchorId="15511AB9" id="Straight Connector 28" o:spid="_x0000_s1026" style="position:absolute;flip:x;z-index:251604480;visibility:visible;mso-wrap-style:square;mso-width-percent:0;mso-height-percent:0;mso-wrap-distance-left:9pt;mso-wrap-distance-top:0;mso-wrap-distance-right:9pt;mso-wrap-distance-bottom:0;mso-position-horizontal:absolute;mso-position-horizontal-relative:page;mso-position-vertical:absolute;mso-position-vertical-relative:page;mso-width-percent:0;mso-height-percent:0;mso-width-relative:margin;mso-height-relative:margin" from="372.5pt,236pt" to="372.5pt,286.25pt" o:gfxdata="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" o:allowincell="f" strokeweight=".85pt">
                 <v:stroke endarrow="block"/>
                 <w10:wrap anchorx="page" anchory="page"/>
               </v:line>
@@ -785,7 +1211,7 @@
         <mc:AlternateContent>
           <mc:Choice Requires="wps">
             <w:drawing>
-              <wp:anchor distT="0" distB="0" distL="114300" distR="114300" simplePos="0" relativeHeight="251811328" behindDoc="0" locked="0" layoutInCell="0" allowOverlap="1" wp14:anchorId="7BE9485B" wp14:editId="7F54F32A">
+              <wp:anchor distT="0" distB="0" distL="114300" distR="114300" simplePos="0" relativeHeight="251660800" behindDoc="0" locked="0" layoutInCell="0" allowOverlap="1" wp14:anchorId="7BE9485B" wp14:editId="7F54F32A">
                 <wp:simplePos x="0" y="0"/>
                 <wp:positionH relativeFrom="page">
                   <wp:posOffset>4527550</wp:posOffset>
@@ -840,31 +1266,7 @@
                                 <w:color w:val="000000"/>
                                 <w:sz w:val="13"/>
                               </w:rPr>
-                              <w:t>Approved Flood</w:t>
-                            </w:r>
-                          </w:p>
-                          <w:p>
-                            <w:pPr>
-                              <w:spacing w:after="0"/>
-                              <w:jc w:val="center"/>
-                              <w:rPr>
-                                <w:color w:val="000000"/>
-                                <w:sz w:val="13"/>
-                              </w:rPr>
-                            </w:pPr>
-                            <w:r>
-                              <w:rPr>
-                                <w:color w:val="000000"/>
-                                <w:sz w:val="13"/>
-                              </w:rPr>
-                              <w:t>/</w:t>
-                            </w:r>
-                            <w:r>
-                              <w:rPr>
-                                <w:color w:val="000000"/>
-                                <w:sz w:val="13"/>
-                              </w:rPr>
-                              <w:t>GIS Data</w:t>
+                              <w:t>Spatial references</w:t>
                             </w:r>
                           </w:p>
                         </w:txbxContent>
@@ -889,7 +1291,7 @@
           </mc:Choice>
           <mc:Fallback>
             <w:pict>
-              <v:shape w14:anchorId="7BE9485B" id="Text Box 53" o:spid="_x0000_s1031" type="#_x0000_t202" style="position:absolute;margin-left:356.5pt;margin-top:156pt;width:55.5pt;height:22pt;z-index:251811328;visibility:visible;mso-wrap-style:square;mso-width-percent:0;mso-height-percent:0;mso-wrap-distance-left:9pt;mso-wrap-distance-top:0;mso-wrap-distance-right:9pt;mso-wrap-distance-bottom:0;mso-position-horizontal:absolute;mso-position-horizontal-relative:page;mso-position-vertical:absolute;mso-position-vertical-relative:page;mso-width-percent:0;mso-height-percent:0;mso-width-relative:margin;mso-height-relative:margin;v-text-anchor:middle" o:gfxdata="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" o:allowincell="f" filled="f" stroked="f" strokeweight=".5pt">
+              <v:shape w14:anchorId="7BE9485B" id="Text Box 53" o:spid="_x0000_s1033" type="#_x0000_t202" style="position:absolute;margin-left:356.5pt;margin-top:156pt;width:55.5pt;height:22pt;z-index:251660800;visibility:visible;mso-wrap-style:square;mso-width-percent:0;mso-height-percent:0;mso-wrap-distance-left:9pt;mso-wrap-distance-top:0;mso-wrap-distance-right:9pt;mso-wrap-distance-bottom:0;mso-position-horizontal:absolute;mso-position-horizontal-relative:page;mso-position-vertical:absolute;mso-position-vertical-relative:page;mso-width-percent:0;mso-height-percent:0;mso-width-relative:margin;mso-height-relative:margin;v-text-anchor:middle" o:gfxdata="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" o:allowincell="f" filled="f" stroked="f" strokeweight=".5pt">
                 <v:textbox inset="2pt,1pt,2pt,1pt">
                   <w:txbxContent>
                     <w:p>
@@ -906,31 +1308,7 @@
                           <w:color w:val="000000"/>
                           <w:sz w:val="13"/>
                         </w:rPr>
-                        <w:t>Approved Flood</w:t>
-                      </w:r>
-                    </w:p>
-                    <w:p>
-                      <w:pPr>
-                        <w:spacing w:after="0"/>
-                        <w:jc w:val="center"/>
-                        <w:rPr>
-                          <w:color w:val="000000"/>
-                          <w:sz w:val="13"/>
-                        </w:rPr>
-                      </w:pPr>
-                      <w:r>
-                        <w:rPr>
-                          <w:color w:val="000000"/>
-                          <w:sz w:val="13"/>
-                        </w:rPr>
-                        <w:t>/</w:t>
-                      </w:r>
-                      <w:r>
-                        <w:rPr>
-                          <w:color w:val="000000"/>
-                          <w:sz w:val="13"/>
-                        </w:rPr>
-                        <w:t>GIS Data</w:t>
+                        <w:t>Spatial references</w:t>
                       </w:r>
                     </w:p>
                   </w:txbxContent>
@@ -948,7 +1326,7 @@
         <mc:AlternateContent>
           <mc:Choice Requires="wps">
             <w:drawing>
-              <wp:anchor distT="0" distB="0" distL="114300" distR="114300" simplePos="0" relativeHeight="251222528" behindDoc="0" locked="0" layoutInCell="0" allowOverlap="1" wp14:anchorId="2E2F4700" wp14:editId="74FB7939">
+              <wp:anchor distT="0" distB="0" distL="114300" distR="114300" simplePos="0" relativeHeight="251592192" behindDoc="0" locked="0" layoutInCell="0" allowOverlap="1" wp14:anchorId="2E2F4700" wp14:editId="74FB7939">
                 <wp:simplePos x="0" y="0"/>
                 <wp:positionH relativeFrom="page">
                   <wp:posOffset>4315767</wp:posOffset>
@@ -1007,7 +1385,7 @@
           </mc:Choice>
           <mc:Fallback>
             <w:pict>
-              <v:line w14:anchorId="01B09242" id="Straight Connector 15" o:spid="_x0000_s1026" style="position:absolute;z-index:251222528;visibility:visible;mso-wrap-style:square;mso-height-percent:0;mso-wrap-distance-left:9pt;mso-wrap-distance-top:0;mso-wrap-distance-right:9pt;mso-wrap-distance-bottom:0;mso-position-horizontal:absolute;mso-position-horizontal-relative:page;mso-position-vertical:absolute;mso-position-vertical-relative:page;mso-height-percent:0;mso-height-relative:margin" from="339.8pt,111.55pt" to="339.8pt,285.9pt" o:gfxdata="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" o:allowincell="f" strokeweight=".85pt">
+              <v:line w14:anchorId="0C6D63CD" id="Straight Connector 15" o:spid="_x0000_s1026" style="position:absolute;z-index:251592192;visibility:visible;mso-wrap-style:square;mso-height-percent:0;mso-wrap-distance-left:9pt;mso-wrap-distance-top:0;mso-wrap-distance-right:9pt;mso-wrap-distance-bottom:0;mso-position-horizontal:absolute;mso-position-horizontal-relative:page;mso-position-vertical:absolute;mso-position-vertical-relative:page;mso-height-percent:0;mso-height-relative:margin" from="339.8pt,111.55pt" to="339.8pt,285.9pt" o:gfxdata="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" o:allowincell="f" strokeweight=".85pt">
                 <v:stroke endarrow="block"/>
                 <w10:wrap anchorx="page" anchory="page"/>
               </v:line>
@@ -1022,7 +1400,7 @@
         <mc:AlternateContent>
           <mc:Choice Requires="wps">
             <w:drawing>
-              <wp:anchor distT="0" distB="0" distL="114300" distR="114300" simplePos="0" relativeHeight="251134464" behindDoc="0" locked="0" layoutInCell="0" allowOverlap="1" wp14:anchorId="598C95F7" wp14:editId="419A3A4C">
+              <wp:anchor distT="0" distB="0" distL="114300" distR="114300" simplePos="0" relativeHeight="251573760" behindDoc="0" locked="0" layoutInCell="0" allowOverlap="1" wp14:anchorId="598C95F7" wp14:editId="419A3A4C">
                 <wp:simplePos x="0" y="0"/>
                 <wp:positionH relativeFrom="page">
                   <wp:posOffset>1421841</wp:posOffset>
@@ -1081,7 +1459,7 @@
           </mc:Choice>
           <mc:Fallback>
             <w:pict>
-              <v:line w14:anchorId="171A8372" id="Straight Connector 8" o:spid="_x0000_s1026" style="position:absolute;z-index:251134464;visibility:visible;mso-wrap-style:square;mso-width-percent:0;mso-wrap-distance-left:9pt;mso-wrap-distance-top:0;mso-wrap-distance-right:9pt;mso-wrap-distance-bottom:0;mso-position-horizontal:absolute;mso-position-horizontal-relative:page;mso-position-vertical:absolute;mso-position-vertical-relative:page;mso-width-percent:0;mso-width-relative:margin" from="111.95pt,111.95pt" to="339.8pt,111.95pt" o:gfxdata="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" o:allowincell="f" strokeweight=".85pt">
+              <v:line w14:anchorId="5D35D497" id="Straight Connector 8" o:spid="_x0000_s1026" style="position:absolute;z-index:251573760;visibility:visible;mso-wrap-style:square;mso-width-percent:0;mso-wrap-distance-left:9pt;mso-wrap-distance-top:0;mso-wrap-distance-right:9pt;mso-wrap-distance-bottom:0;mso-position-horizontal:absolute;mso-position-horizontal-relative:page;mso-position-vertical:absolute;mso-position-vertical-relative:page;mso-width-percent:0;mso-width-relative:margin" from="111.95pt,111.95pt" to="339.8pt,111.95pt" o:gfxdata="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" o:allowincell="f" strokeweight=".85pt">
                 <w10:wrap anchorx="page" anchory="page"/>
               </v:line>
             </w:pict>
@@ -1095,7 +1473,7 @@
         <mc:AlternateContent>
           <mc:Choice Requires="wps">
             <w:drawing>
-              <wp:anchor distT="0" distB="0" distL="114300" distR="114300" simplePos="0" relativeHeight="251156992" behindDoc="0" locked="0" layoutInCell="0" allowOverlap="1" wp14:anchorId="7BC5786F" wp14:editId="238B69BA">
+              <wp:anchor distT="0" distB="0" distL="114300" distR="114300" simplePos="0" relativeHeight="251579904" behindDoc="0" locked="0" layoutInCell="0" allowOverlap="1" wp14:anchorId="7BC5786F" wp14:editId="238B69BA">
                 <wp:simplePos x="0" y="0"/>
                 <wp:positionH relativeFrom="page">
                   <wp:posOffset>3421052</wp:posOffset>
@@ -1157,7 +1535,7 @@
           </mc:Choice>
           <mc:Fallback>
             <w:pict>
-              <v:line w14:anchorId="2BAB88C8" id="Straight Connector 9" o:spid="_x0000_s1026" style="position:absolute;z-index:251156992;visibility:visible;mso-wrap-style:square;mso-width-percent:0;mso-height-percent:0;mso-wrap-distance-left:9pt;mso-wrap-distance-top:0;mso-wrap-distance-right:9pt;mso-wrap-distance-bottom:0;mso-position-horizontal:absolute;mso-position-horizontal-relative:page;mso-position-vertical:absolute;mso-position-vertical-relative:page;mso-width-percent:0;mso-height-percent:0;mso-width-relative:margin;mso-height-relative:margin" from="269.35pt,152.25pt" to="269.8pt,285.95pt" o:gfxdata="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" o:allowincell="f" strokeweight=".85pt">
+              <v:line w14:anchorId="7FF97709" id="Straight Connector 9" o:spid="_x0000_s1026" style="position:absolute;z-index:251579904;visibility:visible;mso-wrap-style:square;mso-width-percent:0;mso-height-percent:0;mso-wrap-distance-left:9pt;mso-wrap-distance-top:0;mso-wrap-distance-right:9pt;mso-wrap-distance-bottom:0;mso-position-horizontal:absolute;mso-position-horizontal-relative:page;mso-position-vertical:absolute;mso-position-vertical-relative:page;mso-width-percent:0;mso-height-percent:0;mso-width-relative:margin;mso-height-relative:margin" from="269.35pt,152.25pt" to="269.8pt,285.95pt" o:gfxdata="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" o:allowincell="f" strokeweight=".85pt">
                 <v:stroke endarrow="block"/>
                 <w10:wrap anchorx="page" anchory="page"/>
               </v:line>
@@ -1172,7 +1550,7 @@
         <mc:AlternateContent>
           <mc:Choice Requires="wps">
             <w:drawing>
-              <wp:anchor distT="0" distB="0" distL="114300" distR="114300" simplePos="0" relativeHeight="251197952" behindDoc="0" locked="0" layoutInCell="0" allowOverlap="1" wp14:anchorId="08B5A1A5" wp14:editId="2D96D312">
+              <wp:anchor distT="0" distB="0" distL="114300" distR="114300" simplePos="0" relativeHeight="251586048" behindDoc="0" locked="0" layoutInCell="0" allowOverlap="1" wp14:anchorId="08B5A1A5" wp14:editId="2D96D312">
                 <wp:simplePos x="0" y="0"/>
                 <wp:positionH relativeFrom="page">
                   <wp:posOffset>2029767</wp:posOffset>
@@ -1231,7 +1609,7 @@
           </mc:Choice>
           <mc:Fallback>
             <w:pict>
-              <v:line w14:anchorId="70460669" id="Straight Connector 14" o:spid="_x0000_s1026" style="position:absolute;z-index:251197952;visibility:visible;mso-wrap-style:square;mso-width-percent:0;mso-wrap-distance-left:9pt;mso-wrap-distance-top:0;mso-wrap-distance-right:9pt;mso-wrap-distance-bottom:0;mso-position-horizontal:absolute;mso-position-horizontal-relative:page;mso-position-vertical:absolute;mso-position-vertical-relative:page;mso-width-percent:0;mso-width-relative:margin" from="159.8pt,151.9pt" to="269.4pt,152.3pt" o:gfxdata="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" o:allowincell="f" strokeweight=".85pt">
+              <v:line w14:anchorId="03176ED1" id="Straight Connector 14" o:spid="_x0000_s1026" style="position:absolute;z-index:251586048;visibility:visible;mso-wrap-style:square;mso-width-percent:0;mso-wrap-distance-left:9pt;mso-wrap-distance-top:0;mso-wrap-distance-right:9pt;mso-wrap-distance-bottom:0;mso-position-horizontal:absolute;mso-position-horizontal-relative:page;mso-position-vertical:absolute;mso-position-vertical-relative:page;mso-width-percent:0;mso-width-relative:margin" from="159.8pt,151.9pt" to="269.4pt,152.3pt" o:gfxdata="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" o:allowincell="f" strokeweight=".85pt">
                 <w10:wrap anchorx="page" anchory="page"/>
               </v:line>
             </w:pict>
@@ -1245,7 +1623,7 @@
         <mc:AlternateContent>
           <mc:Choice Requires="wps">
             <w:drawing>
-              <wp:anchor distT="0" distB="0" distL="114300" distR="114300" simplePos="0" relativeHeight="251706880" behindDoc="0" locked="0" layoutInCell="0" allowOverlap="1" wp14:anchorId="511F6360" wp14:editId="140A5A8E">
+              <wp:anchor distT="0" distB="0" distL="114300" distR="114300" simplePos="0" relativeHeight="251642368" behindDoc="0" locked="0" layoutInCell="0" allowOverlap="1" wp14:anchorId="511F6360" wp14:editId="140A5A8E">
                 <wp:simplePos x="0" y="0"/>
                 <wp:positionH relativeFrom="page">
                   <wp:posOffset>1941663</wp:posOffset>
@@ -1319,7 +1697,7 @@
           </mc:Choice>
           <mc:Fallback>
             <w:pict>
-              <v:shape w14:anchorId="511F6360" id="Text Box 50" o:spid="_x0000_s1032" type="#_x0000_t202" style="position:absolute;margin-left:152.9pt;margin-top:269.35pt;width:112pt;height:12pt;z-index:251706880;visibility:visible;mso-wrap-style:square;mso-wrap-distance-left:9pt;mso-wrap-distance-top:0;mso-wrap-distance-right:9pt;mso-wrap-distance-bottom:0;mso-position-horizontal:absolute;mso-position-horizontal-relative:page;mso-position-vertical:absolute;mso-position-vertical-relative:page;v-text-anchor:middle" o:gfxdata="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" o:allowincell="f" filled="f" stroked="f" strokeweight=".5pt">
+              <v:shape w14:anchorId="511F6360" id="Text Box 50" o:spid="_x0000_s1034" type="#_x0000_t202" style="position:absolute;margin-left:152.9pt;margin-top:269.35pt;width:112pt;height:12pt;z-index:251642368;visibility:visible;mso-wrap-style:square;mso-wrap-distance-left:9pt;mso-wrap-distance-top:0;mso-wrap-distance-right:9pt;mso-wrap-distance-bottom:0;mso-position-horizontal:absolute;mso-position-horizontal-relative:page;mso-position-vertical:absolute;mso-position-vertical-relative:page;v-text-anchor:middle" o:gfxdata="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" o:allowincell="f" filled="f" stroked="f" strokeweight=".5pt">
                 <v:textbox inset="2pt,1pt,2pt,1pt">
                   <w:txbxContent>
                     <w:p>
@@ -1354,7 +1732,7 @@
         <mc:AlternateContent>
           <mc:Choice Requires="wps">
             <w:drawing>
-              <wp:anchor distT="0" distB="0" distL="114300" distR="114300" simplePos="0" relativeHeight="251739648" behindDoc="0" locked="0" layoutInCell="0" allowOverlap="1" wp14:anchorId="6867DA3D" wp14:editId="751B5861">
+              <wp:anchor distT="0" distB="0" distL="114300" distR="114300" simplePos="0" relativeHeight="251648512" behindDoc="0" locked="0" layoutInCell="0" allowOverlap="1" wp14:anchorId="6867DA3D" wp14:editId="751B5861">
                 <wp:simplePos x="0" y="0"/>
                 <wp:positionH relativeFrom="page">
                   <wp:posOffset>1558053</wp:posOffset>
@@ -1428,7 +1806,7 @@
           </mc:Choice>
           <mc:Fallback>
             <w:pict>
-              <v:shape w14:anchorId="6867DA3D" id="Text Box 51" o:spid="_x0000_s1033" type="#_x0000_t202" style="position:absolute;margin-left:122.7pt;margin-top:318.6pt;width:128pt;height:12pt;z-index:251739648;visibility:visible;mso-wrap-style:square;mso-wrap-distance-left:9pt;mso-wrap-distance-top:0;mso-wrap-distance-right:9pt;mso-wrap-distance-bottom:0;mso-position-horizontal:absolute;mso-position-horizontal-relative:page;mso-position-vertical:absolute;mso-position-vertical-relative:page;v-text-anchor:middle" o:gfxdata="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" o:allowincell="f" filled="f" stroked="f" strokeweight=".5pt">
+              <v:shape w14:anchorId="6867DA3D" id="Text Box 51" o:spid="_x0000_s1035" type="#_x0000_t202" style="position:absolute;margin-left:122.7pt;margin-top:318.6pt;width:128pt;height:12pt;z-index:251648512;visibility:visible;mso-wrap-style:square;mso-wrap-distance-left:9pt;mso-wrap-distance-top:0;mso-wrap-distance-right:9pt;mso-wrap-distance-bottom:0;mso-position-horizontal:absolute;mso-position-horizontal-relative:page;mso-position-vertical:absolute;mso-position-vertical-relative:page;v-text-anchor:middle" o:gfxdata="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" o:allowincell="f" filled="f" stroked="f" strokeweight=".5pt">
                 <v:textbox inset="2pt,1pt,2pt,1pt">
                   <w:txbxContent>
                     <w:p>
@@ -1463,7 +1841,7 @@
         <mc:AlternateContent>
           <mc:Choice Requires="wps">
             <w:drawing>
-              <wp:anchor distT="0" distB="0" distL="114300" distR="114300" simplePos="0" relativeHeight="251774464" behindDoc="0" locked="0" layoutInCell="0" allowOverlap="1" wp14:anchorId="26385700" wp14:editId="33BF88B4">
+              <wp:anchor distT="0" distB="0" distL="114300" distR="114300" simplePos="0" relativeHeight="251654656" behindDoc="0" locked="0" layoutInCell="0" allowOverlap="1" wp14:anchorId="26385700" wp14:editId="33BF88B4">
                 <wp:simplePos x="0" y="0"/>
                 <wp:positionH relativeFrom="page">
                   <wp:posOffset>1212222</wp:posOffset>
@@ -1537,7 +1915,7 @@
           </mc:Choice>
           <mc:Fallback>
             <w:pict>
-              <v:shape w14:anchorId="26385700" id="Text Box 52" o:spid="_x0000_s1034" type="#_x0000_t202" style="position:absolute;margin-left:95.45pt;margin-top:335pt;width:158pt;height:12pt;z-index:251774464;visibility:visible;mso-wrap-style:square;mso-wrap-distance-left:9pt;mso-wrap-distance-top:0;mso-wrap-distance-right:9pt;mso-wrap-distance-bottom:0;mso-position-horizontal:absolute;mso-position-horizontal-relative:page;mso-position-vertical:absolute;mso-position-vertical-relative:page;v-text-anchor:middle" o:gfxdata="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" o:allowincell="f" filled="f" stroked="f" strokeweight=".5pt">
+              <v:shape w14:anchorId="26385700" id="Text Box 52" o:spid="_x0000_s1036" type="#_x0000_t202" style="position:absolute;margin-left:95.45pt;margin-top:335pt;width:158pt;height:12pt;z-index:251654656;visibility:visible;mso-wrap-style:square;mso-wrap-distance-left:9pt;mso-wrap-distance-top:0;mso-wrap-distance-right:9pt;mso-wrap-distance-bottom:0;mso-position-horizontal:absolute;mso-position-horizontal-relative:page;mso-position-vertical:absolute;mso-position-vertical-relative:page;v-text-anchor:middle" o:gfxdata="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" o:allowincell="f" filled="f" stroked="f" strokeweight=".5pt">
                 <v:textbox inset="2pt,1pt,2pt,1pt">
                   <w:txbxContent>
                     <w:p>
@@ -1572,7 +1950,7 @@
         <mc:AlternateContent>
           <mc:Choice Requires="wps">
             <w:drawing>
-              <wp:anchor distT="0" distB="0" distL="114300" distR="114300" simplePos="0" relativeHeight="251639296" behindDoc="0" locked="0" layoutInCell="0" allowOverlap="1" wp14:anchorId="5EA938F3" wp14:editId="6419E8B8">
+              <wp:anchor distT="0" distB="0" distL="114300" distR="114300" simplePos="0" relativeHeight="251630080" behindDoc="0" locked="0" layoutInCell="0" allowOverlap="1" wp14:anchorId="5EA938F3" wp14:editId="6419E8B8">
                 <wp:simplePos x="0" y="0"/>
                 <wp:positionH relativeFrom="page">
                   <wp:posOffset>1831410</wp:posOffset>
@@ -1646,7 +2024,7 @@
           </mc:Choice>
           <mc:Fallback>
             <w:pict>
-              <v:shape w14:anchorId="5EA938F3" id="Text Box 48" o:spid="_x0000_s1035" type="#_x0000_t202" style="position:absolute;margin-left:144.2pt;margin-top:121.15pt;width:132pt;height:12pt;z-index:251639296;visibility:visible;mso-wrap-style:square;mso-wrap-distance-left:9pt;mso-wrap-distance-top:0;mso-wrap-distance-right:9pt;mso-wrap-distance-bottom:0;mso-position-horizontal:absolute;mso-position-horizontal-relative:page;mso-position-vertical:absolute;mso-position-vertical-relative:page;v-text-anchor:middle" o:gfxdata="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" o:allowincell="f" filled="f" stroked="f" strokeweight=".5pt">
+              <v:shape w14:anchorId="5EA938F3" id="Text Box 48" o:spid="_x0000_s1037" type="#_x0000_t202" style="position:absolute;margin-left:144.2pt;margin-top:121.15pt;width:132pt;height:12pt;z-index:251630080;visibility:visible;mso-wrap-style:square;mso-wrap-distance-left:9pt;mso-wrap-distance-top:0;mso-wrap-distance-right:9pt;mso-wrap-distance-bottom:0;mso-position-horizontal:absolute;mso-position-horizontal-relative:page;mso-position-vertical:absolute;mso-position-vertical-relative:page;v-text-anchor:middle" o:gfxdata="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" o:allowincell="f" filled="f" stroked="f" strokeweight=".5pt">
                 <v:textbox inset="2pt,1pt,2pt,1pt">
                   <w:txbxContent>
                     <w:p>
@@ -1681,7 +2059,7 @@
         <mc:AlternateContent>
           <mc:Choice Requires="wps">
             <w:drawing>
-              <wp:anchor distT="0" distB="0" distL="114300" distR="114300" simplePos="0" relativeHeight="251676160" behindDoc="0" locked="0" layoutInCell="0" allowOverlap="1" wp14:anchorId="117ED4C6" wp14:editId="38F2285D">
+              <wp:anchor distT="0" distB="0" distL="114300" distR="114300" simplePos="0" relativeHeight="251636224" behindDoc="0" locked="0" layoutInCell="0" allowOverlap="1" wp14:anchorId="117ED4C6" wp14:editId="38F2285D">
                 <wp:simplePos x="0" y="0"/>
                 <wp:positionH relativeFrom="page">
                   <wp:posOffset>1734178</wp:posOffset>
@@ -1736,7 +2114,7 @@
                                 <w:color w:val="000000"/>
                                 <w:sz w:val="14"/>
                               </w:rPr>
-                              <w:t>Submit Area / Pin and DSS Answers</w:t>
+                              <w:t>Submit Location and DSS Answers</w:t>
                             </w:r>
                           </w:p>
                         </w:txbxContent>
@@ -1755,7 +2133,7 @@
           </mc:Choice>
           <mc:Fallback>
             <w:pict>
-              <v:shape w14:anchorId="117ED4C6" id="Text Box 49" o:spid="_x0000_s1036" type="#_x0000_t202" style="position:absolute;margin-left:136.55pt;margin-top:140.8pt;width:150pt;height:12pt;z-index:251676160;visibility:visible;mso-wrap-style:square;mso-wrap-distance-left:9pt;mso-wrap-distance-top:0;mso-wrap-distance-right:9pt;mso-wrap-distance-bottom:0;mso-position-horizontal:absolute;mso-position-horizontal-relative:page;mso-position-vertical:absolute;mso-position-vertical-relative:page;v-text-anchor:middle" o:gfxdata="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" o:allowincell="f" filled="f" stroked="f" strokeweight=".5pt">
+              <v:shape w14:anchorId="117ED4C6" id="Text Box 49" o:spid="_x0000_s1038" type="#_x0000_t202" style="position:absolute;margin-left:136.55pt;margin-top:140.8pt;width:150pt;height:12pt;z-index:251636224;visibility:visible;mso-wrap-style:square;mso-wrap-distance-left:9pt;mso-wrap-distance-top:0;mso-wrap-distance-right:9pt;mso-wrap-distance-bottom:0;mso-position-horizontal:absolute;mso-position-horizontal-relative:page;mso-position-vertical:absolute;mso-position-vertical-relative:page;v-text-anchor:middle" o:gfxdata="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" o:allowincell="f" filled="f" stroked="f" strokeweight=".5pt">
                 <v:textbox inset="2pt,1pt,2pt,1pt">
                   <w:txbxContent>
                     <w:p>
@@ -1772,7 +2150,7 @@
                           <w:color w:val="000000"/>
                           <w:sz w:val="14"/>
                         </w:rPr>
-                        <w:t>Submit Area / Pin and DSS Answers</w:t>
+                        <w:t>Submit Location and DSS Answers</w:t>
                       </w:r>
                     </w:p>
                   </w:txbxContent>
@@ -1790,7 +2168,7 @@
         <mc:AlternateContent>
           <mc:Choice Requires="wps">
             <w:drawing>
-              <wp:anchor distT="0" distB="0" distL="114300" distR="114300" simplePos="0" relativeHeight="252200448" behindDoc="0" locked="0" layoutInCell="0" allowOverlap="1" wp14:anchorId="7F9B1527" wp14:editId="66FA09AA">
+              <wp:anchor distT="0" distB="0" distL="114300" distR="114300" simplePos="0" relativeHeight="251734528" behindDoc="0" locked="0" layoutInCell="0" allowOverlap="1" wp14:anchorId="7F9B1527" wp14:editId="66FA09AA">
                 <wp:simplePos x="0" y="0"/>
                 <wp:positionH relativeFrom="page">
                   <wp:posOffset>914400</wp:posOffset>
@@ -1864,7 +2242,7 @@
           </mc:Choice>
           <mc:Fallback>
             <w:pict>
-              <v:shape w14:anchorId="7F9B1527" id="Text Box 64" o:spid="_x0000_s1037" type="#_x0000_t202" style="position:absolute;margin-left:1in;margin-top:628pt;width:451pt;height:48pt;z-index:252200448;visibility:visible;mso-wrap-style:square;mso-wrap-distance-left:9pt;mso-wrap-distance-top:0;mso-wrap-distance-right:9pt;mso-wrap-distance-bottom:0;mso-position-horizontal:absolute;mso-position-horizontal-relative:page;mso-position-vertical:absolute;mso-position-vertical-relative:page;v-text-anchor:middle" o:gfxdata="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" o:allowincell="f" filled="f" stroked="f" strokeweight=".5pt">
+              <v:shape w14:anchorId="7F9B1527" id="Text Box 64" o:spid="_x0000_s1039" type="#_x0000_t202" style="position:absolute;margin-left:1in;margin-top:628pt;width:451pt;height:48pt;z-index:251734528;visibility:visible;mso-wrap-style:square;mso-wrap-distance-left:9pt;mso-wrap-distance-top:0;mso-wrap-distance-right:9pt;mso-wrap-distance-bottom:0;mso-position-horizontal:absolute;mso-position-horizontal-relative:page;mso-position-vertical:absolute;mso-position-vertical-relative:page;v-text-anchor:middle" o:gfxdata="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" o:allowincell="f" filled="f" stroked="f" strokeweight=".5pt">
                 <v:textbox inset="2pt,1pt,2pt,1pt">
                   <w:txbxContent>
                     <w:p>
@@ -1899,7 +2277,7 @@
         <mc:AlternateContent>
           <mc:Choice Requires="wps">
             <w:drawing>
-              <wp:anchor distT="0" distB="0" distL="114300" distR="114300" simplePos="0" relativeHeight="252165632" behindDoc="0" locked="0" layoutInCell="0" allowOverlap="1" wp14:anchorId="531D5E9A" wp14:editId="3B234407">
+              <wp:anchor distT="0" distB="0" distL="114300" distR="114300" simplePos="0" relativeHeight="251728384" behindDoc="0" locked="0" layoutInCell="0" allowOverlap="1" wp14:anchorId="531D5E9A" wp14:editId="3B234407">
                 <wp:simplePos x="0" y="0"/>
                 <wp:positionH relativeFrom="page">
                   <wp:posOffset>3238500</wp:posOffset>
@@ -1973,7 +2351,7 @@
           </mc:Choice>
           <mc:Fallback>
             <w:pict>
-              <v:shape w14:anchorId="531D5E9A" id="Text Box 63" o:spid="_x0000_s1038" type="#_x0000_t202" style="position:absolute;margin-left:255pt;margin-top:313pt;width:116pt;height:24pt;z-index:252165632;visibility:visible;mso-wrap-style:square;mso-wrap-distance-left:9pt;mso-wrap-distance-top:0;mso-wrap-distance-right:9pt;mso-wrap-distance-bottom:0;mso-position-horizontal:absolute;mso-position-horizontal-relative:page;mso-position-vertical:absolute;mso-position-vertical-relative:page;v-text-anchor:middle" o:gfxdata="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" o:allowincell="f" filled="f" stroked="f" strokeweight=".5pt">
+              <v:shape w14:anchorId="531D5E9A" id="Text Box 63" o:spid="_x0000_s1040" type="#_x0000_t202" style="position:absolute;margin-left:255pt;margin-top:313pt;width:116pt;height:24pt;z-index:251728384;visibility:visible;mso-wrap-style:square;mso-wrap-distance-left:9pt;mso-wrap-distance-top:0;mso-wrap-distance-right:9pt;mso-wrap-distance-bottom:0;mso-position-horizontal:absolute;mso-position-horizontal-relative:page;mso-position-vertical:absolute;mso-position-vertical-relative:page;v-text-anchor:middle" o:gfxdata="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" o:allowincell="f" filled="f" stroked="f" strokeweight=".5pt">
                 <v:textbox inset="2pt,1pt,2pt,1pt">
                   <w:txbxContent>
                     <w:p>
@@ -2008,7 +2386,7 @@
         <mc:AlternateContent>
           <mc:Choice Requires="wps">
             <w:drawing>
-              <wp:anchor distT="0" distB="0" distL="114300" distR="114300" simplePos="0" relativeHeight="252130816" behindDoc="0" locked="0" layoutInCell="0" allowOverlap="1" wp14:anchorId="1AFAF965" wp14:editId="32AB5E64">
+              <wp:anchor distT="0" distB="0" distL="114300" distR="114300" simplePos="0" relativeHeight="251722240" behindDoc="0" locked="0" layoutInCell="0" allowOverlap="1" wp14:anchorId="1AFAF965" wp14:editId="2F82F265">
                 <wp:simplePos x="0" y="0"/>
                 <wp:positionH relativeFrom="page">
                   <wp:posOffset>3302000</wp:posOffset>
@@ -2082,7 +2460,7 @@
           </mc:Choice>
           <mc:Fallback>
             <w:pict>
-              <v:shape w14:anchorId="1AFAF965" id="Text Box 62" o:spid="_x0000_s1039" type="#_x0000_t202" style="position:absolute;margin-left:260pt;margin-top:289pt;width:106pt;height:15pt;z-index:252130816;visibility:visible;mso-wrap-style:square;mso-wrap-distance-left:9pt;mso-wrap-distance-top:0;mso-wrap-distance-right:9pt;mso-wrap-distance-bottom:0;mso-position-horizontal:absolute;mso-position-horizontal-relative:page;mso-position-vertical:absolute;mso-position-vertical-relative:page;v-text-anchor:middle" o:gfxdata="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" o:allowincell="f" filled="f" stroked="f" strokeweight=".5pt">
+              <v:shape w14:anchorId="1AFAF965" id="Text Box 62" o:spid="_x0000_s1041" type="#_x0000_t202" style="position:absolute;margin-left:260pt;margin-top:289pt;width:106pt;height:15pt;z-index:251722240;visibility:visible;mso-wrap-style:square;mso-wrap-distance-left:9pt;mso-wrap-distance-top:0;mso-wrap-distance-right:9pt;mso-wrap-distance-bottom:0;mso-position-horizontal:absolute;mso-position-horizontal-relative:page;mso-position-vertical:absolute;mso-position-vertical-relative:page;v-text-anchor:middle" o:gfxdata="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" o:allowincell="f" filled="f" stroked="f" strokeweight=".5pt">
                 <v:textbox inset="2pt,1pt,2pt,1pt">
                   <w:txbxContent>
                     <w:p>
@@ -2117,18 +2495,18 @@
         <mc:AlternateContent>
           <mc:Choice Requires="wps">
             <w:drawing>
-              <wp:anchor distT="0" distB="0" distL="114300" distR="114300" simplePos="0" relativeHeight="252096000" behindDoc="0" locked="0" layoutInCell="0" allowOverlap="1" wp14:anchorId="2774A086" wp14:editId="320C6EA2">
+              <wp:anchor distT="0" distB="0" distL="114300" distR="114300" simplePos="0" relativeHeight="251675136" behindDoc="0" locked="0" layoutInCell="0" allowOverlap="1" wp14:anchorId="2E44E4BD" wp14:editId="27D19842">
                 <wp:simplePos x="0" y="0"/>
                 <wp:positionH relativeFrom="page">
-                  <wp:posOffset>5181600</wp:posOffset>
+                  <wp:posOffset>4851400</wp:posOffset>
                 </wp:positionH>
                 <wp:positionV relativeFrom="page">
-                  <wp:posOffset>5740400</wp:posOffset>
+                  <wp:posOffset>4165600</wp:posOffset>
                 </wp:positionV>
-                <wp:extent cx="1422400" cy="228600"/>
+                <wp:extent cx="1574800" cy="152400"/>
                 <wp:effectExtent l="0" t="0" r="6350" b="0"/>
                 <wp:wrapNone/>
-                <wp:docPr id="61" name="Text Box 61"/>
+                <wp:docPr id="56" name="Text Box 56"/>
                 <wp:cNvGraphicFramePr/>
                 <a:graphic xmlns:a="http://schemas.openxmlformats.org/drawingml/2006/main">
                   <a:graphicData uri="http://schemas.microsoft.com/office/word/2010/wordprocessingShape">
@@ -2137,7 +2515,7 @@
                       <wps:spPr>
                         <a:xfrm>
                           <a:off x="0" y="0"/>
-                          <a:ext cx="1422400" cy="228600"/>
+                          <a:ext cx="1574800" cy="152400"/>
                         </a:xfrm>
                         <a:prstGeom prst="rect">
                           <a:avLst/>
@@ -2172,7 +2550,7 @@
                                 <w:color w:val="000000"/>
                                 <w:sz w:val="13"/>
                               </w:rPr>
-                              <w:t>Versions and Audit History</w:t>
+                              <w:t>Candidate Records for Review</w:t>
                             </w:r>
                           </w:p>
                         </w:txbxContent>
@@ -2191,7 +2569,7 @@
           </mc:Choice>
           <mc:Fallback>
             <w:pict>
-              <v:shape w14:anchorId="2774A086" id="Text Box 61" o:spid="_x0000_s1040" type="#_x0000_t202" style="position:absolute;margin-left:408pt;margin-top:452pt;width:112pt;height:18pt;z-index:252096000;visibility:visible;mso-wrap-style:square;mso-wrap-distance-left:9pt;mso-wrap-distance-top:0;mso-wrap-distance-right:9pt;mso-wrap-distance-bottom:0;mso-position-horizontal:absolute;mso-position-horizontal-relative:page;mso-position-vertical:absolute;mso-position-vertical-relative:page;v-text-anchor:middle" o:gfxdata="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" o:allowincell="f" filled="f" stroked="f" strokeweight=".5pt">
+              <v:shape w14:anchorId="2E44E4BD" id="Text Box 56" o:spid="_x0000_s1042" type="#_x0000_t202" style="position:absolute;margin-left:382pt;margin-top:328pt;width:124pt;height:12pt;z-index:251675136;visibility:visible;mso-wrap-style:square;mso-wrap-distance-left:9pt;mso-wrap-distance-top:0;mso-wrap-distance-right:9pt;mso-wrap-distance-bottom:0;mso-position-horizontal:absolute;mso-position-horizontal-relative:page;mso-position-vertical:absolute;mso-position-vertical-relative:page;v-text-anchor:middle" o:gfxdata="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" o:allowincell="f" filled="f" stroked="f" strokeweight=".5pt">
                 <v:textbox inset="2pt,1pt,2pt,1pt">
                   <w:txbxContent>
                     <w:p>
@@ -2208,7 +2586,7 @@
                           <w:color w:val="000000"/>
                           <w:sz w:val="13"/>
                         </w:rPr>
-                        <w:t>Versions and Audit History</w:t>
+                        <w:t>Candidate Records for Review</w:t>
                       </w:r>
                     </w:p>
                   </w:txbxContent>
@@ -2226,259 +2604,7 @@
         <mc:AlternateContent>
           <mc:Choice Requires="wps">
             <w:drawing>
-              <wp:anchor distT="0" distB="0" distL="114300" distR="114300" simplePos="0" relativeHeight="252061184" behindDoc="0" locked="0" layoutInCell="0" allowOverlap="1" wp14:anchorId="4F472559" wp14:editId="252EAF8B">
-                <wp:simplePos x="0" y="0"/>
-                <wp:positionH relativeFrom="page">
-                  <wp:posOffset>4699000</wp:posOffset>
-                </wp:positionH>
-                <wp:positionV relativeFrom="page">
-                  <wp:posOffset>5016500</wp:posOffset>
-                </wp:positionV>
-                <wp:extent cx="1879600" cy="279400"/>
-                <wp:effectExtent l="0" t="0" r="6350" b="6350"/>
-                <wp:wrapNone/>
-                <wp:docPr id="60" name="Text Box 60"/>
-                <wp:cNvGraphicFramePr/>
-                <a:graphic xmlns:a="http://schemas.openxmlformats.org/drawingml/2006/main">
-                  <a:graphicData uri="http://schemas.microsoft.com/office/word/2010/wordprocessingShape">
-                    <wps:wsp>
-                      <wps:cNvSpPr txBox="1"/>
-                      <wps:spPr>
-                        <a:xfrm>
-                          <a:off x="0" y="0"/>
-                          <a:ext cx="1879600" cy="279400"/>
-                        </a:xfrm>
-                        <a:prstGeom prst="rect">
-                          <a:avLst/>
-                        </a:prstGeom>
-                        <a:noFill/>
-                        <a:ln w="6350">
-                          <a:noFill/>
-                        </a:ln>
-                        <a:extLst>
-                          <a:ext uri="{91240B29-F687-4F45-9708-019B960494DF}">
-                            <a14:hiddenLine xmlns:a14="http://schemas.microsoft.com/office/drawing/2010/main" w="6350">
-                              <a:solidFill>
-                                <a:prstClr val="black"/>
-                              </a:solidFill>
-                            </a14:hiddenLine>
-                          </a:ext>
-                        </a:extLst>
-                      </wps:spPr>
-                      <wps:txbx>
-                        <w:txbxContent>
-                          <w:p>
-                            <w:pPr>
-                              <w:spacing w:after="0"/>
-                              <w:jc w:val="center"/>
-                              <w:rPr>
-                                <w:color w:val="000000"/>
-                                <w:sz w:val="13"/>
-                              </w:rPr>
-                            </w:pPr>
-                            <w:r>
-                              <w:rPr>
-                                <w:color w:val="000000"/>
-                                <w:sz w:val="13"/>
-                              </w:rPr>
-                              <w:t>Managed Records and</w:t>
-                            </w:r>
-                          </w:p>
-                          <w:p>
-                            <w:pPr>
-                              <w:spacing w:after="0"/>
-                              <w:jc w:val="center"/>
-                              <w:rPr>
-                                <w:color w:val="000000"/>
-                                <w:sz w:val="13"/>
-                              </w:rPr>
-                            </w:pPr>
-                            <w:r>
-                              <w:rPr>
-                                <w:color w:val="000000"/>
-                                <w:sz w:val="13"/>
-                              </w:rPr>
-                              <w:t>Validation Status</w:t>
-                            </w:r>
-                          </w:p>
-                        </w:txbxContent>
-                      </wps:txbx>
-                      <wps:bodyPr rot="0" spcFirstLastPara="0" vertOverflow="overflow" horzOverflow="overflow" vert="horz" wrap="square" lIns="25400" tIns="12700" rIns="25400" bIns="12700" numCol="1" spcCol="0" rtlCol="0" fromWordArt="0" anchor="ctr" anchorCtr="0" forceAA="0" compatLnSpc="1">
-                        <a:prstTxWarp prst="textNoShape">
-                          <a:avLst/>
-                        </a:prstTxWarp>
-                        <a:noAutofit/>
-                      </wps:bodyPr>
-                    </wps:wsp>
-                  </a:graphicData>
-                </a:graphic>
-              </wp:anchor>
-            </w:drawing>
-          </mc:Choice>
-          <mc:Fallback>
-            <w:pict>
-              <v:shape w14:anchorId="4F472559" id="Text Box 60" o:spid="_x0000_s1041" type="#_x0000_t202" style="position:absolute;margin-left:370pt;margin-top:395pt;width:148pt;height:22pt;z-index:252061184;visibility:visible;mso-wrap-style:square;mso-wrap-distance-left:9pt;mso-wrap-distance-top:0;mso-wrap-distance-right:9pt;mso-wrap-distance-bottom:0;mso-position-horizontal:absolute;mso-position-horizontal-relative:page;mso-position-vertical:absolute;mso-position-vertical-relative:page;v-text-anchor:middle" o:gfxdata="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" o:allowincell="f" filled="f" stroked="f" strokeweight=".5pt">
-                <v:textbox inset="2pt,1pt,2pt,1pt">
-                  <w:txbxContent>
-                    <w:p>
-                      <w:pPr>
-                        <w:spacing w:after="0"/>
-                        <w:jc w:val="center"/>
-                        <w:rPr>
-                          <w:color w:val="000000"/>
-                          <w:sz w:val="13"/>
-                        </w:rPr>
-                      </w:pPr>
-                      <w:r>
-                        <w:rPr>
-                          <w:color w:val="000000"/>
-                          <w:sz w:val="13"/>
-                        </w:rPr>
-                        <w:t>Managed Records and</w:t>
-                      </w:r>
-                    </w:p>
-                    <w:p>
-                      <w:pPr>
-                        <w:spacing w:after="0"/>
-                        <w:jc w:val="center"/>
-                        <w:rPr>
-                          <w:color w:val="000000"/>
-                          <w:sz w:val="13"/>
-                        </w:rPr>
-                      </w:pPr>
-                      <w:r>
-                        <w:rPr>
-                          <w:color w:val="000000"/>
-                          <w:sz w:val="13"/>
-                        </w:rPr>
-                        <w:t>Validation Status</w:t>
-                      </w:r>
-                    </w:p>
-                  </w:txbxContent>
-                </v:textbox>
-                <w10:wrap anchorx="page" anchory="page"/>
-              </v:shape>
-            </w:pict>
-          </mc:Fallback>
-        </mc:AlternateContent>
-      </w:r>
-      <w:r>
-        <w:rPr>
-          <w:noProof/>
-        </w:rPr>
-        <mc:AlternateContent>
-          <mc:Choice Requires="wps">
-            <w:drawing>
-              <wp:anchor distT="0" distB="0" distL="114300" distR="114300" simplePos="0" relativeHeight="251911680" behindDoc="0" locked="0" layoutInCell="0" allowOverlap="1" wp14:anchorId="2E44E4BD" wp14:editId="27D19842">
-                <wp:simplePos x="0" y="0"/>
-                <wp:positionH relativeFrom="page">
-                  <wp:posOffset>4851400</wp:posOffset>
-                </wp:positionH>
-                <wp:positionV relativeFrom="page">
-                  <wp:posOffset>4165600</wp:posOffset>
-                </wp:positionV>
-                <wp:extent cx="1574800" cy="152400"/>
-                <wp:effectExtent l="0" t="0" r="6350" b="0"/>
-                <wp:wrapNone/>
-                <wp:docPr id="56" name="Text Box 56"/>
-                <wp:cNvGraphicFramePr/>
-                <a:graphic xmlns:a="http://schemas.openxmlformats.org/drawingml/2006/main">
-                  <a:graphicData uri="http://schemas.microsoft.com/office/word/2010/wordprocessingShape">
-                    <wps:wsp>
-                      <wps:cNvSpPr txBox="1"/>
-                      <wps:spPr>
-                        <a:xfrm>
-                          <a:off x="0" y="0"/>
-                          <a:ext cx="1574800" cy="152400"/>
-                        </a:xfrm>
-                        <a:prstGeom prst="rect">
-                          <a:avLst/>
-                        </a:prstGeom>
-                        <a:noFill/>
-                        <a:ln w="6350">
-                          <a:noFill/>
-                        </a:ln>
-                        <a:extLst>
-                          <a:ext uri="{91240B29-F687-4F45-9708-019B960494DF}">
-                            <a14:hiddenLine xmlns:a14="http://schemas.microsoft.com/office/drawing/2010/main" w="6350">
-                              <a:solidFill>
-                                <a:prstClr val="black"/>
-                              </a:solidFill>
-                            </a14:hiddenLine>
-                          </a:ext>
-                        </a:extLst>
-                      </wps:spPr>
-                      <wps:txbx>
-                        <w:txbxContent>
-                          <w:p>
-                            <w:pPr>
-                              <w:spacing w:after="0"/>
-                              <w:jc w:val="center"/>
-                              <w:rPr>
-                                <w:color w:val="000000"/>
-                                <w:sz w:val="13"/>
-                              </w:rPr>
-                            </w:pPr>
-                            <w:r>
-                              <w:rPr>
-                                <w:color w:val="000000"/>
-                                <w:sz w:val="13"/>
-                              </w:rPr>
-                              <w:t>Records and Versions for Review</w:t>
-                            </w:r>
-                          </w:p>
-                        </w:txbxContent>
-                      </wps:txbx>
-                      <wps:bodyPr rot="0" spcFirstLastPara="0" vertOverflow="overflow" horzOverflow="overflow" vert="horz" wrap="square" lIns="25400" tIns="12700" rIns="25400" bIns="12700" numCol="1" spcCol="0" rtlCol="0" fromWordArt="0" anchor="ctr" anchorCtr="0" forceAA="0" compatLnSpc="1">
-                        <a:prstTxWarp prst="textNoShape">
-                          <a:avLst/>
-                        </a:prstTxWarp>
-                        <a:noAutofit/>
-                      </wps:bodyPr>
-                    </wps:wsp>
-                  </a:graphicData>
-                </a:graphic>
-              </wp:anchor>
-            </w:drawing>
-          </mc:Choice>
-          <mc:Fallback>
-            <w:pict>
-              <v:shape w14:anchorId="2E44E4BD" id="Text Box 56" o:spid="_x0000_s1042" type="#_x0000_t202" style="position:absolute;margin-left:382pt;margin-top:328pt;width:124pt;height:12pt;z-index:251911680;visibility:visible;mso-wrap-style:square;mso-wrap-distance-left:9pt;mso-wrap-distance-top:0;mso-wrap-distance-right:9pt;mso-wrap-distance-bottom:0;mso-position-horizontal:absolute;mso-position-horizontal-relative:page;mso-position-vertical:absolute;mso-position-vertical-relative:page;v-text-anchor:middle" o:gfxdata="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" o:allowincell="f" filled="f" stroked="f" strokeweight=".5pt">
-                <v:textbox inset="2pt,1pt,2pt,1pt">
-                  <w:txbxContent>
-                    <w:p>
-                      <w:pPr>
-                        <w:spacing w:after="0"/>
-                        <w:jc w:val="center"/>
-                        <w:rPr>
-                          <w:color w:val="000000"/>
-                          <w:sz w:val="13"/>
-                        </w:rPr>
-                      </w:pPr>
-                      <w:r>
-                        <w:rPr>
-                          <w:color w:val="000000"/>
-                          <w:sz w:val="13"/>
-                        </w:rPr>
-                        <w:t>Records and Versions for Review</w:t>
-                      </w:r>
-                    </w:p>
-                  </w:txbxContent>
-                </v:textbox>
-                <w10:wrap anchorx="page" anchory="page"/>
-              </v:shape>
-            </w:pict>
-          </mc:Fallback>
-        </mc:AlternateContent>
-      </w:r>
-      <w:r>
-        <w:rPr>
-          <w:noProof/>
-        </w:rPr>
-        <mc:AlternateContent>
-          <mc:Choice Requires="wps">
-            <w:drawing>
-              <wp:anchor distT="0" distB="0" distL="114300" distR="114300" simplePos="0" relativeHeight="251602432" behindDoc="0" locked="0" layoutInCell="0" allowOverlap="1" wp14:anchorId="00B2E3B3" wp14:editId="1E6DF43B">
+              <wp:anchor distT="0" distB="0" distL="114300" distR="114300" simplePos="0" relativeHeight="251623936" behindDoc="0" locked="0" layoutInCell="0" allowOverlap="1" wp14:anchorId="00B2E3B3" wp14:editId="1E6DF43B">
                 <wp:simplePos x="0" y="0"/>
                 <wp:positionH relativeFrom="page">
                   <wp:posOffset>1625600</wp:posOffset>
@@ -2552,7 +2678,7 @@
           </mc:Choice>
           <mc:Fallback>
             <w:pict>
-              <v:shape w14:anchorId="00B2E3B3" id="Text Box 47" o:spid="_x0000_s1043" type="#_x0000_t202" style="position:absolute;margin-left:128pt;margin-top:100pt;width:120pt;height:12pt;z-index:251602432;visibility:visible;mso-wrap-style:square;mso-wrap-distance-left:9pt;mso-wrap-distance-top:0;mso-wrap-distance-right:9pt;mso-wrap-distance-bottom:0;mso-position-horizontal:absolute;mso-position-horizontal-relative:page;mso-position-vertical:absolute;mso-position-vertical-relative:page;v-text-anchor:middle" o:gfxdata="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" o:allowincell="f" filled="f" stroked="f" strokeweight=".5pt">
+              <v:shape w14:anchorId="00B2E3B3" id="Text Box 47" o:spid="_x0000_s1043" type="#_x0000_t202" style="position:absolute;margin-left:128pt;margin-top:100pt;width:120pt;height:12pt;z-index:251623936;visibility:visible;mso-wrap-style:square;mso-wrap-distance-left:9pt;mso-wrap-distance-top:0;mso-wrap-distance-right:9pt;mso-wrap-distance-bottom:0;mso-position-horizontal:absolute;mso-position-horizontal-relative:page;mso-position-vertical:absolute;mso-position-vertical-relative:page;v-text-anchor:middle" o:gfxdata="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" o:allowincell="f" filled="f" stroked="f" strokeweight=".5pt">
                 <v:textbox inset="2pt,1pt,2pt,1pt">
                   <w:txbxContent>
                     <w:p>
@@ -2587,570 +2713,7 @@
         <mc:AlternateContent>
           <mc:Choice Requires="wps">
             <w:drawing>
-              <wp:anchor distT="0" distB="0" distL="114300" distR="114300" simplePos="0" relativeHeight="251590144" behindDoc="0" locked="0" layoutInCell="0" allowOverlap="1" wp14:anchorId="4F2F4EC5" wp14:editId="05707167">
-                <wp:simplePos x="0" y="0"/>
-                <wp:positionH relativeFrom="page">
-                  <wp:posOffset>4635500</wp:posOffset>
-                </wp:positionH>
-                <wp:positionV relativeFrom="page">
-                  <wp:posOffset>6045200</wp:posOffset>
-                </wp:positionV>
-                <wp:extent cx="0" cy="304800"/>
-                <wp:effectExtent l="76200" t="0" r="57150" b="57150"/>
-                <wp:wrapNone/>
-                <wp:docPr id="46" name="Straight Connector 46"/>
-                <wp:cNvGraphicFramePr/>
-                <a:graphic xmlns:a="http://schemas.openxmlformats.org/drawingml/2006/main">
-                  <a:graphicData uri="http://schemas.microsoft.com/office/word/2010/wordprocessingShape">
-                    <wps:wsp>
-                      <wps:cNvCnPr/>
-                      <wps:spPr>
-                        <a:xfrm>
-                          <a:off x="0" y="0"/>
-                          <a:ext cx="0" cy="304800"/>
-                        </a:xfrm>
-                        <a:prstGeom prst="line">
-                          <a:avLst/>
-                        </a:prstGeom>
-                        <a:ln w="10795">
-                          <a:solidFill>
-                            <a:srgbClr val="000000"/>
-                          </a:solidFill>
-                          <a:headEnd type="none"/>
-                          <a:tailEnd type="triangle"/>
-                        </a:ln>
-                      </wps:spPr>
-                      <wps:style>
-                        <a:lnRef idx="1">
-                          <a:schemeClr val="accent1"/>
-                        </a:lnRef>
-                        <a:fillRef idx="0">
-                          <a:schemeClr val="accent1"/>
-                        </a:fillRef>
-                        <a:effectRef idx="0">
-                          <a:schemeClr val="accent1"/>
-                        </a:effectRef>
-                        <a:fontRef idx="minor">
-                          <a:schemeClr val="tx1"/>
-                        </a:fontRef>
-                      </wps:style>
-                      <wps:bodyPr/>
-                    </wps:wsp>
-                  </a:graphicData>
-                </a:graphic>
-              </wp:anchor>
-            </w:drawing>
-          </mc:Choice>
-          <mc:Fallback>
-            <w:pict>
-              <v:line w14:anchorId="5180DFA1" id="Straight Connector 46" o:spid="_x0000_s1026" style="position:absolute;z-index:251590144;visibility:visible;mso-wrap-style:square;mso-wrap-distance-left:9pt;mso-wrap-distance-top:0;mso-wrap-distance-right:9pt;mso-wrap-distance-bottom:0;mso-position-horizontal:absolute;mso-position-horizontal-relative:page;mso-position-vertical:absolute;mso-position-vertical-relative:page" from="365pt,476pt" to="365pt,500pt" o:gfxdata="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" o:allowincell="f" strokeweight=".85pt">
-                <v:stroke endarrow="block"/>
-                <w10:wrap anchorx="page" anchory="page"/>
-              </v:line>
-            </w:pict>
-          </mc:Fallback>
-        </mc:AlternateContent>
-      </w:r>
-      <w:r>
-        <w:rPr>
-          <w:noProof/>
-        </w:rPr>
-        <mc:AlternateContent>
-          <mc:Choice Requires="wps">
-            <w:drawing>
-              <wp:anchor distT="0" distB="0" distL="114300" distR="114300" simplePos="0" relativeHeight="251577856" behindDoc="0" locked="0" layoutInCell="0" allowOverlap="1" wp14:anchorId="43EADD29" wp14:editId="05D3A8E2">
-                <wp:simplePos x="0" y="0"/>
-                <wp:positionH relativeFrom="page">
-                  <wp:posOffset>4635500</wp:posOffset>
-                </wp:positionH>
-                <wp:positionV relativeFrom="page">
-                  <wp:posOffset>6045200</wp:posOffset>
-                </wp:positionV>
-                <wp:extent cx="508000" cy="0"/>
-                <wp:effectExtent l="0" t="0" r="0" b="0"/>
-                <wp:wrapNone/>
-                <wp:docPr id="45" name="Straight Connector 45"/>
-                <wp:cNvGraphicFramePr/>
-                <a:graphic xmlns:a="http://schemas.openxmlformats.org/drawingml/2006/main">
-                  <a:graphicData uri="http://schemas.microsoft.com/office/word/2010/wordprocessingShape">
-                    <wps:wsp>
-                      <wps:cNvCnPr/>
-                      <wps:spPr>
-                        <a:xfrm flipH="1">
-                          <a:off x="0" y="0"/>
-                          <a:ext cx="508000" cy="0"/>
-                        </a:xfrm>
-                        <a:prstGeom prst="line">
-                          <a:avLst/>
-                        </a:prstGeom>
-                        <a:ln w="10795">
-                          <a:solidFill>
-                            <a:srgbClr val="000000"/>
-                          </a:solidFill>
-                          <a:headEnd type="none"/>
-                          <a:tailEnd type="none"/>
-                        </a:ln>
-                      </wps:spPr>
-                      <wps:style>
-                        <a:lnRef idx="1">
-                          <a:schemeClr val="accent1"/>
-                        </a:lnRef>
-                        <a:fillRef idx="0">
-                          <a:schemeClr val="accent1"/>
-                        </a:fillRef>
-                        <a:effectRef idx="0">
-                          <a:schemeClr val="accent1"/>
-                        </a:effectRef>
-                        <a:fontRef idx="minor">
-                          <a:schemeClr val="tx1"/>
-                        </a:fontRef>
-                      </wps:style>
-                      <wps:bodyPr/>
-                    </wps:wsp>
-                  </a:graphicData>
-                </a:graphic>
-              </wp:anchor>
-            </w:drawing>
-          </mc:Choice>
-          <mc:Fallback>
-            <w:pict>
-              <v:line w14:anchorId="0686E5EE" id="Straight Connector 45" o:spid="_x0000_s1026" style="position:absolute;flip:x;z-index:251577856;visibility:visible;mso-wrap-style:square;mso-wrap-distance-left:9pt;mso-wrap-distance-top:0;mso-wrap-distance-right:9pt;mso-wrap-distance-bottom:0;mso-position-horizontal:absolute;mso-position-horizontal-relative:page;mso-position-vertical:absolute;mso-position-vertical-relative:page" from="365pt,476pt" to="405pt,476pt" o:gfxdata="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" o:allowincell="f" strokeweight=".85pt">
-                <w10:wrap anchorx="page" anchory="page"/>
-              </v:line>
-            </w:pict>
-          </mc:Fallback>
-        </mc:AlternateContent>
-      </w:r>
-      <w:r>
-        <w:rPr>
-          <w:noProof/>
-        </w:rPr>
-        <mc:AlternateContent>
-          <mc:Choice Requires="wps">
-            <w:drawing>
-              <wp:anchor distT="0" distB="0" distL="114300" distR="114300" simplePos="0" relativeHeight="251565568" behindDoc="0" locked="0" layoutInCell="0" allowOverlap="1" wp14:anchorId="3E9BC2AA" wp14:editId="71E76837">
-                <wp:simplePos x="0" y="0"/>
-                <wp:positionH relativeFrom="page">
-                  <wp:posOffset>5143500</wp:posOffset>
-                </wp:positionH>
-                <wp:positionV relativeFrom="page">
-                  <wp:posOffset>4394200</wp:posOffset>
-                </wp:positionV>
-                <wp:extent cx="0" cy="1651000"/>
-                <wp:effectExtent l="0" t="0" r="38100" b="25400"/>
-                <wp:wrapNone/>
-                <wp:docPr id="44" name="Straight Connector 44"/>
-                <wp:cNvGraphicFramePr/>
-                <a:graphic xmlns:a="http://schemas.openxmlformats.org/drawingml/2006/main">
-                  <a:graphicData uri="http://schemas.microsoft.com/office/word/2010/wordprocessingShape">
-                    <wps:wsp>
-                      <wps:cNvCnPr/>
-                      <wps:spPr>
-                        <a:xfrm>
-                          <a:off x="0" y="0"/>
-                          <a:ext cx="0" cy="1651000"/>
-                        </a:xfrm>
-                        <a:prstGeom prst="line">
-                          <a:avLst/>
-                        </a:prstGeom>
-                        <a:ln w="10795">
-                          <a:solidFill>
-                            <a:srgbClr val="000000"/>
-                          </a:solidFill>
-                          <a:headEnd type="none"/>
-                          <a:tailEnd type="none"/>
-                        </a:ln>
-                      </wps:spPr>
-                      <wps:style>
-                        <a:lnRef idx="1">
-                          <a:schemeClr val="accent1"/>
-                        </a:lnRef>
-                        <a:fillRef idx="0">
-                          <a:schemeClr val="accent1"/>
-                        </a:fillRef>
-                        <a:effectRef idx="0">
-                          <a:schemeClr val="accent1"/>
-                        </a:effectRef>
-                        <a:fontRef idx="minor">
-                          <a:schemeClr val="tx1"/>
-                        </a:fontRef>
-                      </wps:style>
-                      <wps:bodyPr/>
-                    </wps:wsp>
-                  </a:graphicData>
-                </a:graphic>
-              </wp:anchor>
-            </w:drawing>
-          </mc:Choice>
-          <mc:Fallback>
-            <w:pict>
-              <v:line w14:anchorId="40245CAD" id="Straight Connector 44" o:spid="_x0000_s1026" style="position:absolute;z-index:251565568;visibility:visible;mso-wrap-style:square;mso-wrap-distance-left:9pt;mso-wrap-distance-top:0;mso-wrap-distance-right:9pt;mso-wrap-distance-bottom:0;mso-position-horizontal:absolute;mso-position-horizontal-relative:page;mso-position-vertical:absolute;mso-position-vertical-relative:page" from="405pt,346pt" to="405pt,476pt" o:gfxdata="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" o:allowincell="f" strokeweight=".85pt">
-                <w10:wrap anchorx="page" anchory="page"/>
-              </v:line>
-            </w:pict>
-          </mc:Fallback>
-        </mc:AlternateContent>
-      </w:r>
-      <w:r>
-        <w:rPr>
-          <w:noProof/>
-        </w:rPr>
-        <mc:AlternateContent>
-          <mc:Choice Requires="wps">
-            <w:drawing>
-              <wp:anchor distT="0" distB="0" distL="114300" distR="114300" simplePos="0" relativeHeight="251553280" behindDoc="0" locked="0" layoutInCell="0" allowOverlap="1" wp14:anchorId="4BBE7E41" wp14:editId="1BD24415">
-                <wp:simplePos x="0" y="0"/>
-                <wp:positionH relativeFrom="page">
-                  <wp:posOffset>4851400</wp:posOffset>
-                </wp:positionH>
-                <wp:positionV relativeFrom="page">
-                  <wp:posOffset>4394200</wp:posOffset>
-                </wp:positionV>
-                <wp:extent cx="292100" cy="0"/>
-                <wp:effectExtent l="0" t="0" r="0" b="0"/>
-                <wp:wrapNone/>
-                <wp:docPr id="43" name="Straight Connector 43"/>
-                <wp:cNvGraphicFramePr/>
-                <a:graphic xmlns:a="http://schemas.openxmlformats.org/drawingml/2006/main">
-                  <a:graphicData uri="http://schemas.microsoft.com/office/word/2010/wordprocessingShape">
-                    <wps:wsp>
-                      <wps:cNvCnPr/>
-                      <wps:spPr>
-                        <a:xfrm>
-                          <a:off x="0" y="0"/>
-                          <a:ext cx="292100" cy="0"/>
-                        </a:xfrm>
-                        <a:prstGeom prst="line">
-                          <a:avLst/>
-                        </a:prstGeom>
-                        <a:ln w="10795">
-                          <a:solidFill>
-                            <a:srgbClr val="000000"/>
-                          </a:solidFill>
-                          <a:headEnd type="none"/>
-                          <a:tailEnd type="none"/>
-                        </a:ln>
-                      </wps:spPr>
-                      <wps:style>
-                        <a:lnRef idx="1">
-                          <a:schemeClr val="accent1"/>
-                        </a:lnRef>
-                        <a:fillRef idx="0">
-                          <a:schemeClr val="accent1"/>
-                        </a:fillRef>
-                        <a:effectRef idx="0">
-                          <a:schemeClr val="accent1"/>
-                        </a:effectRef>
-                        <a:fontRef idx="minor">
-                          <a:schemeClr val="tx1"/>
-                        </a:fontRef>
-                      </wps:style>
-                      <wps:bodyPr/>
-                    </wps:wsp>
-                  </a:graphicData>
-                </a:graphic>
-              </wp:anchor>
-            </w:drawing>
-          </mc:Choice>
-          <mc:Fallback>
-            <w:pict>
-              <v:line w14:anchorId="67BA126D" id="Straight Connector 43" o:spid="_x0000_s1026" style="position:absolute;z-index:251553280;visibility:visible;mso-wrap-style:square;mso-wrap-distance-left:9pt;mso-wrap-distance-top:0;mso-wrap-distance-right:9pt;mso-wrap-distance-bottom:0;mso-position-horizontal:absolute;mso-position-horizontal-relative:page;mso-position-vertical:absolute;mso-position-vertical-relative:page" from="382pt,346pt" to="405pt,346pt" o:gfxdata="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" o:allowincell="f" strokeweight=".85pt">
-                <w10:wrap anchorx="page" anchory="page"/>
-              </v:line>
-            </w:pict>
-          </mc:Fallback>
-        </mc:AlternateContent>
-      </w:r>
-      <w:r>
-        <w:rPr>
-          <w:noProof/>
-        </w:rPr>
-        <mc:AlternateContent>
-          <mc:Choice Requires="wps">
-            <w:drawing>
-              <wp:anchor distT="0" distB="0" distL="114300" distR="114300" simplePos="0" relativeHeight="251540992" behindDoc="0" locked="0" layoutInCell="0" allowOverlap="1" wp14:anchorId="04DDC7ED" wp14:editId="366F8D62">
-                <wp:simplePos x="0" y="0"/>
-                <wp:positionH relativeFrom="page">
-                  <wp:posOffset>4635500</wp:posOffset>
-                </wp:positionH>
-                <wp:positionV relativeFrom="page">
-                  <wp:posOffset>4495800</wp:posOffset>
-                </wp:positionV>
-                <wp:extent cx="0" cy="1854200"/>
-                <wp:effectExtent l="76200" t="0" r="76200" b="50800"/>
-                <wp:wrapNone/>
-                <wp:docPr id="42" name="Straight Connector 42"/>
-                <wp:cNvGraphicFramePr/>
-                <a:graphic xmlns:a="http://schemas.openxmlformats.org/drawingml/2006/main">
-                  <a:graphicData uri="http://schemas.microsoft.com/office/word/2010/wordprocessingShape">
-                    <wps:wsp>
-                      <wps:cNvCnPr/>
-                      <wps:spPr>
-                        <a:xfrm>
-                          <a:off x="0" y="0"/>
-                          <a:ext cx="0" cy="1854200"/>
-                        </a:xfrm>
-                        <a:prstGeom prst="line">
-                          <a:avLst/>
-                        </a:prstGeom>
-                        <a:ln w="10795">
-                          <a:solidFill>
-                            <a:srgbClr val="000000"/>
-                          </a:solidFill>
-                          <a:headEnd type="none"/>
-                          <a:tailEnd type="triangle"/>
-                        </a:ln>
-                      </wps:spPr>
-                      <wps:style>
-                        <a:lnRef idx="1">
-                          <a:schemeClr val="accent1"/>
-                        </a:lnRef>
-                        <a:fillRef idx="0">
-                          <a:schemeClr val="accent1"/>
-                        </a:fillRef>
-                        <a:effectRef idx="0">
-                          <a:schemeClr val="accent1"/>
-                        </a:effectRef>
-                        <a:fontRef idx="minor">
-                          <a:schemeClr val="tx1"/>
-                        </a:fontRef>
-                      </wps:style>
-                      <wps:bodyPr/>
-                    </wps:wsp>
-                  </a:graphicData>
-                </a:graphic>
-              </wp:anchor>
-            </w:drawing>
-          </mc:Choice>
-          <mc:Fallback>
-            <w:pict>
-              <v:line w14:anchorId="1EA2EA03" id="Straight Connector 42" o:spid="_x0000_s1026" style="position:absolute;z-index:251540992;visibility:visible;mso-wrap-style:square;mso-wrap-distance-left:9pt;mso-wrap-distance-top:0;mso-wrap-distance-right:9pt;mso-wrap-distance-bottom:0;mso-position-horizontal:absolute;mso-position-horizontal-relative:page;mso-position-vertical:absolute;mso-position-vertical-relative:page" from="365pt,354pt" to="365pt,500pt" o:gfxdata="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" o:allowincell="f" strokeweight=".85pt">
-                <v:stroke endarrow="block"/>
-                <w10:wrap anchorx="page" anchory="page"/>
-              </v:line>
-            </w:pict>
-          </mc:Fallback>
-        </mc:AlternateContent>
-      </w:r>
-      <w:r>
-        <w:rPr>
-          <w:noProof/>
-        </w:rPr>
-        <mc:AlternateContent>
-          <mc:Choice Requires="wps">
-            <w:drawing>
-              <wp:anchor distT="0" distB="0" distL="114300" distR="114300" simplePos="0" relativeHeight="251528704" behindDoc="0" locked="0" layoutInCell="0" allowOverlap="1" wp14:anchorId="4B2378BF" wp14:editId="635362D9">
-                <wp:simplePos x="0" y="0"/>
-                <wp:positionH relativeFrom="page">
-                  <wp:posOffset>4445000</wp:posOffset>
-                </wp:positionH>
-                <wp:positionV relativeFrom="page">
-                  <wp:posOffset>4495800</wp:posOffset>
-                </wp:positionV>
-                <wp:extent cx="0" cy="965200"/>
-                <wp:effectExtent l="76200" t="38100" r="57150" b="25400"/>
-                <wp:wrapNone/>
-                <wp:docPr id="41" name="Straight Connector 41"/>
-                <wp:cNvGraphicFramePr/>
-                <a:graphic xmlns:a="http://schemas.openxmlformats.org/drawingml/2006/main">
-                  <a:graphicData uri="http://schemas.microsoft.com/office/word/2010/wordprocessingShape">
-                    <wps:wsp>
-                      <wps:cNvCnPr/>
-                      <wps:spPr>
-                        <a:xfrm flipV="1">
-                          <a:off x="0" y="0"/>
-                          <a:ext cx="0" cy="965200"/>
-                        </a:xfrm>
-                        <a:prstGeom prst="line">
-                          <a:avLst/>
-                        </a:prstGeom>
-                        <a:ln w="10795">
-                          <a:solidFill>
-                            <a:srgbClr val="000000"/>
-                          </a:solidFill>
-                          <a:headEnd type="none"/>
-                          <a:tailEnd type="triangle"/>
-                        </a:ln>
-                      </wps:spPr>
-                      <wps:style>
-                        <a:lnRef idx="1">
-                          <a:schemeClr val="accent1"/>
-                        </a:lnRef>
-                        <a:fillRef idx="0">
-                          <a:schemeClr val="accent1"/>
-                        </a:fillRef>
-                        <a:effectRef idx="0">
-                          <a:schemeClr val="accent1"/>
-                        </a:effectRef>
-                        <a:fontRef idx="minor">
-                          <a:schemeClr val="tx1"/>
-                        </a:fontRef>
-                      </wps:style>
-                      <wps:bodyPr/>
-                    </wps:wsp>
-                  </a:graphicData>
-                </a:graphic>
-              </wp:anchor>
-            </w:drawing>
-          </mc:Choice>
-          <mc:Fallback>
-            <w:pict>
-              <v:line w14:anchorId="704F97B4" id="Straight Connector 41" o:spid="_x0000_s1026" style="position:absolute;flip:y;z-index:251528704;visibility:visible;mso-wrap-style:square;mso-wrap-distance-left:9pt;mso-wrap-distance-top:0;mso-wrap-distance-right:9pt;mso-wrap-distance-bottom:0;mso-position-horizontal:absolute;mso-position-horizontal-relative:page;mso-position-vertical:absolute;mso-position-vertical-relative:page" from="350pt,354pt" to="350pt,430pt" o:gfxdata="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" o:allowincell="f" strokeweight=".85pt">
-                <v:stroke endarrow="block"/>
-                <w10:wrap anchorx="page" anchory="page"/>
-              </v:line>
-            </w:pict>
-          </mc:Fallback>
-        </mc:AlternateContent>
-      </w:r>
-      <w:r>
-        <w:rPr>
-          <w:noProof/>
-        </w:rPr>
-        <mc:AlternateContent>
-          <mc:Choice Requires="wps">
-            <w:drawing>
-              <wp:anchor distT="0" distB="0" distL="114300" distR="114300" simplePos="0" relativeHeight="251516416" behindDoc="0" locked="0" layoutInCell="0" allowOverlap="1" wp14:anchorId="210E65FD" wp14:editId="4EA580BD">
-                <wp:simplePos x="0" y="0"/>
-                <wp:positionH relativeFrom="page">
-                  <wp:posOffset>4191000</wp:posOffset>
-                </wp:positionH>
-                <wp:positionV relativeFrom="page">
-                  <wp:posOffset>5461000</wp:posOffset>
-                </wp:positionV>
-                <wp:extent cx="254000" cy="0"/>
-                <wp:effectExtent l="0" t="0" r="0" b="0"/>
-                <wp:wrapNone/>
-                <wp:docPr id="40" name="Straight Connector 40"/>
-                <wp:cNvGraphicFramePr/>
-                <a:graphic xmlns:a="http://schemas.openxmlformats.org/drawingml/2006/main">
-                  <a:graphicData uri="http://schemas.microsoft.com/office/word/2010/wordprocessingShape">
-                    <wps:wsp>
-                      <wps:cNvCnPr/>
-                      <wps:spPr>
-                        <a:xfrm>
-                          <a:off x="0" y="0"/>
-                          <a:ext cx="254000" cy="0"/>
-                        </a:xfrm>
-                        <a:prstGeom prst="line">
-                          <a:avLst/>
-                        </a:prstGeom>
-                        <a:ln w="10795">
-                          <a:solidFill>
-                            <a:srgbClr val="000000"/>
-                          </a:solidFill>
-                          <a:headEnd type="none"/>
-                          <a:tailEnd type="none"/>
-                        </a:ln>
-                      </wps:spPr>
-                      <wps:style>
-                        <a:lnRef idx="1">
-                          <a:schemeClr val="accent1"/>
-                        </a:lnRef>
-                        <a:fillRef idx="0">
-                          <a:schemeClr val="accent1"/>
-                        </a:fillRef>
-                        <a:effectRef idx="0">
-                          <a:schemeClr val="accent1"/>
-                        </a:effectRef>
-                        <a:fontRef idx="minor">
-                          <a:schemeClr val="tx1"/>
-                        </a:fontRef>
-                      </wps:style>
-                      <wps:bodyPr/>
-                    </wps:wsp>
-                  </a:graphicData>
-                </a:graphic>
-              </wp:anchor>
-            </w:drawing>
-          </mc:Choice>
-          <mc:Fallback>
-            <w:pict>
-              <v:line w14:anchorId="4FF07397" id="Straight Connector 40" o:spid="_x0000_s1026" style="position:absolute;z-index:251516416;visibility:visible;mso-wrap-style:square;mso-wrap-distance-left:9pt;mso-wrap-distance-top:0;mso-wrap-distance-right:9pt;mso-wrap-distance-bottom:0;mso-position-horizontal:absolute;mso-position-horizontal-relative:page;mso-position-vertical:absolute;mso-position-vertical-relative:page" from="330pt,430pt" to="350pt,430pt" o:gfxdata="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" o:allowincell="f" strokeweight=".85pt">
-                <w10:wrap anchorx="page" anchory="page"/>
-              </v:line>
-            </w:pict>
-          </mc:Fallback>
-        </mc:AlternateContent>
-      </w:r>
-      <w:r>
-        <w:rPr>
-          <w:noProof/>
-        </w:rPr>
-        <mc:AlternateContent>
-          <mc:Choice Requires="wps">
-            <w:drawing>
-              <wp:anchor distT="0" distB="0" distL="114300" distR="114300" simplePos="0" relativeHeight="251504128" behindDoc="0" locked="0" layoutInCell="0" allowOverlap="1" wp14:anchorId="1A2AD883" wp14:editId="10C7CB6E">
-                <wp:simplePos x="0" y="0"/>
-                <wp:positionH relativeFrom="page">
-                  <wp:posOffset>4191000</wp:posOffset>
-                </wp:positionH>
-                <wp:positionV relativeFrom="page">
-                  <wp:posOffset>5461000</wp:posOffset>
-                </wp:positionV>
-                <wp:extent cx="0" cy="889000"/>
-                <wp:effectExtent l="0" t="0" r="38100" b="25400"/>
-                <wp:wrapNone/>
-                <wp:docPr id="39" name="Straight Connector 39"/>
-                <wp:cNvGraphicFramePr/>
-                <a:graphic xmlns:a="http://schemas.openxmlformats.org/drawingml/2006/main">
-                  <a:graphicData uri="http://schemas.microsoft.com/office/word/2010/wordprocessingShape">
-                    <wps:wsp>
-                      <wps:cNvCnPr/>
-                      <wps:spPr>
-                        <a:xfrm flipV="1">
-                          <a:off x="0" y="0"/>
-                          <a:ext cx="0" cy="889000"/>
-                        </a:xfrm>
-                        <a:prstGeom prst="line">
-                          <a:avLst/>
-                        </a:prstGeom>
-                        <a:ln w="10795">
-                          <a:solidFill>
-                            <a:srgbClr val="000000"/>
-                          </a:solidFill>
-                          <a:headEnd type="none"/>
-                          <a:tailEnd type="none"/>
-                        </a:ln>
-                      </wps:spPr>
-                      <wps:style>
-                        <a:lnRef idx="1">
-                          <a:schemeClr val="accent1"/>
-                        </a:lnRef>
-                        <a:fillRef idx="0">
-                          <a:schemeClr val="accent1"/>
-                        </a:fillRef>
-                        <a:effectRef idx="0">
-                          <a:schemeClr val="accent1"/>
-                        </a:effectRef>
-                        <a:fontRef idx="minor">
-                          <a:schemeClr val="tx1"/>
-                        </a:fontRef>
-                      </wps:style>
-                      <wps:bodyPr/>
-                    </wps:wsp>
-                  </a:graphicData>
-                </a:graphic>
-              </wp:anchor>
-            </w:drawing>
-          </mc:Choice>
-          <mc:Fallback>
-            <w:pict>
-              <v:line w14:anchorId="093DA06C" id="Straight Connector 39" o:spid="_x0000_s1026" style="position:absolute;flip:y;z-index:251504128;visibility:visible;mso-wrap-style:square;mso-wrap-distance-left:9pt;mso-wrap-distance-top:0;mso-wrap-distance-right:9pt;mso-wrap-distance-bottom:0;mso-position-horizontal:absolute;mso-position-horizontal-relative:page;mso-position-vertical:absolute;mso-position-vertical-relative:page" from="330pt,430pt" to="330pt,500pt" o:gfxdata="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" o:allowincell="f" strokeweight=".85pt">
-                <w10:wrap anchorx="page" anchory="page"/>
-              </v:line>
-            </w:pict>
-          </mc:Fallback>
-        </mc:AlternateContent>
-      </w:r>
-      <w:r>
-        <w:rPr>
-          <w:noProof/>
-        </w:rPr>
-        <mc:AlternateContent>
-          <mc:Choice Requires="wps">
-            <w:drawing>
-              <wp:anchor distT="0" distB="0" distL="114300" distR="114300" simplePos="0" relativeHeight="251491840" behindDoc="0" locked="0" layoutInCell="0" allowOverlap="1" wp14:anchorId="54C5F976" wp14:editId="1413CDCC">
+              <wp:anchor distT="0" distB="0" distL="114300" distR="114300" simplePos="0" relativeHeight="251491840" behindDoc="0" locked="0" layoutInCell="0" allowOverlap="1" wp14:anchorId="54C5F976" wp14:editId="411C1D04">
                 <wp:simplePos x="0" y="0"/>
                 <wp:positionH relativeFrom="page">
                   <wp:posOffset>3708400</wp:posOffset>
@@ -3206,7 +2769,7 @@
           </mc:Choice>
           <mc:Fallback>
             <w:pict>
-              <v:line w14:anchorId="5B8C1A25" id="Straight Connector 38" o:spid="_x0000_s1026" style="position:absolute;flip:y;z-index:251491840;visibility:visible;mso-wrap-style:square;mso-wrap-distance-left:9pt;mso-wrap-distance-top:0;mso-wrap-distance-right:9pt;mso-wrap-distance-bottom:0;mso-position-horizontal:absolute;mso-position-horizontal-relative:page;mso-position-vertical:absolute;mso-position-vertical-relative:page" from="292pt,354pt" to="292pt,500pt" o:gfxdata="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" o:allowincell="f" strokeweight=".85pt">
+              <v:line w14:anchorId="2BC677C7" id="Straight Connector 38" o:spid="_x0000_s1026" style="position:absolute;flip:y;z-index:251491840;visibility:visible;mso-wrap-style:square;mso-wrap-distance-left:9pt;mso-wrap-distance-top:0;mso-wrap-distance-right:9pt;mso-wrap-distance-bottom:0;mso-position-horizontal:absolute;mso-position-horizontal-relative:page;mso-position-vertical:absolute;mso-position-vertical-relative:page" from="292pt,354pt" to="292pt,500pt" o:gfxdata="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" o:allowincell="f" strokeweight=".85pt">
                 <v:stroke endarrow="block"/>
                 <w10:wrap anchorx="page" anchory="page"/>
               </v:line>
@@ -3277,7 +2840,7 @@
           </mc:Choice>
           <mc:Fallback>
             <w:pict>
-              <v:line w14:anchorId="4DB11B68" id="Straight Connector 37" o:spid="_x0000_s1026" style="position:absolute;flip:y;z-index:251479552;visibility:visible;mso-wrap-style:square;mso-wrap-distance-left:9pt;mso-wrap-distance-top:0;mso-wrap-distance-right:9pt;mso-wrap-distance-bottom:0;mso-position-horizontal:absolute;mso-position-horizontal-relative:page;mso-position-vertical:absolute;mso-position-vertical-relative:page" from="270pt,354pt" to="270pt,452pt" o:gfxdata="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" o:allowincell="f" strokeweight=".85pt">
+              <v:line w14:anchorId="79E23DD8" id="Straight Connector 37" o:spid="_x0000_s1026" style="position:absolute;flip:y;z-index:251479552;visibility:visible;mso-wrap-style:square;mso-wrap-distance-left:9pt;mso-wrap-distance-top:0;mso-wrap-distance-right:9pt;mso-wrap-distance-bottom:0;mso-position-horizontal:absolute;mso-position-horizontal-relative:page;mso-position-vertical:absolute;mso-position-vertical-relative:page" from="270pt,354pt" to="270pt,452pt" o:gfxdata="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" o:allowincell="f" strokeweight=".85pt">
                 <v:stroke endarrow="block"/>
                 <w10:wrap anchorx="page" anchory="page"/>
               </v:line>
@@ -3348,7 +2911,7 @@
           </mc:Choice>
           <mc:Fallback>
             <w:pict>
-              <v:line w14:anchorId="361AA0B3" id="Straight Connector 36" o:spid="_x0000_s1026" style="position:absolute;z-index:251467264;visibility:visible;mso-wrap-style:square;mso-wrap-distance-left:9pt;mso-wrap-distance-top:0;mso-wrap-distance-right:9pt;mso-wrap-distance-bottom:0;mso-position-horizontal:absolute;mso-position-horizontal-relative:page;mso-position-vertical:absolute;mso-position-vertical-relative:page" from="255pt,452pt" to="270pt,452pt" o:gfxdata="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" o:allowincell="f" strokeweight=".85pt">
+              <v:line w14:anchorId="65A767FD" id="Straight Connector 36" o:spid="_x0000_s1026" style="position:absolute;z-index:251467264;visibility:visible;mso-wrap-style:square;mso-wrap-distance-left:9pt;mso-wrap-distance-top:0;mso-wrap-distance-right:9pt;mso-wrap-distance-bottom:0;mso-position-horizontal:absolute;mso-position-horizontal-relative:page;mso-position-vertical:absolute;mso-position-vertical-relative:page" from="255pt,452pt" to="270pt,452pt" o:gfxdata="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" o:allowincell="f" strokeweight=".85pt">
                 <w10:wrap anchorx="page" anchory="page"/>
               </v:line>
             </w:pict>
@@ -3418,7 +2981,7 @@
           </mc:Choice>
           <mc:Fallback>
             <w:pict>
-              <v:line w14:anchorId="7E7D7762" id="Straight Connector 35" o:spid="_x0000_s1026" style="position:absolute;flip:y;z-index:251454976;visibility:visible;mso-wrap-style:square;mso-wrap-distance-left:9pt;mso-wrap-distance-top:0;mso-wrap-distance-right:9pt;mso-wrap-distance-bottom:0;mso-position-horizontal:absolute;mso-position-horizontal-relative:page;mso-position-vertical:absolute;mso-position-vertical-relative:page" from="255pt,452pt" to="255pt,500pt" o:gfxdata="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" o:allowincell="f" strokeweight=".85pt">
+              <v:line w14:anchorId="741B0C87" id="Straight Connector 35" o:spid="_x0000_s1026" style="position:absolute;flip:y;z-index:251454976;visibility:visible;mso-wrap-style:square;mso-wrap-distance-left:9pt;mso-wrap-distance-top:0;mso-wrap-distance-right:9pt;mso-wrap-distance-bottom:0;mso-position-horizontal:absolute;mso-position-horizontal-relative:page;mso-position-vertical:absolute;mso-position-vertical-relative:page" from="255pt,452pt" to="255pt,500pt" o:gfxdata="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" o:allowincell="f" strokeweight=".85pt">
                 <w10:wrap anchorx="page" anchory="page"/>
               </v:line>
             </w:pict>
@@ -3488,7 +3051,7 @@
           </mc:Choice>
           <mc:Fallback>
             <w:pict>
-              <v:line w14:anchorId="332BE4B4" id="Straight Connector 34" o:spid="_x0000_s1026" style="position:absolute;flip:y;z-index:251442688;visibility:visible;mso-wrap-style:square;mso-wrap-distance-left:9pt;mso-wrap-distance-top:0;mso-wrap-distance-right:9pt;mso-wrap-distance-bottom:0;mso-position-horizontal:absolute;mso-position-horizontal-relative:page;mso-position-vertical:absolute;mso-position-vertical-relative:page" from="510pt,3in" to="510pt,340pt" o:gfxdata="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" o:allowincell="f" strokeweight=".85pt">
+              <v:line w14:anchorId="7CDBAE7F" id="Straight Connector 34" o:spid="_x0000_s1026" style="position:absolute;flip:y;z-index:251442688;visibility:visible;mso-wrap-style:square;mso-wrap-distance-left:9pt;mso-wrap-distance-top:0;mso-wrap-distance-right:9pt;mso-wrap-distance-bottom:0;mso-position-horizontal:absolute;mso-position-horizontal-relative:page;mso-position-vertical:absolute;mso-position-vertical-relative:page" from="510pt,3in" to="510pt,340pt" o:gfxdata="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" o:allowincell="f" strokeweight=".85pt">
                 <v:stroke endarrow="block"/>
                 <w10:wrap anchorx="page" anchory="page"/>
               </v:line>
@@ -3559,7 +3122,7 @@
           </mc:Choice>
           <mc:Fallback>
             <w:pict>
-              <v:line w14:anchorId="2E04E839" id="Straight Connector 33" o:spid="_x0000_s1026" style="position:absolute;z-index:251430400;visibility:visible;mso-wrap-style:square;mso-wrap-distance-left:9pt;mso-wrap-distance-top:0;mso-wrap-distance-right:9pt;mso-wrap-distance-bottom:0;mso-position-horizontal:absolute;mso-position-horizontal-relative:page;mso-position-vertical:absolute;mso-position-vertical-relative:page" from="382pt,340pt" to="510pt,340pt" o:gfxdata="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" o:allowincell="f" strokeweight=".85pt">
+              <v:line w14:anchorId="6361FB1D" id="Straight Connector 33" o:spid="_x0000_s1026" style="position:absolute;z-index:251430400;visibility:visible;mso-wrap-style:square;mso-wrap-distance-left:9pt;mso-wrap-distance-top:0;mso-wrap-distance-right:9pt;mso-wrap-distance-bottom:0;mso-position-horizontal:absolute;mso-position-horizontal-relative:page;mso-position-vertical:absolute;mso-position-vertical-relative:page" from="382pt,340pt" to="510pt,340pt" o:gfxdata="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" o:allowincell="f" strokeweight=".85pt">
                 <w10:wrap anchorx="page" anchory="page"/>
               </v:line>
             </w:pict>
@@ -3629,7 +3192,7 @@
           </mc:Choice>
           <mc:Fallback>
             <w:pict>
-              <v:line w14:anchorId="14F97355" id="Straight Connector 32" o:spid="_x0000_s1026" style="position:absolute;flip:x;z-index:251418112;visibility:visible;mso-wrap-style:square;mso-wrap-distance-left:9pt;mso-wrap-distance-top:0;mso-wrap-distance-right:9pt;mso-wrap-distance-bottom:0;mso-position-horizontal:absolute;mso-position-horizontal-relative:page;mso-position-vertical:absolute;mso-position-vertical-relative:page" from="382pt,320pt" to="398pt,320pt" o:gfxdata="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" o:allowincell="f" strokeweight=".85pt">
+              <v:line w14:anchorId="2D12CEDF" id="Straight Connector 32" o:spid="_x0000_s1026" style="position:absolute;flip:x;z-index:251418112;visibility:visible;mso-wrap-style:square;mso-wrap-distance-left:9pt;mso-wrap-distance-top:0;mso-wrap-distance-right:9pt;mso-wrap-distance-bottom:0;mso-position-horizontal:absolute;mso-position-horizontal-relative:page;mso-position-vertical:absolute;mso-position-vertical-relative:page" from="382pt,320pt" to="398pt,320pt" o:gfxdata="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" o:allowincell="f" strokeweight=".85pt">
                 <v:stroke endarrow="block"/>
                 <w10:wrap anchorx="page" anchory="page"/>
               </v:line>
@@ -3700,7 +3263,7 @@
           </mc:Choice>
           <mc:Fallback>
             <w:pict>
-              <v:line w14:anchorId="6AA9B875" id="Straight Connector 31" o:spid="_x0000_s1026" style="position:absolute;z-index:251405824;visibility:visible;mso-wrap-style:square;mso-wrap-distance-left:9pt;mso-wrap-distance-top:0;mso-wrap-distance-right:9pt;mso-wrap-distance-bottom:0;mso-position-horizontal:absolute;mso-position-horizontal-relative:page;mso-position-vertical:absolute;mso-position-vertical-relative:page" from="398pt,258pt" to="398pt,320pt" o:gfxdata="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" o:allowincell="f" strokeweight=".85pt">
+              <v:line w14:anchorId="711329BE" id="Straight Connector 31" o:spid="_x0000_s1026" style="position:absolute;z-index:251405824;visibility:visible;mso-wrap-style:square;mso-wrap-distance-left:9pt;mso-wrap-distance-top:0;mso-wrap-distance-right:9pt;mso-wrap-distance-bottom:0;mso-position-horizontal:absolute;mso-position-horizontal-relative:page;mso-position-vertical:absolute;mso-position-vertical-relative:page" from="398pt,258pt" to="398pt,320pt" o:gfxdata="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" o:allowincell="f" strokeweight=".85pt">
                 <w10:wrap anchorx="page" anchory="page"/>
               </v:line>
             </w:pict>
@@ -3770,7 +3333,7 @@
           </mc:Choice>
           <mc:Fallback>
             <w:pict>
-              <v:line w14:anchorId="283A03EB" id="Straight Connector 30" o:spid="_x0000_s1026" style="position:absolute;flip:x;z-index:251393536;visibility:visible;mso-wrap-style:square;mso-wrap-distance-left:9pt;mso-wrap-distance-top:0;mso-wrap-distance-right:9pt;mso-wrap-distance-bottom:0;mso-position-horizontal:absolute;mso-position-horizontal-relative:page;mso-position-vertical:absolute;mso-position-vertical-relative:page" from="398pt,258pt" to="478pt,258pt" o:gfxdata="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" o:allowincell="f" strokeweight=".85pt">
+              <v:line w14:anchorId="015F044B" id="Straight Connector 30" o:spid="_x0000_s1026" style="position:absolute;flip:x;z-index:251393536;visibility:visible;mso-wrap-style:square;mso-wrap-distance-left:9pt;mso-wrap-distance-top:0;mso-wrap-distance-right:9pt;mso-wrap-distance-bottom:0;mso-position-horizontal:absolute;mso-position-horizontal-relative:page;mso-position-vertical:absolute;mso-position-vertical-relative:page" from="398pt,258pt" to="478pt,258pt" o:gfxdata="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" o:allowincell="f" strokeweight=".85pt">
                 <w10:wrap anchorx="page" anchory="page"/>
               </v:line>
             </w:pict>
@@ -3840,7 +3403,7 @@
           </mc:Choice>
           <mc:Fallback>
             <w:pict>
-              <v:line w14:anchorId="2CA25E18" id="Straight Connector 29" o:spid="_x0000_s1026" style="position:absolute;z-index:251381248;visibility:visible;mso-wrap-style:square;mso-wrap-distance-left:9pt;mso-wrap-distance-top:0;mso-wrap-distance-right:9pt;mso-wrap-distance-bottom:0;mso-position-horizontal:absolute;mso-position-horizontal-relative:page;mso-position-vertical:absolute;mso-position-vertical-relative:page" from="478pt,3in" to="478pt,258pt" o:gfxdata="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" o:allowincell="f" strokeweight=".85pt">
+              <v:line w14:anchorId="1F7C3F8D" id="Straight Connector 29" o:spid="_x0000_s1026" style="position:absolute;z-index:251381248;visibility:visible;mso-wrap-style:square;mso-wrap-distance-left:9pt;mso-wrap-distance-top:0;mso-wrap-distance-right:9pt;mso-wrap-distance-bottom:0;mso-position-horizontal:absolute;mso-position-horizontal-relative:page;mso-position-vertical:absolute;mso-position-vertical-relative:page" from="478pt,3in" to="478pt,258pt" o:gfxdata="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" o:allowincell="f" strokeweight=".85pt">
                 <w10:wrap anchorx="page" anchory="page"/>
               </v:line>
             </w:pict>
@@ -3910,7 +3473,7 @@
           </mc:Choice>
           <mc:Fallback>
             <w:pict>
-              <v:line w14:anchorId="74971BF8" id="Straight Connector 25" o:spid="_x0000_s1026" style="position:absolute;z-index:251304448;visibility:visible;mso-wrap-style:square;mso-wrap-distance-left:9pt;mso-wrap-distance-top:0;mso-wrap-distance-right:9pt;mso-wrap-distance-bottom:0;mso-position-horizontal:absolute;mso-position-horizontal-relative:page;mso-position-vertical:absolute;mso-position-vertical-relative:page" from="438pt,3in" to="438pt,236pt" o:gfxdata="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" o:allowincell="f" strokeweight=".85pt">
+              <v:line w14:anchorId="709BB2DB" id="Straight Connector 25" o:spid="_x0000_s1026" style="position:absolute;z-index:251304448;visibility:visible;mso-wrap-style:square;mso-wrap-distance-left:9pt;mso-wrap-distance-top:0;mso-wrap-distance-right:9pt;mso-wrap-distance-bottom:0;mso-position-horizontal:absolute;mso-position-horizontal-relative:page;mso-position-vertical:absolute;mso-position-vertical-relative:page" from="438pt,3in" to="438pt,236pt" o:gfxdata="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" o:allowincell="f" strokeweight=".85pt">
                 <w10:wrap anchorx="page" anchory="page"/>
               </v:line>
             </w:pict>
@@ -3980,7 +3543,7 @@
           </mc:Choice>
           <mc:Fallback>
             <w:pict>
-              <v:line w14:anchorId="54EF84F3" id="Straight Connector 24" o:spid="_x0000_s1026" style="position:absolute;z-index:251296256;visibility:visible;mso-wrap-style:square;mso-wrap-distance-left:9pt;mso-wrap-distance-top:0;mso-wrap-distance-right:9pt;mso-wrap-distance-bottom:0;mso-position-horizontal:absolute;mso-position-horizontal-relative:page;mso-position-vertical:absolute;mso-position-vertical-relative:page" from="5in,178pt" to="5in,286pt" o:gfxdata="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" o:allowincell="f" strokeweight=".85pt">
+              <v:line w14:anchorId="7AED7270" id="Straight Connector 24" o:spid="_x0000_s1026" style="position:absolute;z-index:251296256;visibility:visible;mso-wrap-style:square;mso-wrap-distance-left:9pt;mso-wrap-distance-top:0;mso-wrap-distance-right:9pt;mso-wrap-distance-bottom:0;mso-position-horizontal:absolute;mso-position-horizontal-relative:page;mso-position-vertical:absolute;mso-position-vertical-relative:page" from="5in,178pt" to="5in,286pt" o:gfxdata="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" o:allowincell="f" strokeweight=".85pt">
                 <v:stroke endarrow="block"/>
                 <w10:wrap anchorx="page" anchory="page"/>
               </v:line>
@@ -4051,7 +3614,7 @@
           </mc:Choice>
           <mc:Fallback>
             <w:pict>
-              <v:line w14:anchorId="4D66168B" id="Straight Connector 23" o:spid="_x0000_s1026" style="position:absolute;flip:x;z-index:251288064;visibility:visible;mso-wrap-style:square;mso-wrap-distance-left:9pt;mso-wrap-distance-top:0;mso-wrap-distance-right:9pt;mso-wrap-distance-bottom:0;mso-position-horizontal:absolute;mso-position-horizontal-relative:page;mso-position-vertical:absolute;mso-position-vertical-relative:page" from="5in,178pt" to="414pt,178pt" o:gfxdata="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" o:allowincell="f" strokeweight=".85pt">
+              <v:line w14:anchorId="438BDC09" id="Straight Connector 23" o:spid="_x0000_s1026" style="position:absolute;flip:x;z-index:251288064;visibility:visible;mso-wrap-style:square;mso-wrap-distance-left:9pt;mso-wrap-distance-top:0;mso-wrap-distance-right:9pt;mso-wrap-distance-bottom:0;mso-position-horizontal:absolute;mso-position-horizontal-relative:page;mso-position-vertical:absolute;mso-position-vertical-relative:page" from="5in,178pt" to="414pt,178pt" o:gfxdata="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" o:allowincell="f" strokeweight=".85pt">
                 <w10:wrap anchorx="page" anchory="page"/>
               </v:line>
             </w:pict>
@@ -4121,7 +3684,7 @@
           </mc:Choice>
           <mc:Fallback>
             <w:pict>
-              <v:line w14:anchorId="2BA54F95" id="Straight Connector 22" o:spid="_x0000_s1026" style="position:absolute;flip:x;z-index:251279872;visibility:visible;mso-wrap-style:square;mso-wrap-distance-left:9pt;mso-wrap-distance-top:0;mso-wrap-distance-right:9pt;mso-wrap-distance-bottom:0;mso-position-horizontal:absolute;mso-position-horizontal-relative:page;mso-position-vertical:absolute;mso-position-vertical-relative:page" from="90pt,206pt" to="108pt,206pt" o:gfxdata="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" o:allowincell="f" strokeweight=".85pt">
+              <v:line w14:anchorId="1FBFD342" id="Straight Connector 22" o:spid="_x0000_s1026" style="position:absolute;flip:x;z-index:251279872;visibility:visible;mso-wrap-style:square;mso-wrap-distance-left:9pt;mso-wrap-distance-top:0;mso-wrap-distance-right:9pt;mso-wrap-distance-bottom:0;mso-position-horizontal:absolute;mso-position-horizontal-relative:page;mso-position-vertical:absolute;mso-position-vertical-relative:page" from="90pt,206pt" to="108pt,206pt" o:gfxdata="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" o:allowincell="f" strokeweight=".85pt">
                 <v:stroke endarrow="block"/>
                 <w10:wrap anchorx="page" anchory="page"/>
               </v:line>
@@ -4192,7 +3755,7 @@
           </mc:Choice>
           <mc:Fallback>
             <w:pict>
-              <v:line w14:anchorId="346912A3" id="Straight Connector 21" o:spid="_x0000_s1026" style="position:absolute;flip:y;z-index:251271680;visibility:visible;mso-wrap-style:square;mso-wrap-distance-left:9pt;mso-wrap-distance-top:0;mso-wrap-distance-right:9pt;mso-wrap-distance-bottom:0;mso-position-horizontal:absolute;mso-position-horizontal-relative:page;mso-position-vertical:absolute;mso-position-vertical-relative:page" from="108pt,206pt" to="108pt,347pt" o:gfxdata="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" o:allowincell="f" strokeweight=".85pt">
+              <v:line w14:anchorId="625A02F5" id="Straight Connector 21" o:spid="_x0000_s1026" style="position:absolute;flip:y;z-index:251271680;visibility:visible;mso-wrap-style:square;mso-wrap-distance-left:9pt;mso-wrap-distance-top:0;mso-wrap-distance-right:9pt;mso-wrap-distance-bottom:0;mso-position-horizontal:absolute;mso-position-horizontal-relative:page;mso-position-vertical:absolute;mso-position-vertical-relative:page" from="108pt,206pt" to="108pt,347pt" o:gfxdata="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" o:allowincell="f" strokeweight=".85pt">
                 <w10:wrap anchorx="page" anchory="page"/>
               </v:line>
             </w:pict>
@@ -4262,7 +3825,7 @@
           </mc:Choice>
           <mc:Fallback>
             <w:pict>
-              <v:line w14:anchorId="3B275BAE" id="Straight Connector 20" o:spid="_x0000_s1026" style="position:absolute;flip:x;z-index:251263488;visibility:visible;mso-wrap-style:square;mso-wrap-distance-left:9pt;mso-wrap-distance-top:0;mso-wrap-distance-right:9pt;mso-wrap-distance-bottom:0;mso-position-horizontal:absolute;mso-position-horizontal-relative:page;mso-position-vertical:absolute;mso-position-vertical-relative:page" from="108pt,347pt" to="244pt,347pt" o:gfxdata="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" o:allowincell="f" strokeweight=".85pt">
+              <v:line w14:anchorId="0A10CCAC" id="Straight Connector 20" o:spid="_x0000_s1026" style="position:absolute;flip:x;z-index:251263488;visibility:visible;mso-wrap-style:square;mso-wrap-distance-left:9pt;mso-wrap-distance-top:0;mso-wrap-distance-right:9pt;mso-wrap-distance-bottom:0;mso-position-horizontal:absolute;mso-position-horizontal-relative:page;mso-position-vertical:absolute;mso-position-vertical-relative:page" from="108pt,347pt" to="244pt,347pt" o:gfxdata="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" o:allowincell="f" strokeweight=".85pt">
                 <w10:wrap anchorx="page" anchory="page"/>
               </v:line>
             </w:pict>
@@ -4332,7 +3895,7 @@
           </mc:Choice>
           <mc:Fallback>
             <w:pict>
-              <v:line w14:anchorId="077FFAC6" id="Straight Connector 19" o:spid="_x0000_s1026" style="position:absolute;flip:y;z-index:251255296;visibility:visible;mso-wrap-style:square;mso-wrap-distance-left:9pt;mso-wrap-distance-top:0;mso-wrap-distance-right:9pt;mso-wrap-distance-bottom:0;mso-position-horizontal:absolute;mso-position-horizontal-relative:page;mso-position-vertical:absolute;mso-position-vertical-relative:page" from="140pt,206pt" to="140pt,331pt" o:gfxdata="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" o:allowincell="f" strokeweight=".85pt">
+              <v:line w14:anchorId="1D4B3FFC" id="Straight Connector 19" o:spid="_x0000_s1026" style="position:absolute;flip:y;z-index:251255296;visibility:visible;mso-wrap-style:square;mso-wrap-distance-left:9pt;mso-wrap-distance-top:0;mso-wrap-distance-right:9pt;mso-wrap-distance-bottom:0;mso-position-horizontal:absolute;mso-position-horizontal-relative:page;mso-position-vertical:absolute;mso-position-vertical-relative:page" from="140pt,206pt" to="140pt,331pt" o:gfxdata="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" o:allowincell="f" strokeweight=".85pt">
                 <v:stroke endarrow="block"/>
                 <w10:wrap anchorx="page" anchory="page"/>
               </v:line>
@@ -4403,7 +3966,7 @@
           </mc:Choice>
           <mc:Fallback>
             <w:pict>
-              <v:line w14:anchorId="7DBA8585" id="Straight Connector 18" o:spid="_x0000_s1026" style="position:absolute;flip:x;z-index:251247104;visibility:visible;mso-wrap-style:square;mso-wrap-distance-left:9pt;mso-wrap-distance-top:0;mso-wrap-distance-right:9pt;mso-wrap-distance-bottom:0;mso-position-horizontal:absolute;mso-position-horizontal-relative:page;mso-position-vertical:absolute;mso-position-vertical-relative:page" from="140pt,331pt" to="244pt,331pt" o:gfxdata="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" o:allowincell="f" strokeweight=".85pt">
+              <v:line w14:anchorId="60BD3A57" id="Straight Connector 18" o:spid="_x0000_s1026" style="position:absolute;flip:x;z-index:251247104;visibility:visible;mso-wrap-style:square;mso-wrap-distance-left:9pt;mso-wrap-distance-top:0;mso-wrap-distance-right:9pt;mso-wrap-distance-bottom:0;mso-position-horizontal:absolute;mso-position-horizontal-relative:page;mso-position-vertical:absolute;mso-position-vertical-relative:page" from="140pt,331pt" to="244pt,331pt" o:gfxdata="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" o:allowincell="f" strokeweight=".85pt">
                 <w10:wrap anchorx="page" anchory="page"/>
               </v:line>
             </w:pict>
@@ -4473,7 +4036,7 @@
           </mc:Choice>
           <mc:Fallback>
             <w:pict>
-              <v:line w14:anchorId="0F91E393" id="Straight Connector 17" o:spid="_x0000_s1026" style="position:absolute;flip:y;z-index:251238912;visibility:visible;mso-wrap-style:square;mso-wrap-distance-left:9pt;mso-wrap-distance-top:0;mso-wrap-distance-right:9pt;mso-wrap-distance-bottom:0;mso-position-horizontal:absolute;mso-position-horizontal-relative:page;mso-position-vertical:absolute;mso-position-vertical-relative:page" from="170pt,206pt" to="170pt,315pt" o:gfxdata="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" o:allowincell="f" strokeweight=".85pt">
+              <v:line w14:anchorId="6D0593C6" id="Straight Connector 17" o:spid="_x0000_s1026" style="position:absolute;flip:y;z-index:251238912;visibility:visible;mso-wrap-style:square;mso-wrap-distance-left:9pt;mso-wrap-distance-top:0;mso-wrap-distance-right:9pt;mso-wrap-distance-bottom:0;mso-position-horizontal:absolute;mso-position-horizontal-relative:page;mso-position-vertical:absolute;mso-position-vertical-relative:page" from="170pt,206pt" to="170pt,315pt" o:gfxdata="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" o:allowincell="f" strokeweight=".85pt">
                 <v:stroke endarrow="block"/>
                 <w10:wrap anchorx="page" anchory="page"/>
               </v:line>
@@ -4544,7 +4107,7 @@
           </mc:Choice>
           <mc:Fallback>
             <w:pict>
-              <v:line w14:anchorId="1FDD6FEF" id="Straight Connector 16" o:spid="_x0000_s1026" style="position:absolute;flip:x;z-index:251230720;visibility:visible;mso-wrap-style:square;mso-wrap-distance-left:9pt;mso-wrap-distance-top:0;mso-wrap-distance-right:9pt;mso-wrap-distance-bottom:0;mso-position-horizontal:absolute;mso-position-horizontal-relative:page;mso-position-vertical:absolute;mso-position-vertical-relative:page" from="170pt,315pt" to="244pt,315pt" o:gfxdata="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" o:allowincell="f" strokeweight=".85pt">
+              <v:line w14:anchorId="130190D4" id="Straight Connector 16" o:spid="_x0000_s1026" style="position:absolute;flip:x;z-index:251230720;visibility:visible;mso-wrap-style:square;mso-wrap-distance-left:9pt;mso-wrap-distance-top:0;mso-wrap-distance-right:9pt;mso-wrap-distance-bottom:0;mso-position-horizontal:absolute;mso-position-horizontal-relative:page;mso-position-vertical:absolute;mso-position-vertical-relative:page" from="170pt,315pt" to="244pt,315pt" o:gfxdata="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" o:allowincell="f" strokeweight=".85pt">
                 <w10:wrap anchorx="page" anchory="page"/>
               </v:line>
             </w:pict>
@@ -4614,7 +4177,7 @@
           </mc:Choice>
           <mc:Fallback>
             <w:pict>
-              <v:line w14:anchorId="07FF9D37" id="Straight Connector 13" o:spid="_x0000_s1026" style="position:absolute;flip:y;z-index:251173376;visibility:visible;mso-wrap-style:square;mso-wrap-distance-left:9pt;mso-wrap-distance-top:0;mso-wrap-distance-right:9pt;mso-wrap-distance-bottom:0;mso-position-horizontal:absolute;mso-position-horizontal-relative:page;mso-position-vertical:absolute;mso-position-vertical-relative:page" from="160pt,152pt" to="160pt,172pt" o:gfxdata="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" o:allowincell="f" strokeweight=".85pt">
+              <v:line w14:anchorId="2FF5E8E9" id="Straight Connector 13" o:spid="_x0000_s1026" style="position:absolute;flip:y;z-index:251173376;visibility:visible;mso-wrap-style:square;mso-wrap-distance-left:9pt;mso-wrap-distance-top:0;mso-wrap-distance-right:9pt;mso-wrap-distance-bottom:0;mso-position-horizontal:absolute;mso-position-horizontal-relative:page;mso-position-vertical:absolute;mso-position-vertical-relative:page" from="160pt,152pt" to="160pt,172pt" o:gfxdata="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" o:allowincell="f" strokeweight=".85pt">
                 <w10:wrap anchorx="page" anchory="page"/>
               </v:line>
             </w:pict>
@@ -4684,7 +4247,7 @@
           </mc:Choice>
           <mc:Fallback>
             <w:pict>
-              <v:line w14:anchorId="763F6846" id="Straight Connector 12" o:spid="_x0000_s1026" style="position:absolute;z-index:251169280;visibility:visible;mso-wrap-style:square;mso-wrap-distance-left:9pt;mso-wrap-distance-top:0;mso-wrap-distance-right:9pt;mso-wrap-distance-bottom:0;mso-position-horizontal:absolute;mso-position-horizontal-relative:page;mso-position-vertical:absolute;mso-position-vertical-relative:page" from="305pt,132pt" to="305pt,286pt" o:gfxdata="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" o:allowincell="f" strokeweight=".85pt">
+              <v:line w14:anchorId="012BA85F" id="Straight Connector 12" o:spid="_x0000_s1026" style="position:absolute;z-index:251169280;visibility:visible;mso-wrap-style:square;mso-wrap-distance-left:9pt;mso-wrap-distance-top:0;mso-wrap-distance-right:9pt;mso-wrap-distance-bottom:0;mso-position-horizontal:absolute;mso-position-horizontal-relative:page;mso-position-vertical:absolute;mso-position-vertical-relative:page" from="305pt,132pt" to="305pt,286pt" o:gfxdata="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" o:allowincell="f" strokeweight=".85pt">
                 <v:stroke endarrow="block"/>
                 <w10:wrap anchorx="page" anchory="page"/>
               </v:line>
@@ -4755,7 +4318,7 @@
           </mc:Choice>
           <mc:Fallback>
             <w:pict>
-              <v:line w14:anchorId="59E1643D" id="Straight Connector 11" o:spid="_x0000_s1026" style="position:absolute;z-index:251165184;visibility:visible;mso-wrap-style:square;mso-wrap-distance-left:9pt;mso-wrap-distance-top:0;mso-wrap-distance-right:9pt;mso-wrap-distance-bottom:0;mso-position-horizontal:absolute;mso-position-horizontal-relative:page;mso-position-vertical:absolute;mso-position-vertical-relative:page" from="136pt,132pt" to="305pt,132pt" o:gfxdata="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" o:allowincell="f" strokeweight=".85pt">
+              <v:line w14:anchorId="5DE60545" id="Straight Connector 11" o:spid="_x0000_s1026" style="position:absolute;z-index:251165184;visibility:visible;mso-wrap-style:square;mso-wrap-distance-left:9pt;mso-wrap-distance-top:0;mso-wrap-distance-right:9pt;mso-wrap-distance-bottom:0;mso-position-horizontal:absolute;mso-position-horizontal-relative:page;mso-position-vertical:absolute;mso-position-vertical-relative:page" from="136pt,132pt" to="305pt,132pt" o:gfxdata="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" o:allowincell="f" strokeweight=".85pt">
                 <w10:wrap anchorx="page" anchory="page"/>
               </v:line>
             </w:pict>
@@ -4825,7 +4388,7 @@
           </mc:Choice>
           <mc:Fallback>
             <w:pict>
-              <v:line w14:anchorId="248FC064" id="Straight Connector 10" o:spid="_x0000_s1026" style="position:absolute;flip:y;z-index:251161088;visibility:visible;mso-wrap-style:square;mso-wrap-distance-left:9pt;mso-wrap-distance-top:0;mso-wrap-distance-right:9pt;mso-wrap-distance-bottom:0;mso-position-horizontal:absolute;mso-position-horizontal-relative:page;mso-position-vertical:absolute;mso-position-vertical-relative:page" from="136pt,132pt" to="136pt,172pt" o:gfxdata="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" o:allowincell="f" strokeweight=".85pt">
+              <v:line w14:anchorId="54F17A88" id="Straight Connector 10" o:spid="_x0000_s1026" style="position:absolute;flip:y;z-index:251161088;visibility:visible;mso-wrap-style:square;mso-wrap-distance-left:9pt;mso-wrap-distance-top:0;mso-wrap-distance-right:9pt;mso-wrap-distance-bottom:0;mso-position-horizontal:absolute;mso-position-horizontal-relative:page;mso-position-vertical:absolute;mso-position-vertical-relative:page" from="136pt,132pt" to="136pt,172pt" o:gfxdata="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" o:allowincell="f" strokeweight=".85pt">
                 <w10:wrap anchorx="page" anchory="page"/>
               </v:line>
             </w:pict>
@@ -4895,7 +4458,7 @@
           </mc:Choice>
           <mc:Fallback>
             <w:pict>
-              <v:line w14:anchorId="13C1067E" id="Straight Connector 7" o:spid="_x0000_s1026" style="position:absolute;flip:y;z-index:251665408;visibility:visible;mso-wrap-style:square;mso-wrap-distance-left:9pt;mso-wrap-distance-top:0;mso-wrap-distance-right:9pt;mso-wrap-distance-bottom:0;mso-position-horizontal:absolute;mso-position-horizontal-relative:page;mso-position-vertical:absolute;mso-position-vertical-relative:page" from="112pt,112pt" to="112pt,172pt" o:gfxdata="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" o:allowincell="f" strokeweight=".85pt">
+              <v:line w14:anchorId="0920C2DF" id="Straight Connector 7" o:spid="_x0000_s1026" style="position:absolute;flip:y;z-index:251665408;visibility:visible;mso-wrap-style:square;mso-wrap-distance-left:9pt;mso-wrap-distance-top:0;mso-wrap-distance-right:9pt;mso-wrap-distance-bottom:0;mso-position-horizontal:absolute;mso-position-horizontal-relative:page;mso-position-vertical:absolute;mso-position-vertical-relative:page" from="112pt,112pt" to="112pt,172pt" o:gfxdata="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" o:allowincell="f" strokeweight=".85pt">
                 <w10:wrap anchorx="page" anchory="page"/>
               </v:line>
             </w:pict>
@@ -4965,7 +4528,7 @@
           </mc:Choice>
           <mc:Fallback>
             <w:pict>
-              <v:line w14:anchorId="667985C1" id="Straight Connector 6" o:spid="_x0000_s1026" style="position:absolute;z-index:251727872;visibility:visible;mso-wrap-style:square;mso-wrap-distance-left:9pt;mso-wrap-distance-top:0;mso-wrap-distance-right:9pt;mso-wrap-distance-bottom:0;mso-position-horizontal:absolute;mso-position-horizontal-relative:page;mso-position-vertical:absolute;mso-position-vertical-relative:page" from="245pt,308pt" to="381pt,308pt" o:gfxdata="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" o:allowincell="f" strokeweight=".85pt">
+              <v:line w14:anchorId="6E12BA9C" id="Straight Connector 6" o:spid="_x0000_s1026" style="position:absolute;z-index:251727872;visibility:visible;mso-wrap-style:square;mso-wrap-distance-left:9pt;mso-wrap-distance-top:0;mso-wrap-distance-right:9pt;mso-wrap-distance-bottom:0;mso-position-horizontal:absolute;mso-position-horizontal-relative:page;mso-position-vertical:absolute;mso-position-vertical-relative:page" from="245pt,308pt" to="381pt,308pt" o:gfxdata="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" o:allowincell="f" strokeweight=".85pt">
                 <w10:wrap anchorx="page" anchory="page"/>
               </v:line>
             </w:pict>
@@ -5277,7 +4840,7 @@
                                 <w:color w:val="000000"/>
                                 <w:sz w:val="13"/>
                               </w:rPr>
-                              <w:t>Authorized Data Provider /</w:t>
+                              <w:t>Data Sources /</w:t>
                             </w:r>
                           </w:p>
                           <w:p>
@@ -5296,7 +4859,7 @@
                                 <w:color w:val="000000"/>
                                 <w:sz w:val="13"/>
                               </w:rPr>
-                              <w:t>Expert Validator</w:t>
+                              <w:t>Expert Reviewers</w:t>
                             </w:r>
                           </w:p>
                           <w:p>
@@ -5309,14 +4872,6 @@
                                 <w:sz w:val="13"/>
                               </w:rPr>
                             </w:pPr>
-                            <w:r>
-                              <w:rPr>
-                                <w:b/>
-                                <w:color w:val="000000"/>
-                                <w:sz w:val="13"/>
-                              </w:rPr>
-                              <w:t>(BDRRMO, CPDCO, PAGASA references)</w:t>
-                            </w:r>
                           </w:p>
                         </w:txbxContent>
                       </wps:txbx>
@@ -5353,7 +4908,7 @@
                           <w:color w:val="000000"/>
                           <w:sz w:val="13"/>
                         </w:rPr>
-                        <w:t>Authorized Data Provider /</w:t>
+                        <w:t>Data Sources /</w:t>
                       </w:r>
                     </w:p>
                     <w:p>
@@ -5372,7 +4927,7 @@
                           <w:color w:val="000000"/>
                           <w:sz w:val="13"/>
                         </w:rPr>
-                        <w:t>Expert Validator</w:t>
+                        <w:t>Expert Reviewers</w:t>
                       </w:r>
                     </w:p>
                     <w:p>
@@ -5385,14 +4940,6 @@
                           <w:sz w:val="13"/>
                         </w:rPr>
                       </w:pPr>
-                      <w:r>
-                        <w:rPr>
-                          <w:b/>
-                          <w:color w:val="000000"/>
-                          <w:sz w:val="13"/>
-                        </w:rPr>
-                        <w:t>(BDRRMO, CPDCO, PAGASA references)</w:t>
-                      </w:r>
                     </w:p>
                   </w:txbxContent>
                 </v:textbox>

</xml_diff>

<commit_message>
Update FloodSense manuscript, diagrams, surveys, and consultation documents
</commit_message>
<xml_diff>
--- a/1. FLOODSENSE-MAIN/MAIN FILESS/DIAGRAMS/Context Diagram.docx
+++ b/1. FLOODSENSE-MAIN/MAIN FILESS/DIAGRAMS/Context Diagram.docx
@@ -15,12 +15,12 @@
               <wp:anchor distT="0" distB="0" distL="114300" distR="114300" simplePos="0" relativeHeight="251716096" behindDoc="0" locked="0" layoutInCell="0" allowOverlap="1" wp14:anchorId="2774A086" wp14:editId="4302A49D">
                 <wp:simplePos x="0" y="0"/>
                 <wp:positionH relativeFrom="page">
-                  <wp:posOffset>4513694</wp:posOffset>
+                  <wp:posOffset>5143500</wp:posOffset>
                 </wp:positionH>
                 <wp:positionV relativeFrom="page">
-                  <wp:posOffset>5555805</wp:posOffset>
+                  <wp:posOffset>5524500</wp:posOffset>
                 </wp:positionV>
-                <wp:extent cx="1422400" cy="228600"/>
+                <wp:extent cx="1397000" cy="279400"/>
                 <wp:effectExtent l="0" t="0" r="6350" b="0"/>
                 <wp:wrapNone/>
                 <wp:docPr id="61" name="Text Box 61"/>
@@ -64,10 +64,10 @@
                             </w:pPr>
                             <w:r>
                               <w:rPr>
-                                <w:color w:val="000000"/>
-                                <w:sz w:val="13"/>
+                                <w:rFonts w:ascii="Arial" w:hAnsi="Arial"/>
+                                <w:sz w:val="14"/>
                               </w:rPr>
-                              <w:t>Permitted Activity Summary</w:t>
+                              <w:t>Permitted activity summary</w:t>
                             </w:r>
                           </w:p>
                         </w:txbxContent>
@@ -90,7 +90,7 @@
                 <v:stroke joinstyle="miter"/>
                 <v:path gradientshapeok="t" o:connecttype="rect"/>
               </v:shapetype>
-              <v:shape id="Text Box 61" o:spid="_x0000_s1026" type="#_x0000_t202" style="position:absolute;margin-left:355.4pt;margin-top:437.45pt;width:112pt;height:18pt;z-index:251716096;visibility:visible;mso-wrap-style:square;mso-wrap-distance-left:9pt;mso-wrap-distance-top:0;mso-wrap-distance-right:9pt;mso-wrap-distance-bottom:0;mso-position-horizontal:absolute;mso-position-horizontal-relative:page;mso-position-vertical:absolute;mso-position-vertical-relative:page;v-text-anchor:middle" o:gfxdata="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" o:allowincell="f" filled="f" stroked="f" strokeweight=".5pt">
+              <v:shape id="Text Box 61" o:spid="_x0000_s1026" type="#_x0000_t202" style="position:absolute;margin-left:405.000pt;margin-top:435.000pt;width:110.000pt;height:22.000pt;mso-position-horizontal-relative:page;mso-position-vertical-relative:page;v-text-anchor:middle" o:gfxdata="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" o:allowincell="f" filled="f" stroked="f" strokeweight=".5pt">
                 <v:textbox inset="2pt,1pt,2pt,1pt">
                   <w:txbxContent>
                     <w:p>
@@ -104,10 +104,10 @@
                       </w:pPr>
                       <w:r>
                         <w:rPr>
-                          <w:color w:val="000000"/>
-                          <w:sz w:val="13"/>
+                          <w:rFonts w:ascii="Arial" w:hAnsi="Arial"/>
+                          <w:sz w:val="14"/>
                         </w:rPr>
-                        <w:t>Permitted Activity Summary</w:t>
+                        <w:t>Permitted activity summary</w:t>
                       </w:r>
                     </w:p>
                   </w:txbxContent>
@@ -128,12 +128,12 @@
               <wp:anchor distT="0" distB="0" distL="114300" distR="114300" simplePos="0" relativeHeight="251705856" behindDoc="0" locked="0" layoutInCell="0" allowOverlap="1" wp14:anchorId="4F472559" wp14:editId="56DA19C3">
                 <wp:simplePos x="0" y="0"/>
                 <wp:positionH relativeFrom="page">
-                  <wp:posOffset>4458875</wp:posOffset>
+                  <wp:posOffset>5143500</wp:posOffset>
                 </wp:positionH>
                 <wp:positionV relativeFrom="page">
-                  <wp:posOffset>4669420</wp:posOffset>
+                  <wp:posOffset>4635500</wp:posOffset>
                 </wp:positionV>
-                <wp:extent cx="1879600" cy="279400"/>
+                <wp:extent cx="1397000" cy="279400"/>
                 <wp:effectExtent l="0" t="0" r="6350" b="6350"/>
                 <wp:wrapNone/>
                 <wp:docPr id="60" name="Text Box 60"/>
@@ -177,10 +177,10 @@
                             </w:pPr>
                             <w:r>
                               <w:rPr>
-                                <w:color w:val="000000"/>
-                                <w:sz w:val="13"/>
+                                <w:rFonts w:ascii="Arial" w:hAnsi="Arial"/>
+                                <w:sz w:val="14"/>
                               </w:rPr>
-                              <w:t>Record Status and Source Metadata</w:t>
+                              <w:t>Record status / source metadata</w:t>
                             </w:r>
                           </w:p>
                         </w:txbxContent>
@@ -199,7 +199,7 @@
           </mc:Choice>
           <mc:Fallback>
             <w:pict>
-              <v:shape w14:anchorId="4F472559" id="Text Box 60" o:spid="_x0000_s1027" type="#_x0000_t202" style="position:absolute;margin-left:351.1pt;margin-top:367.65pt;width:148pt;height:22pt;z-index:251705856;visibility:visible;mso-wrap-style:square;mso-wrap-distance-left:9pt;mso-wrap-distance-top:0;mso-wrap-distance-right:9pt;mso-wrap-distance-bottom:0;mso-position-horizontal:absolute;mso-position-horizontal-relative:page;mso-position-vertical:absolute;mso-position-vertical-relative:page;v-text-anchor:middle" o:gfxdata="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" o:allowincell="f" filled="f" stroked="f" strokeweight=".5pt">
+              <v:shape w14:anchorId="4F472559" id="Text Box 60" o:spid="_x0000_s1027" type="#_x0000_t202" style="position:absolute;margin-left:405.000pt;margin-top:365.000pt;width:110.000pt;height:22.000pt;mso-position-horizontal-relative:page;mso-position-vertical-relative:page;v-text-anchor:middle" o:gfxdata="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" o:allowincell="f" filled="f" stroked="f" strokeweight=".5pt">
                 <v:textbox inset="2pt,1pt,2pt,1pt">
                   <w:txbxContent>
                     <w:p>
@@ -213,10 +213,10 @@
                       </w:pPr>
                       <w:r>
                         <w:rPr>
-                          <w:color w:val="000000"/>
-                          <w:sz w:val="13"/>
+                          <w:rFonts w:ascii="Arial" w:hAnsi="Arial"/>
+                          <w:sz w:val="14"/>
                         </w:rPr>
-                        <w:t>Record Status and Source Metadata</w:t>
+                        <w:t>Record status / source metadata</w:t>
                       </w:r>
                     </w:p>
                   </w:txbxContent>
@@ -439,21 +439,31 @@
         <w:rPr>
           <w:noProof/>
         </w:rPr>
+      </w:r>
+      <w:r>
+        <w:rPr>
+          <w:noProof/>
+        </w:rPr>
+      </w:r>
+      <w:r>
+        <w:rPr>
+          <w:noProof/>
+        </w:rPr>
         <mc:AlternateContent>
           <mc:Choice Requires="wps">
             <w:drawing>
-              <wp:anchor distT="0" distB="0" distL="114300" distR="114300" simplePos="0" relativeHeight="251666944" behindDoc="0" locked="0" layoutInCell="0" allowOverlap="1" wp14:anchorId="04ACFA10" wp14:editId="6ECA6D54">
+              <wp:anchor distT="0" distB="0" distL="114300" distR="114300" simplePos="0" relativeHeight="251687424" behindDoc="0" locked="0" layoutInCell="0" allowOverlap="1" wp14:anchorId="47B445D4" wp14:editId="17BE3268">
                 <wp:simplePos x="0" y="0"/>
                 <wp:positionH relativeFrom="page">
-                  <wp:posOffset>4364576</wp:posOffset>
+                  <wp:posOffset>1621762</wp:posOffset>
                 </wp:positionH>
                 <wp:positionV relativeFrom="page">
-                  <wp:posOffset>2738590</wp:posOffset>
+                  <wp:posOffset>5188585</wp:posOffset>
                 </wp:positionV>
-                <wp:extent cx="1168400" cy="271306"/>
+                <wp:extent cx="2082800" cy="292100"/>
                 <wp:effectExtent l="0" t="0" r="0" b="0"/>
                 <wp:wrapNone/>
-                <wp:docPr id="54" name="Text Box 54"/>
+                <wp:docPr id="58" name="Text Box 58"/>
                 <wp:cNvGraphicFramePr/>
                 <a:graphic xmlns:a="http://schemas.openxmlformats.org/drawingml/2006/main">
                   <a:graphicData uri="http://schemas.microsoft.com/office/word/2010/wordprocessingShape">
@@ -462,7 +472,7 @@
                       <wps:spPr>
                         <a:xfrm>
                           <a:off x="0" y="0"/>
-                          <a:ext cx="1168400" cy="271306"/>
+                          <a:ext cx="2082800" cy="292100"/>
                         </a:xfrm>
                         <a:prstGeom prst="rect">
                           <a:avLst/>
@@ -494,10 +504,10 @@
                             </w:pPr>
                             <w:r>
                               <w:rPr>
-                                <w:color w:val="000000"/>
-                                <w:sz w:val="13"/>
+                                <w:rFonts w:ascii="Arial" w:hAnsi="Arial"/>
+                                <w:sz w:val="14"/>
                               </w:rPr>
-                              <w:t>Rainfall references</w:t>
+                              <w:t>Permitted records / review inputs</w:t>
                             </w:r>
                           </w:p>
                         </w:txbxContent>
@@ -511,15 +521,12 @@
                     </wps:wsp>
                   </a:graphicData>
                 </a:graphic>
-                <wp14:sizeRelV relativeFrom="margin">
-                  <wp14:pctHeight>0</wp14:pctHeight>
-                </wp14:sizeRelV>
               </wp:anchor>
             </w:drawing>
           </mc:Choice>
           <mc:Fallback>
             <w:pict>
-              <v:shape w14:anchorId="04ACFA10" id="Text Box 54" o:spid="_x0000_s1028" type="#_x0000_t202" style="position:absolute;margin-left:343.65pt;margin-top:215.65pt;width:92pt;height:21.35pt;z-index:251666944;visibility:visible;mso-wrap-style:square;mso-height-percent:0;mso-wrap-distance-left:9pt;mso-wrap-distance-top:0;mso-wrap-distance-right:9pt;mso-wrap-distance-bottom:0;mso-position-horizontal:absolute;mso-position-horizontal-relative:page;mso-position-vertical:absolute;mso-position-vertical-relative:page;mso-height-percent:0;mso-height-relative:margin;v-text-anchor:middle" o:gfxdata="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" o:allowincell="f" filled="f" stroked="f" strokeweight=".5pt">
+              <v:shape w14:anchorId="47B445D4" id="Text Box 58" o:spid="_x0000_s1030" type="#_x0000_t202" style="position:absolute;margin-left:127.7pt;margin-top:408.55pt;width:164pt;height:23pt;z-index:251687424;visibility:visible;mso-wrap-style:square;mso-wrap-distance-left:9pt;mso-wrap-distance-top:0;mso-wrap-distance-right:9pt;mso-wrap-distance-bottom:0;mso-position-horizontal:absolute;mso-position-horizontal-relative:page;mso-position-vertical:absolute;mso-position-vertical-relative:page;v-text-anchor:middle" o:gfxdata="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" o:allowincell="f" filled="f" stroked="f" strokeweight=".5pt">
                 <v:textbox inset="2pt,1pt,2pt,1pt">
                   <w:txbxContent>
                     <w:p>
@@ -533,10 +540,10 @@
                       </w:pPr>
                       <w:r>
                         <w:rPr>
-                          <w:color w:val="000000"/>
-                          <w:sz w:val="13"/>
+                          <w:rFonts w:ascii="Arial" w:hAnsi="Arial"/>
+                          <w:sz w:val="14"/>
                         </w:rPr>
-                        <w:t>Rainfall references</w:t>
+                        <w:t>Permitted records / review inputs</w:t>
                       </w:r>
                     </w:p>
                   </w:txbxContent>
@@ -554,18 +561,18 @@
         <mc:AlternateContent>
           <mc:Choice Requires="wps">
             <w:drawing>
-              <wp:anchor distT="0" distB="0" distL="114300" distR="114300" simplePos="0" relativeHeight="251673088" behindDoc="0" locked="0" layoutInCell="0" allowOverlap="1" wp14:anchorId="5B395E49" wp14:editId="18FF8E24">
+              <wp:anchor distT="0" distB="0" distL="114300" distR="114300" simplePos="0" relativeHeight="251693568" behindDoc="0" locked="0" layoutInCell="0" allowOverlap="1" wp14:anchorId="1AE8435C" wp14:editId="5BDBE962">
                 <wp:simplePos x="0" y="0"/>
                 <wp:positionH relativeFrom="page">
-                  <wp:posOffset>4749358</wp:posOffset>
+                  <wp:posOffset>1543657</wp:posOffset>
                 </wp:positionH>
                 <wp:positionV relativeFrom="page">
-                  <wp:posOffset>3095597</wp:posOffset>
+                  <wp:posOffset>5927698</wp:posOffset>
                 </wp:positionV>
-                <wp:extent cx="1473200" cy="152400"/>
-                <wp:effectExtent l="0" t="0" r="0" b="0"/>
+                <wp:extent cx="1803400" cy="228600"/>
+                <wp:effectExtent l="0" t="0" r="6350" b="0"/>
                 <wp:wrapNone/>
-                <wp:docPr id="55" name="Text Box 55"/>
+                <wp:docPr id="59" name="Text Box 59"/>
                 <wp:cNvGraphicFramePr/>
                 <a:graphic xmlns:a="http://schemas.openxmlformats.org/drawingml/2006/main">
                   <a:graphicData uri="http://schemas.microsoft.com/office/word/2010/wordprocessingShape">
@@ -574,7 +581,7 @@
                       <wps:spPr>
                         <a:xfrm>
                           <a:off x="0" y="0"/>
-                          <a:ext cx="1473200" cy="152400"/>
+                          <a:ext cx="1803400" cy="228600"/>
                         </a:xfrm>
                         <a:prstGeom prst="rect">
                           <a:avLst/>
@@ -606,10 +613,10 @@
                             </w:pPr>
                             <w:r>
                               <w:rPr>
-                                <w:color w:val="000000"/>
-                                <w:sz w:val="13"/>
+                                <w:rFonts w:ascii="Arial" w:hAnsi="Arial"/>
+                                <w:sz w:val="14"/>
                               </w:rPr>
-                              <w:t>Expert review input</w:t>
+                              <w:t>Review / publication decisions</w:t>
                             </w:r>
                           </w:p>
                         </w:txbxContent>
@@ -628,7 +635,7 @@
           </mc:Choice>
           <mc:Fallback>
             <w:pict>
-              <v:shape w14:anchorId="5B395E49" id="Text Box 55" o:spid="_x0000_s1029" type="#_x0000_t202" style="position:absolute;margin-left:373.95pt;margin-top:243.75pt;width:116pt;height:12pt;z-index:251673088;visibility:visible;mso-wrap-style:square;mso-wrap-distance-left:9pt;mso-wrap-distance-top:0;mso-wrap-distance-right:9pt;mso-wrap-distance-bottom:0;mso-position-horizontal:absolute;mso-position-horizontal-relative:page;mso-position-vertical:absolute;mso-position-vertical-relative:page;v-text-anchor:middle" o:gfxdata="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" o:allowincell="f" filled="f" stroked="f" strokeweight=".5pt">
+              <v:shape w14:anchorId="1AE8435C" id="Text Box 59" o:spid="_x0000_s1031" type="#_x0000_t202" style="position:absolute;margin-left:121.55pt;margin-top:466.75pt;width:142pt;height:18pt;z-index:251693568;visibility:visible;mso-wrap-style:square;mso-wrap-distance-left:9pt;mso-wrap-distance-top:0;mso-wrap-distance-right:9pt;mso-wrap-distance-bottom:0;mso-position-horizontal:absolute;mso-position-horizontal-relative:page;mso-position-vertical:absolute;mso-position-vertical-relative:page;v-text-anchor:middle" o:gfxdata="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" o:allowincell="f" filled="f" stroked="f" strokeweight=".5pt">
                 <v:textbox inset="2pt,1pt,2pt,1pt">
                   <w:txbxContent>
                     <w:p>
@@ -642,10 +649,10 @@
                       </w:pPr>
                       <w:r>
                         <w:rPr>
-                          <w:color w:val="000000"/>
-                          <w:sz w:val="13"/>
+                          <w:rFonts w:ascii="Arial" w:hAnsi="Arial"/>
+                          <w:sz w:val="14"/>
                         </w:rPr>
-                        <w:t>Expert review input</w:t>
+                        <w:t>Review / publication decisions</w:t>
                       </w:r>
                     </w:p>
                   </w:txbxContent>
@@ -663,18 +670,18 @@
         <mc:AlternateContent>
           <mc:Choice Requires="wps">
             <w:drawing>
-              <wp:anchor distT="0" distB="0" distL="114300" distR="114300" simplePos="0" relativeHeight="251687424" behindDoc="0" locked="0" layoutInCell="0" allowOverlap="1" wp14:anchorId="47B445D4" wp14:editId="17BE3268">
+              <wp:anchor distT="0" distB="0" distL="114300" distR="114300" simplePos="0" relativeHeight="251681280" behindDoc="0" locked="0" layoutInCell="0" allowOverlap="1" wp14:anchorId="4E0BF446" wp14:editId="5A8DD929">
                 <wp:simplePos x="0" y="0"/>
                 <wp:positionH relativeFrom="page">
-                  <wp:posOffset>1621762</wp:posOffset>
+                  <wp:posOffset>2011238</wp:posOffset>
                 </wp:positionH>
                 <wp:positionV relativeFrom="page">
-                  <wp:posOffset>5188585</wp:posOffset>
+                  <wp:posOffset>4811312</wp:posOffset>
                 </wp:positionV>
-                <wp:extent cx="2082800" cy="292100"/>
-                <wp:effectExtent l="0" t="0" r="0" b="0"/>
+                <wp:extent cx="1841500" cy="152400"/>
+                <wp:effectExtent l="0" t="0" r="6350" b="0"/>
                 <wp:wrapNone/>
-                <wp:docPr id="58" name="Text Box 58"/>
+                <wp:docPr id="57" name="Text Box 57"/>
                 <wp:cNvGraphicFramePr/>
                 <a:graphic xmlns:a="http://schemas.openxmlformats.org/drawingml/2006/main">
                   <a:graphicData uri="http://schemas.microsoft.com/office/word/2010/wordprocessingShape">
@@ -683,7 +690,646 @@
                       <wps:spPr>
                         <a:xfrm>
                           <a:off x="0" y="0"/>
-                          <a:ext cx="2082800" cy="292100"/>
+                          <a:ext cx="1841500" cy="152400"/>
+                        </a:xfrm>
+                        <a:prstGeom prst="rect">
+                          <a:avLst/>
+                        </a:prstGeom>
+                        <a:noFill/>
+                        <a:ln w="6350">
+                          <a:noFill/>
+                        </a:ln>
+                        <a:extLst>
+                          <a:ext uri="{91240B29-F687-4F45-9708-019B960494DF}">
+                            <a14:hiddenLine xmlns:a14="http://schemas.microsoft.com/office/drawing/2010/main" w="6350">
+                              <a:solidFill>
+                                <a:prstClr val="black"/>
+                              </a:solidFill>
+                            </a14:hiddenLine>
+                          </a:ext>
+                        </a:extLst>
+                      </wps:spPr>
+                      <wps:txbx>
+                        <w:txbxContent>
+                          <w:p>
+                            <w:pPr>
+                              <w:spacing w:after="0"/>
+                              <w:jc w:val="center"/>
+                              <w:rPr>
+                                <w:color w:val="000000"/>
+                                <w:sz w:val="14"/>
+                              </w:rPr>
+                            </w:pPr>
+                            <w:r>
+                              <w:rPr>
+                                <w:rFonts w:ascii="Arial" w:hAnsi="Arial"/>
+                                <w:sz w:val="14"/>
+                              </w:rPr>
+                              <w:t>Admin access request</w:t>
+                            </w:r>
+                          </w:p>
+                        </w:txbxContent>
+                      </wps:txbx>
+                      <wps:bodyPr rot="0" spcFirstLastPara="0" vertOverflow="overflow" horzOverflow="overflow" vert="horz" wrap="square" lIns="25400" tIns="12700" rIns="25400" bIns="12700" numCol="1" spcCol="0" rtlCol="0" fromWordArt="0" anchor="ctr" anchorCtr="0" forceAA="0" compatLnSpc="1">
+                        <a:prstTxWarp prst="textNoShape">
+                          <a:avLst/>
+                        </a:prstTxWarp>
+                        <a:noAutofit/>
+                      </wps:bodyPr>
+                    </wps:wsp>
+                  </a:graphicData>
+                </a:graphic>
+              </wp:anchor>
+            </w:drawing>
+          </mc:Choice>
+          <mc:Fallback>
+            <w:pict>
+              <v:shape w14:anchorId="4E0BF446" id="Text Box 57" o:spid="_x0000_s1032" type="#_x0000_t202" style="position:absolute;margin-left:158.35pt;margin-top:378.85pt;width:145pt;height:12pt;z-index:251681280;visibility:visible;mso-wrap-style:square;mso-wrap-distance-left:9pt;mso-wrap-distance-top:0;mso-wrap-distance-right:9pt;mso-wrap-distance-bottom:0;mso-position-horizontal:absolute;mso-position-horizontal-relative:page;mso-position-vertical:absolute;mso-position-vertical-relative:page;v-text-anchor:middle" o:gfxdata="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" o:allowincell="f" filled="f" stroked="f" strokeweight=".5pt">
+                <v:textbox inset="2pt,1pt,2pt,1pt">
+                  <w:txbxContent>
+                    <w:p>
+                      <w:pPr>
+                        <w:spacing w:after="0"/>
+                        <w:jc w:val="center"/>
+                        <w:rPr>
+                          <w:color w:val="000000"/>
+                          <w:sz w:val="14"/>
+                        </w:rPr>
+                      </w:pPr>
+                      <w:r>
+                        <w:rPr>
+                          <w:rFonts w:ascii="Arial" w:hAnsi="Arial"/>
+                          <w:sz w:val="14"/>
+                        </w:rPr>
+                        <w:t>Admin access request</w:t>
+                      </w:r>
+                    </w:p>
+                  </w:txbxContent>
+                </v:textbox>
+                <w10:wrap anchorx="page" anchory="page"/>
+              </v:shape>
+            </w:pict>
+          </mc:Fallback>
+        </mc:AlternateContent>
+      </w:r>
+      <w:r>
+        <w:rPr>
+          <w:noProof/>
+        </w:rPr>
+      </w:r>
+      <w:r>
+        <w:rPr>
+          <w:noProof/>
+        </w:rPr>
+      </w:r>
+      <w:r>
+        <w:rPr>
+          <w:noProof/>
+        </w:rPr>
+      </w:r>
+      <w:r>
+        <w:rPr>
+          <w:noProof/>
+        </w:rPr>
+        <mc:AlternateContent>
+          <mc:Choice Requires="wps">
+            <w:drawing>
+              <wp:anchor distT="0" distB="0" distL="114300" distR="114300" simplePos="0" relativeHeight="251592192" behindDoc="0" locked="0" layoutInCell="0" allowOverlap="1" wp14:anchorId="2E2F4700" wp14:editId="74FB7939">
+                <wp:simplePos x="0" y="0"/>
+                <wp:positionH relativeFrom="page">
+                  <wp:posOffset>4315767</wp:posOffset>
+                </wp:positionH>
+                <wp:positionV relativeFrom="page">
+                  <wp:posOffset>1416818</wp:posOffset>
+                </wp:positionV>
+                <wp:extent cx="0" cy="2214266"/>
+                <wp:effectExtent l="76200" t="0" r="95250" b="52705"/>
+                <wp:wrapNone/>
+                <wp:docPr id="15" name="Straight Connector 15"/>
+                <wp:cNvGraphicFramePr/>
+                <a:graphic xmlns:a="http://schemas.openxmlformats.org/drawingml/2006/main">
+                  <a:graphicData uri="http://schemas.microsoft.com/office/word/2010/wordprocessingShape">
+                    <wps:wsp>
+                      <wps:cNvCnPr/>
+                      <wps:spPr>
+                        <a:xfrm>
+                          <a:off x="0" y="0"/>
+                          <a:ext cx="0" cy="2214266"/>
+                        </a:xfrm>
+                        <a:prstGeom prst="line">
+                          <a:avLst/>
+                        </a:prstGeom>
+                        <a:ln w="10795">
+                          <a:solidFill>
+                            <a:srgbClr val="000000"/>
+                          </a:solidFill>
+                          <a:headEnd type="none"/>
+                          <a:tailEnd type="triangle"/>
+                        </a:ln>
+                      </wps:spPr>
+                      <wps:style>
+                        <a:lnRef idx="1">
+                          <a:schemeClr val="accent1"/>
+                        </a:lnRef>
+                        <a:fillRef idx="0">
+                          <a:schemeClr val="accent1"/>
+                        </a:fillRef>
+                        <a:effectRef idx="0">
+                          <a:schemeClr val="accent1"/>
+                        </a:effectRef>
+                        <a:fontRef idx="minor">
+                          <a:schemeClr val="tx1"/>
+                        </a:fontRef>
+                      </wps:style>
+                      <wps:bodyPr/>
+                    </wps:wsp>
+                  </a:graphicData>
+                </a:graphic>
+                <wp14:sizeRelV relativeFrom="margin">
+                  <wp14:pctHeight>0</wp14:pctHeight>
+                </wp14:sizeRelV>
+              </wp:anchor>
+            </w:drawing>
+          </mc:Choice>
+          <mc:Fallback>
+            <w:pict>
+              <v:line w14:anchorId="0C6D63CD" id="Straight Connector 15" o:spid="_x0000_s1026" style="position:absolute;z-index:251592192;visibility:visible;mso-wrap-style:square;mso-height-percent:0;mso-wrap-distance-left:9pt;mso-wrap-distance-top:0;mso-wrap-distance-right:9pt;mso-wrap-distance-bottom:0;mso-position-horizontal:absolute;mso-position-horizontal-relative:page;mso-position-vertical:absolute;mso-position-vertical-relative:page;mso-height-percent:0;mso-height-relative:margin" from="339.8pt,111.55pt" to="339.8pt,285.9pt" o:gfxdata="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" o:allowincell="f" strokeweight=".85pt">
+                <v:stroke endarrow="block"/>
+                <w10:wrap anchorx="page" anchory="page"/>
+              </v:line>
+            </w:pict>
+          </mc:Fallback>
+        </mc:AlternateContent>
+      </w:r>
+      <w:r>
+        <w:rPr>
+          <w:noProof/>
+        </w:rPr>
+        <mc:AlternateContent>
+          <mc:Choice Requires="wps">
+            <w:drawing>
+              <wp:anchor distT="0" distB="0" distL="114300" distR="114300" simplePos="0" relativeHeight="251573760" behindDoc="0" locked="0" layoutInCell="0" allowOverlap="1" wp14:anchorId="598C95F7" wp14:editId="419A3A4C">
+                <wp:simplePos x="0" y="0"/>
+                <wp:positionH relativeFrom="page">
+                  <wp:posOffset>1421841</wp:posOffset>
+                </wp:positionH>
+                <wp:positionV relativeFrom="page">
+                  <wp:posOffset>1421842</wp:posOffset>
+                </wp:positionV>
+                <wp:extent cx="2893925" cy="0"/>
+                <wp:effectExtent l="0" t="0" r="0" b="0"/>
+                <wp:wrapNone/>
+                <wp:docPr id="8" name="Straight Connector 8"/>
+                <wp:cNvGraphicFramePr/>
+                <a:graphic xmlns:a="http://schemas.openxmlformats.org/drawingml/2006/main">
+                  <a:graphicData uri="http://schemas.microsoft.com/office/word/2010/wordprocessingShape">
+                    <wps:wsp>
+                      <wps:cNvCnPr/>
+                      <wps:spPr>
+                        <a:xfrm>
+                          <a:off x="0" y="0"/>
+                          <a:ext cx="2893925" cy="0"/>
+                        </a:xfrm>
+                        <a:prstGeom prst="line">
+                          <a:avLst/>
+                        </a:prstGeom>
+                        <a:ln w="10795">
+                          <a:solidFill>
+                            <a:srgbClr val="000000"/>
+                          </a:solidFill>
+                          <a:headEnd type="none"/>
+                          <a:tailEnd type="none"/>
+                        </a:ln>
+                      </wps:spPr>
+                      <wps:style>
+                        <a:lnRef idx="1">
+                          <a:schemeClr val="accent1"/>
+                        </a:lnRef>
+                        <a:fillRef idx="0">
+                          <a:schemeClr val="accent1"/>
+                        </a:fillRef>
+                        <a:effectRef idx="0">
+                          <a:schemeClr val="accent1"/>
+                        </a:effectRef>
+                        <a:fontRef idx="minor">
+                          <a:schemeClr val="tx1"/>
+                        </a:fontRef>
+                      </wps:style>
+                      <wps:bodyPr/>
+                    </wps:wsp>
+                  </a:graphicData>
+                </a:graphic>
+                <wp14:sizeRelH relativeFrom="margin">
+                  <wp14:pctWidth>0</wp14:pctWidth>
+                </wp14:sizeRelH>
+              </wp:anchor>
+            </w:drawing>
+          </mc:Choice>
+          <mc:Fallback>
+            <w:pict>
+              <v:line w14:anchorId="5D35D497" id="Straight Connector 8" o:spid="_x0000_s1026" style="position:absolute;z-index:251573760;visibility:visible;mso-wrap-style:square;mso-width-percent:0;mso-wrap-distance-left:9pt;mso-wrap-distance-top:0;mso-wrap-distance-right:9pt;mso-wrap-distance-bottom:0;mso-position-horizontal:absolute;mso-position-horizontal-relative:page;mso-position-vertical:absolute;mso-position-vertical-relative:page;mso-width-percent:0;mso-width-relative:margin" from="111.95pt,111.95pt" to="339.8pt,111.95pt" o:gfxdata="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" o:allowincell="f" strokeweight=".85pt">
+                <w10:wrap anchorx="page" anchory="page"/>
+              </v:line>
+            </w:pict>
+          </mc:Fallback>
+        </mc:AlternateContent>
+      </w:r>
+      <w:r>
+        <w:rPr>
+          <w:noProof/>
+        </w:rPr>
+        <mc:AlternateContent>
+          <mc:Choice Requires="wps">
+            <w:drawing>
+              <wp:anchor distT="0" distB="0" distL="114300" distR="114300" simplePos="0" relativeHeight="251579904" behindDoc="0" locked="0" layoutInCell="0" allowOverlap="1" wp14:anchorId="7BC5786F" wp14:editId="238B69BA">
+                <wp:simplePos x="0" y="0"/>
+                <wp:positionH relativeFrom="page">
+                  <wp:posOffset>3421052</wp:posOffset>
+                </wp:positionH>
+                <wp:positionV relativeFrom="page">
+                  <wp:posOffset>1933728</wp:posOffset>
+                </wp:positionV>
+                <wp:extent cx="5436" cy="1697913"/>
+                <wp:effectExtent l="76200" t="0" r="71120" b="55245"/>
+                <wp:wrapNone/>
+                <wp:docPr id="9" name="Straight Connector 9"/>
+                <wp:cNvGraphicFramePr/>
+                <a:graphic xmlns:a="http://schemas.openxmlformats.org/drawingml/2006/main">
+                  <a:graphicData uri="http://schemas.microsoft.com/office/word/2010/wordprocessingShape">
+                    <wps:wsp>
+                      <wps:cNvCnPr/>
+                      <wps:spPr>
+                        <a:xfrm>
+                          <a:off x="0" y="0"/>
+                          <a:ext cx="5436" cy="1697913"/>
+                        </a:xfrm>
+                        <a:prstGeom prst="line">
+                          <a:avLst/>
+                        </a:prstGeom>
+                        <a:ln w="10795">
+                          <a:solidFill>
+                            <a:srgbClr val="000000"/>
+                          </a:solidFill>
+                          <a:headEnd type="none"/>
+                          <a:tailEnd type="triangle"/>
+                        </a:ln>
+                      </wps:spPr>
+                      <wps:style>
+                        <a:lnRef idx="1">
+                          <a:schemeClr val="accent1"/>
+                        </a:lnRef>
+                        <a:fillRef idx="0">
+                          <a:schemeClr val="accent1"/>
+                        </a:fillRef>
+                        <a:effectRef idx="0">
+                          <a:schemeClr val="accent1"/>
+                        </a:effectRef>
+                        <a:fontRef idx="minor">
+                          <a:schemeClr val="tx1"/>
+                        </a:fontRef>
+                      </wps:style>
+                      <wps:bodyPr/>
+                    </wps:wsp>
+                  </a:graphicData>
+                </a:graphic>
+                <wp14:sizeRelH relativeFrom="margin">
+                  <wp14:pctWidth>0</wp14:pctWidth>
+                </wp14:sizeRelH>
+                <wp14:sizeRelV relativeFrom="margin">
+                  <wp14:pctHeight>0</wp14:pctHeight>
+                </wp14:sizeRelV>
+              </wp:anchor>
+            </w:drawing>
+          </mc:Choice>
+          <mc:Fallback>
+            <w:pict>
+              <v:line w14:anchorId="7FF97709" id="Straight Connector 9" o:spid="_x0000_s1026" style="position:absolute;z-index:251579904;visibility:visible;mso-wrap-style:square;mso-width-percent:0;mso-height-percent:0;mso-wrap-distance-left:9pt;mso-wrap-distance-top:0;mso-wrap-distance-right:9pt;mso-wrap-distance-bottom:0;mso-position-horizontal:absolute;mso-position-horizontal-relative:page;mso-position-vertical:absolute;mso-position-vertical-relative:page;mso-width-percent:0;mso-height-percent:0;mso-width-relative:margin;mso-height-relative:margin" from="269.35pt,152.25pt" to="269.8pt,285.95pt" o:gfxdata="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" o:allowincell="f" strokeweight=".85pt">
+                <v:stroke endarrow="block"/>
+                <w10:wrap anchorx="page" anchory="page"/>
+              </v:line>
+            </w:pict>
+          </mc:Fallback>
+        </mc:AlternateContent>
+      </w:r>
+      <w:r>
+        <w:rPr>
+          <w:noProof/>
+        </w:rPr>
+        <mc:AlternateContent>
+          <mc:Choice Requires="wps">
+            <w:drawing>
+              <wp:anchor distT="0" distB="0" distL="114300" distR="114300" simplePos="0" relativeHeight="251586048" behindDoc="0" locked="0" layoutInCell="0" allowOverlap="1" wp14:anchorId="08B5A1A5" wp14:editId="2D96D312">
+                <wp:simplePos x="0" y="0"/>
+                <wp:positionH relativeFrom="page">
+                  <wp:posOffset>2029767</wp:posOffset>
+                </wp:positionH>
+                <wp:positionV relativeFrom="page">
+                  <wp:posOffset>1929284</wp:posOffset>
+                </wp:positionV>
+                <wp:extent cx="1391697" cy="5024"/>
+                <wp:effectExtent l="0" t="0" r="37465" b="33655"/>
+                <wp:wrapNone/>
+                <wp:docPr id="14" name="Straight Connector 14"/>
+                <wp:cNvGraphicFramePr/>
+                <a:graphic xmlns:a="http://schemas.openxmlformats.org/drawingml/2006/main">
+                  <a:graphicData uri="http://schemas.microsoft.com/office/word/2010/wordprocessingShape">
+                    <wps:wsp>
+                      <wps:cNvCnPr/>
+                      <wps:spPr>
+                        <a:xfrm>
+                          <a:off x="0" y="0"/>
+                          <a:ext cx="1391697" cy="5024"/>
+                        </a:xfrm>
+                        <a:prstGeom prst="line">
+                          <a:avLst/>
+                        </a:prstGeom>
+                        <a:ln w="10795">
+                          <a:solidFill>
+                            <a:srgbClr val="000000"/>
+                          </a:solidFill>
+                          <a:headEnd type="none"/>
+                          <a:tailEnd type="none"/>
+                        </a:ln>
+                      </wps:spPr>
+                      <wps:style>
+                        <a:lnRef idx="1">
+                          <a:schemeClr val="accent1"/>
+                        </a:lnRef>
+                        <a:fillRef idx="0">
+                          <a:schemeClr val="accent1"/>
+                        </a:fillRef>
+                        <a:effectRef idx="0">
+                          <a:schemeClr val="accent1"/>
+                        </a:effectRef>
+                        <a:fontRef idx="minor">
+                          <a:schemeClr val="tx1"/>
+                        </a:fontRef>
+                      </wps:style>
+                      <wps:bodyPr/>
+                    </wps:wsp>
+                  </a:graphicData>
+                </a:graphic>
+                <wp14:sizeRelH relativeFrom="margin">
+                  <wp14:pctWidth>0</wp14:pctWidth>
+                </wp14:sizeRelH>
+              </wp:anchor>
+            </w:drawing>
+          </mc:Choice>
+          <mc:Fallback>
+            <w:pict>
+              <v:line w14:anchorId="03176ED1" id="Straight Connector 14" o:spid="_x0000_s1026" style="position:absolute;z-index:251586048;visibility:visible;mso-wrap-style:square;mso-width-percent:0;mso-wrap-distance-left:9pt;mso-wrap-distance-top:0;mso-wrap-distance-right:9pt;mso-wrap-distance-bottom:0;mso-position-horizontal:absolute;mso-position-horizontal-relative:page;mso-position-vertical:absolute;mso-position-vertical-relative:page;mso-width-percent:0;mso-width-relative:margin" from="159.8pt,151.9pt" to="269.4pt,152.3pt" o:gfxdata="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" o:allowincell="f" strokeweight=".85pt">
+                <w10:wrap anchorx="page" anchory="page"/>
+              </v:line>
+            </w:pict>
+          </mc:Fallback>
+        </mc:AlternateContent>
+      </w:r>
+      <w:r>
+        <w:rPr>
+          <w:noProof/>
+        </w:rPr>
+        <mc:AlternateContent>
+          <mc:Choice Requires="wps">
+            <w:drawing>
+              <wp:anchor distT="0" distB="0" distL="114300" distR="114300" simplePos="0" relativeHeight="251642368" behindDoc="0" locked="0" layoutInCell="0" allowOverlap="1" wp14:anchorId="511F6360" wp14:editId="140A5A8E">
+                <wp:simplePos x="0" y="0"/>
+                <wp:positionH relativeFrom="page">
+                  <wp:posOffset>2209800</wp:posOffset>
+                </wp:positionH>
+                <wp:positionV relativeFrom="page">
+                  <wp:posOffset>3810000</wp:posOffset>
+                </wp:positionV>
+                <wp:extent cx="863600" cy="152400"/>
+                <wp:effectExtent l="0" t="0" r="6350" b="0"/>
+                <wp:wrapNone/>
+                <wp:docPr id="50" name="Text Box 50"/>
+                <wp:cNvGraphicFramePr/>
+                <a:graphic xmlns:a="http://schemas.openxmlformats.org/drawingml/2006/main">
+                  <a:graphicData uri="http://schemas.microsoft.com/office/word/2010/wordprocessingShape">
+                    <wps:wsp>
+                      <wps:cNvSpPr txBox="1"/>
+                      <wps:spPr>
+                        <a:xfrm>
+                          <a:off x="0" y="0"/>
+                          <a:ext cx="1422400" cy="152400"/>
+                        </a:xfrm>
+                        <a:prstGeom prst="rect">
+                          <a:avLst/>
+                        </a:prstGeom>
+                        <a:noFill/>
+                        <a:ln w="6350">
+                          <a:noFill/>
+                        </a:ln>
+                        <a:extLst>
+                          <a:ext uri="{91240B29-F687-4F45-9708-019B960494DF}">
+                            <a14:hiddenLine xmlns:a14="http://schemas.microsoft.com/office/drawing/2010/main" w="6350">
+                              <a:solidFill>
+                                <a:prstClr val="black"/>
+                              </a:solidFill>
+                            </a14:hiddenLine>
+                          </a:ext>
+                        </a:extLst>
+                      </wps:spPr>
+                      <wps:txbx>
+                        <w:txbxContent>
+                          <w:p>
+                            <w:pPr>
+                              <w:spacing w:after="0"/>
+                              <w:jc w:val="center"/>
+                              <w:rPr>
+                                <w:color w:val="000000"/>
+                                <w:sz w:val="14"/>
+                              </w:rPr>
+                            </w:pPr>
+                            <w:r>
+                              <w:rPr>
+                                <w:rFonts w:ascii="Arial" w:hAnsi="Arial"/>
+                                <w:sz w:val="14"/>
+                              </w:rPr>
+                              <w:t>Susceptibility map</w:t>
+                            </w:r>
+                          </w:p>
+                        </w:txbxContent>
+                      </wps:txbx>
+                      <wps:bodyPr rot="0" spcFirstLastPara="0" vertOverflow="overflow" horzOverflow="overflow" vert="horz" wrap="square" lIns="25400" tIns="12700" rIns="25400" bIns="12700" numCol="1" spcCol="0" rtlCol="0" fromWordArt="0" anchor="ctr" anchorCtr="0" forceAA="0" compatLnSpc="1">
+                        <a:prstTxWarp prst="textNoShape">
+                          <a:avLst/>
+                        </a:prstTxWarp>
+                        <a:noAutofit/>
+                      </wps:bodyPr>
+                    </wps:wsp>
+                  </a:graphicData>
+                </a:graphic>
+              </wp:anchor>
+            </w:drawing>
+          </mc:Choice>
+          <mc:Fallback>
+            <w:pict>
+              <v:shape w14:anchorId="511F6360" id="Text Box 50" o:spid="_x0000_s1034" type="#_x0000_t202" style="position:absolute;margin-left:174.000pt;margin-top:300.000pt;width:68.000pt;height:12.000pt;mso-position-horizontal-relative:page;mso-position-vertical-relative:page;v-text-anchor:middle" o:gfxdata="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" o:allowincell="f" filled="f" stroked="f" strokeweight=".5pt">
+                <v:textbox inset="2pt,1pt,2pt,1pt">
+                  <w:txbxContent>
+                    <w:p>
+                      <w:pPr>
+                        <w:spacing w:after="0"/>
+                        <w:jc w:val="center"/>
+                        <w:rPr>
+                          <w:color w:val="000000"/>
+                          <w:sz w:val="14"/>
+                        </w:rPr>
+                      </w:pPr>
+                      <w:r>
+                        <w:rPr>
+                          <w:rFonts w:ascii="Arial" w:hAnsi="Arial"/>
+                          <w:sz w:val="14"/>
+                        </w:rPr>
+                        <w:t>Susceptibility map</w:t>
+                      </w:r>
+                    </w:p>
+                  </w:txbxContent>
+                </v:textbox>
+                <w10:wrap anchorx="page" anchory="page"/>
+              </v:shape>
+            </w:pict>
+          </mc:Fallback>
+        </mc:AlternateContent>
+      </w:r>
+      <w:r>
+        <w:rPr>
+          <w:noProof/>
+        </w:rPr>
+        <mc:AlternateContent>
+          <mc:Choice Requires="wps">
+            <w:drawing>
+              <wp:anchor distT="0" distB="0" distL="114300" distR="114300" simplePos="0" relativeHeight="251648512" behindDoc="0" locked="0" layoutInCell="0" allowOverlap="1" wp14:anchorId="6867DA3D" wp14:editId="751B5861">
+                <wp:simplePos x="0" y="0"/>
+                <wp:positionH relativeFrom="page">
+                  <wp:posOffset>1558053</wp:posOffset>
+                </wp:positionH>
+                <wp:positionV relativeFrom="page">
+                  <wp:posOffset>4046275</wp:posOffset>
+                </wp:positionV>
+                <wp:extent cx="1625600" cy="152400"/>
+                <wp:effectExtent l="0" t="0" r="0" b="0"/>
+                <wp:wrapNone/>
+                <wp:docPr id="51" name="Text Box 51"/>
+                <wp:cNvGraphicFramePr/>
+                <a:graphic xmlns:a="http://schemas.openxmlformats.org/drawingml/2006/main">
+                  <a:graphicData uri="http://schemas.microsoft.com/office/word/2010/wordprocessingShape">
+                    <wps:wsp>
+                      <wps:cNvSpPr txBox="1"/>
+                      <wps:spPr>
+                        <a:xfrm>
+                          <a:off x="0" y="0"/>
+                          <a:ext cx="1625600" cy="152400"/>
+                        </a:xfrm>
+                        <a:prstGeom prst="rect">
+                          <a:avLst/>
+                        </a:prstGeom>
+                        <a:noFill/>
+                        <a:ln w="6350">
+                          <a:noFill/>
+                        </a:ln>
+                        <a:extLst>
+                          <a:ext uri="{91240B29-F687-4F45-9708-019B960494DF}">
+                            <a14:hiddenLine xmlns:a14="http://schemas.microsoft.com/office/drawing/2010/main" w="6350">
+                              <a:solidFill>
+                                <a:prstClr val="black"/>
+                              </a:solidFill>
+                            </a14:hiddenLine>
+                          </a:ext>
+                        </a:extLst>
+                      </wps:spPr>
+                      <wps:txbx>
+                        <w:txbxContent>
+                          <w:p>
+                            <w:pPr>
+                              <w:spacing w:after="0"/>
+                              <w:jc w:val="center"/>
+                              <w:rPr>
+                                <w:color w:val="000000"/>
+                                <w:sz w:val="14"/>
+                              </w:rPr>
+                            </w:pPr>
+                            <w:r>
+                              <w:rPr>
+                                <w:rFonts w:ascii="Arial" w:hAnsi="Arial"/>
+                                <w:sz w:val="14"/>
+                              </w:rPr>
+                              <w:t>Result and explanation</w:t>
+                            </w:r>
+                          </w:p>
+                        </w:txbxContent>
+                      </wps:txbx>
+                      <wps:bodyPr rot="0" spcFirstLastPara="0" vertOverflow="overflow" horzOverflow="overflow" vert="horz" wrap="square" lIns="25400" tIns="12700" rIns="25400" bIns="12700" numCol="1" spcCol="0" rtlCol="0" fromWordArt="0" anchor="ctr" anchorCtr="0" forceAA="0" compatLnSpc="1">
+                        <a:prstTxWarp prst="textNoShape">
+                          <a:avLst/>
+                        </a:prstTxWarp>
+                        <a:noAutofit/>
+                      </wps:bodyPr>
+                    </wps:wsp>
+                  </a:graphicData>
+                </a:graphic>
+              </wp:anchor>
+            </w:drawing>
+          </mc:Choice>
+          <mc:Fallback>
+            <w:pict>
+              <v:shape w14:anchorId="6867DA3D" id="Text Box 51" o:spid="_x0000_s1035" type="#_x0000_t202" style="position:absolute;margin-left:122.7pt;margin-top:318.6pt;width:128pt;height:12pt;z-index:251648512;visibility:visible;mso-wrap-style:square;mso-wrap-distance-left:9pt;mso-wrap-distance-top:0;mso-wrap-distance-right:9pt;mso-wrap-distance-bottom:0;mso-position-horizontal:absolute;mso-position-horizontal-relative:page;mso-position-vertical:absolute;mso-position-vertical-relative:page;v-text-anchor:middle" o:gfxdata="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" o:allowincell="f" filled="f" stroked="f" strokeweight=".5pt">
+                <v:textbox inset="2pt,1pt,2pt,1pt">
+                  <w:txbxContent>
+                    <w:p>
+                      <w:pPr>
+                        <w:spacing w:after="0"/>
+                        <w:jc w:val="center"/>
+                        <w:rPr>
+                          <w:color w:val="000000"/>
+                          <w:sz w:val="14"/>
+                        </w:rPr>
+                      </w:pPr>
+                      <w:r>
+                        <w:rPr>
+                          <w:rFonts w:ascii="Arial" w:hAnsi="Arial"/>
+                          <w:sz w:val="14"/>
+                        </w:rPr>
+                        <w:t>Result and explanation</w:t>
+                      </w:r>
+                    </w:p>
+                  </w:txbxContent>
+                </v:textbox>
+                <w10:wrap anchorx="page" anchory="page"/>
+              </v:shape>
+            </w:pict>
+          </mc:Fallback>
+        </mc:AlternateContent>
+      </w:r>
+      <w:r>
+        <w:rPr>
+          <w:noProof/>
+        </w:rPr>
+        <mc:AlternateContent>
+          <mc:Choice Requires="wps">
+            <w:drawing>
+              <wp:anchor distT="0" distB="0" distL="114300" distR="114300" simplePos="0" relativeHeight="251654656" behindDoc="0" locked="0" layoutInCell="0" allowOverlap="1" wp14:anchorId="26385700" wp14:editId="33BF88B4">
+                <wp:simplePos x="0" y="0"/>
+                <wp:positionH relativeFrom="page">
+                  <wp:posOffset>1212222</wp:posOffset>
+                </wp:positionH>
+                <wp:positionV relativeFrom="page">
+                  <wp:posOffset>4254500</wp:posOffset>
+                </wp:positionV>
+                <wp:extent cx="2006600" cy="152400"/>
+                <wp:effectExtent l="0" t="0" r="0" b="0"/>
+                <wp:wrapNone/>
+                <wp:docPr id="52" name="Text Box 52"/>
+                <wp:cNvGraphicFramePr/>
+                <a:graphic xmlns:a="http://schemas.openxmlformats.org/drawingml/2006/main">
+                  <a:graphicData uri="http://schemas.microsoft.com/office/word/2010/wordprocessingShape">
+                    <wps:wsp>
+                      <wps:cNvSpPr txBox="1"/>
+                      <wps:spPr>
+                        <a:xfrm>
+                          <a:off x="0" y="0"/>
+                          <a:ext cx="2006600" cy="152400"/>
                         </a:xfrm>
                         <a:prstGeom prst="rect">
                           <a:avLst/>
@@ -715,27 +1361,10 @@
                             </w:pPr>
                             <w:r>
                               <w:rPr>
-                                <w:color w:val="000000"/>
-                                <w:sz w:val="13"/>
+                                <w:rFonts w:ascii="Arial" w:hAnsi="Arial"/>
+                                <w:sz w:val="14"/>
                               </w:rPr>
-                              <w:t>Review sources, maps,</w:t>
-                            </w:r>
-                          </w:p>
-                          <w:p>
-                            <w:pPr>
-                              <w:spacing w:after="0"/>
-                              <w:jc w:val="center"/>
-                              <w:rPr>
-                                <w:color w:val="000000"/>
-                                <w:sz w:val="13"/>
-                              </w:rPr>
-                            </w:pPr>
-                            <w:r>
-                              <w:rPr>
-                                <w:color w:val="000000"/>
-                                <w:sz w:val="13"/>
-                              </w:rPr>
-                              <w:t>DSS, and centers</w:t>
+                              <w:t>Preparedness / center information</w:t>
                             </w:r>
                           </w:p>
                         </w:txbxContent>
@@ -754,7 +1383,7 @@
           </mc:Choice>
           <mc:Fallback>
             <w:pict>
-              <v:shape w14:anchorId="47B445D4" id="Text Box 58" o:spid="_x0000_s1030" type="#_x0000_t202" style="position:absolute;margin-left:127.7pt;margin-top:408.55pt;width:164pt;height:23pt;z-index:251687424;visibility:visible;mso-wrap-style:square;mso-wrap-distance-left:9pt;mso-wrap-distance-top:0;mso-wrap-distance-right:9pt;mso-wrap-distance-bottom:0;mso-position-horizontal:absolute;mso-position-horizontal-relative:page;mso-position-vertical:absolute;mso-position-vertical-relative:page;v-text-anchor:middle" o:gfxdata="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" o:allowincell="f" filled="f" stroked="f" strokeweight=".5pt">
+              <v:shape w14:anchorId="26385700" id="Text Box 52" o:spid="_x0000_s1036" type="#_x0000_t202" style="position:absolute;margin-left:95.45pt;margin-top:335pt;width:158pt;height:12pt;z-index:251654656;visibility:visible;mso-wrap-style:square;mso-wrap-distance-left:9pt;mso-wrap-distance-top:0;mso-wrap-distance-right:9pt;mso-wrap-distance-bottom:0;mso-position-horizontal:absolute;mso-position-horizontal-relative:page;mso-position-vertical:absolute;mso-position-vertical-relative:page;v-text-anchor:middle" o:gfxdata="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" o:allowincell="f" filled="f" stroked="f" strokeweight=".5pt">
                 <v:textbox inset="2pt,1pt,2pt,1pt">
                   <w:txbxContent>
                     <w:p>
@@ -768,27 +1397,10 @@
                       </w:pPr>
                       <w:r>
                         <w:rPr>
-                          <w:color w:val="000000"/>
-                          <w:sz w:val="13"/>
+                          <w:rFonts w:ascii="Arial" w:hAnsi="Arial"/>
+                          <w:sz w:val="14"/>
                         </w:rPr>
-                        <w:t>Review sources, maps,</w:t>
-                      </w:r>
-                    </w:p>
-                    <w:p>
-                      <w:pPr>
-                        <w:spacing w:after="0"/>
-                        <w:jc w:val="center"/>
-                        <w:rPr>
-                          <w:color w:val="000000"/>
-                          <w:sz w:val="13"/>
-                        </w:rPr>
-                      </w:pPr>
-                      <w:r>
-                        <w:rPr>
-                          <w:color w:val="000000"/>
-                          <w:sz w:val="13"/>
-                        </w:rPr>
-                        <w:t>DSS, and centers</w:t>
+                        <w:t>Preparedness / center information</w:t>
                       </w:r>
                     </w:p>
                   </w:txbxContent>
@@ -806,18 +1418,18 @@
         <mc:AlternateContent>
           <mc:Choice Requires="wps">
             <w:drawing>
-              <wp:anchor distT="0" distB="0" distL="114300" distR="114300" simplePos="0" relativeHeight="251693568" behindDoc="0" locked="0" layoutInCell="0" allowOverlap="1" wp14:anchorId="1AE8435C" wp14:editId="5BDBE962">
+              <wp:anchor distT="0" distB="0" distL="114300" distR="114300" simplePos="0" relativeHeight="251630080" behindDoc="0" locked="0" layoutInCell="0" allowOverlap="1" wp14:anchorId="5EA938F3" wp14:editId="6419E8B8">
                 <wp:simplePos x="0" y="0"/>
                 <wp:positionH relativeFrom="page">
-                  <wp:posOffset>1543657</wp:posOffset>
+                  <wp:posOffset>1831410</wp:posOffset>
                 </wp:positionH>
                 <wp:positionV relativeFrom="page">
-                  <wp:posOffset>5927698</wp:posOffset>
+                  <wp:posOffset>1538716</wp:posOffset>
                 </wp:positionV>
-                <wp:extent cx="1803400" cy="228600"/>
-                <wp:effectExtent l="0" t="0" r="6350" b="0"/>
+                <wp:extent cx="1676400" cy="152400"/>
+                <wp:effectExtent l="0" t="0" r="0" b="0"/>
                 <wp:wrapNone/>
-                <wp:docPr id="59" name="Text Box 59"/>
+                <wp:docPr id="48" name="Text Box 48"/>
                 <wp:cNvGraphicFramePr/>
                 <a:graphic xmlns:a="http://schemas.openxmlformats.org/drawingml/2006/main">
                   <a:graphicData uri="http://schemas.microsoft.com/office/word/2010/wordprocessingShape">
@@ -826,150 +1438,7 @@
                       <wps:spPr>
                         <a:xfrm>
                           <a:off x="0" y="0"/>
-                          <a:ext cx="1803400" cy="228600"/>
-                        </a:xfrm>
-                        <a:prstGeom prst="rect">
-                          <a:avLst/>
-                        </a:prstGeom>
-                        <a:noFill/>
-                        <a:ln w="6350">
-                          <a:noFill/>
-                        </a:ln>
-                        <a:extLst>
-                          <a:ext uri="{91240B29-F687-4F45-9708-019B960494DF}">
-                            <a14:hiddenLine xmlns:a14="http://schemas.microsoft.com/office/drawing/2010/main" w="6350">
-                              <a:solidFill>
-                                <a:prstClr val="black"/>
-                              </a:solidFill>
-                            </a14:hiddenLine>
-                          </a:ext>
-                        </a:extLst>
-                      </wps:spPr>
-                      <wps:txbx>
-                        <w:txbxContent>
-                          <w:p>
-                            <w:pPr>
-                              <w:spacing w:after="0"/>
-                              <w:jc w:val="center"/>
-                              <w:rPr>
-                                <w:color w:val="000000"/>
-                                <w:sz w:val="13"/>
-                              </w:rPr>
-                            </w:pPr>
-                            <w:r>
-                              <w:rPr>
-                                <w:color w:val="000000"/>
-                                <w:sz w:val="13"/>
-                              </w:rPr>
-                              <w:t>Review / publish</w:t>
-                            </w:r>
-                          </w:p>
-                          <w:p>
-                            <w:pPr>
-                              <w:spacing w:after="0"/>
-                              <w:jc w:val="center"/>
-                              <w:rPr>
-                                <w:color w:val="000000"/>
-                                <w:sz w:val="13"/>
-                              </w:rPr>
-                            </w:pPr>
-                            <w:r>
-                              <w:rPr>
-                                <w:color w:val="000000"/>
-                                <w:sz w:val="13"/>
-                              </w:rPr>
-                              <w:t>eligible content</w:t>
-                            </w:r>
-                          </w:p>
-                        </w:txbxContent>
-                      </wps:txbx>
-                      <wps:bodyPr rot="0" spcFirstLastPara="0" vertOverflow="overflow" horzOverflow="overflow" vert="horz" wrap="square" lIns="25400" tIns="12700" rIns="25400" bIns="12700" numCol="1" spcCol="0" rtlCol="0" fromWordArt="0" anchor="ctr" anchorCtr="0" forceAA="0" compatLnSpc="1">
-                        <a:prstTxWarp prst="textNoShape">
-                          <a:avLst/>
-                        </a:prstTxWarp>
-                        <a:noAutofit/>
-                      </wps:bodyPr>
-                    </wps:wsp>
-                  </a:graphicData>
-                </a:graphic>
-              </wp:anchor>
-            </w:drawing>
-          </mc:Choice>
-          <mc:Fallback>
-            <w:pict>
-              <v:shape w14:anchorId="1AE8435C" id="Text Box 59" o:spid="_x0000_s1031" type="#_x0000_t202" style="position:absolute;margin-left:121.55pt;margin-top:466.75pt;width:142pt;height:18pt;z-index:251693568;visibility:visible;mso-wrap-style:square;mso-wrap-distance-left:9pt;mso-wrap-distance-top:0;mso-wrap-distance-right:9pt;mso-wrap-distance-bottom:0;mso-position-horizontal:absolute;mso-position-horizontal-relative:page;mso-position-vertical:absolute;mso-position-vertical-relative:page;v-text-anchor:middle" o:gfxdata="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" o:allowincell="f" filled="f" stroked="f" strokeweight=".5pt">
-                <v:textbox inset="2pt,1pt,2pt,1pt">
-                  <w:txbxContent>
-                    <w:p>
-                      <w:pPr>
-                        <w:spacing w:after="0"/>
-                        <w:jc w:val="center"/>
-                        <w:rPr>
-                          <w:color w:val="000000"/>
-                          <w:sz w:val="13"/>
-                        </w:rPr>
-                      </w:pPr>
-                      <w:r>
-                        <w:rPr>
-                          <w:color w:val="000000"/>
-                          <w:sz w:val="13"/>
-                        </w:rPr>
-                        <w:t>Review / publish</w:t>
-                      </w:r>
-                    </w:p>
-                    <w:p>
-                      <w:pPr>
-                        <w:spacing w:after="0"/>
-                        <w:jc w:val="center"/>
-                        <w:rPr>
-                          <w:color w:val="000000"/>
-                          <w:sz w:val="13"/>
-                        </w:rPr>
-                      </w:pPr>
-                      <w:r>
-                        <w:rPr>
-                          <w:color w:val="000000"/>
-                          <w:sz w:val="13"/>
-                        </w:rPr>
-                        <w:t>eligible content</w:t>
-                      </w:r>
-                    </w:p>
-                  </w:txbxContent>
-                </v:textbox>
-                <w10:wrap anchorx="page" anchory="page"/>
-              </v:shape>
-            </w:pict>
-          </mc:Fallback>
-        </mc:AlternateContent>
-      </w:r>
-      <w:r>
-        <w:rPr>
-          <w:noProof/>
-        </w:rPr>
-        <mc:AlternateContent>
-          <mc:Choice Requires="wps">
-            <w:drawing>
-              <wp:anchor distT="0" distB="0" distL="114300" distR="114300" simplePos="0" relativeHeight="251681280" behindDoc="0" locked="0" layoutInCell="0" allowOverlap="1" wp14:anchorId="4E0BF446" wp14:editId="5A8DD929">
-                <wp:simplePos x="0" y="0"/>
-                <wp:positionH relativeFrom="page">
-                  <wp:posOffset>2011238</wp:posOffset>
-                </wp:positionH>
-                <wp:positionV relativeFrom="page">
-                  <wp:posOffset>4811312</wp:posOffset>
-                </wp:positionV>
-                <wp:extent cx="1841500" cy="152400"/>
-                <wp:effectExtent l="0" t="0" r="6350" b="0"/>
-                <wp:wrapNone/>
-                <wp:docPr id="57" name="Text Box 57"/>
-                <wp:cNvGraphicFramePr/>
-                <a:graphic xmlns:a="http://schemas.openxmlformats.org/drawingml/2006/main">
-                  <a:graphicData uri="http://schemas.microsoft.com/office/word/2010/wordprocessingShape">
-                    <wps:wsp>
-                      <wps:cNvSpPr txBox="1"/>
-                      <wps:spPr>
-                        <a:xfrm>
-                          <a:off x="0" y="0"/>
-                          <a:ext cx="1841500" cy="152400"/>
+                          <a:ext cx="1676400" cy="152400"/>
                         </a:xfrm>
                         <a:prstGeom prst="rect">
                           <a:avLst/>
@@ -1001,10 +1470,10 @@
                             </w:pPr>
                             <w:r>
                               <w:rPr>
-                                <w:color w:val="000000"/>
+                                <w:rFonts w:ascii="Arial" w:hAnsi="Arial"/>
                                 <w:sz w:val="14"/>
                               </w:rPr>
-                              <w:t>Administrative Log In</w:t>
+                              <w:t>Confirmed assessment inputs</w:t>
                             </w:r>
                           </w:p>
                         </w:txbxContent>
@@ -1023,7 +1492,7 @@
           </mc:Choice>
           <mc:Fallback>
             <w:pict>
-              <v:shape w14:anchorId="4E0BF446" id="Text Box 57" o:spid="_x0000_s1032" type="#_x0000_t202" style="position:absolute;margin-left:158.35pt;margin-top:378.85pt;width:145pt;height:12pt;z-index:251681280;visibility:visible;mso-wrap-style:square;mso-wrap-distance-left:9pt;mso-wrap-distance-top:0;mso-wrap-distance-right:9pt;mso-wrap-distance-bottom:0;mso-position-horizontal:absolute;mso-position-horizontal-relative:page;mso-position-vertical:absolute;mso-position-vertical-relative:page;v-text-anchor:middle" o:gfxdata="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" o:allowincell="f" filled="f" stroked="f" strokeweight=".5pt">
+              <v:shape w14:anchorId="5EA938F3" id="Text Box 48" o:spid="_x0000_s1037" type="#_x0000_t202" style="position:absolute;margin-left:144.2pt;margin-top:121.15pt;width:132pt;height:12pt;z-index:251630080;visibility:visible;mso-wrap-style:square;mso-wrap-distance-left:9pt;mso-wrap-distance-top:0;mso-wrap-distance-right:9pt;mso-wrap-distance-bottom:0;mso-position-horizontal:absolute;mso-position-horizontal-relative:page;mso-position-vertical:absolute;mso-position-vertical-relative:page;v-text-anchor:middle" o:gfxdata="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" o:allowincell="f" filled="f" stroked="f" strokeweight=".5pt">
                 <v:textbox inset="2pt,1pt,2pt,1pt">
                   <w:txbxContent>
                     <w:p>
@@ -1037,10 +1506,10 @@
                       </w:pPr>
                       <w:r>
                         <w:rPr>
-                          <w:color w:val="000000"/>
+                          <w:rFonts w:ascii="Arial" w:hAnsi="Arial"/>
                           <w:sz w:val="14"/>
                         </w:rPr>
-                        <w:t>Administrative Log In</w:t>
+                        <w:t>Confirmed assessment inputs</w:t>
                       </w:r>
                     </w:p>
                   </w:txbxContent>
@@ -1058,171 +1527,18 @@
         <mc:AlternateContent>
           <mc:Choice Requires="wps">
             <w:drawing>
-              <wp:anchor distT="0" distB="0" distL="114300" distR="114300" simplePos="0" relativeHeight="251598336" behindDoc="0" locked="0" layoutInCell="0" allowOverlap="1" wp14:anchorId="27302A30" wp14:editId="2EE22649">
+              <wp:anchor distT="0" distB="0" distL="114300" distR="114300" simplePos="0" relativeHeight="251636224" behindDoc="0" locked="0" layoutInCell="0" allowOverlap="1" wp14:anchorId="117ED4C6" wp14:editId="38F2285D">
                 <wp:simplePos x="0" y="0"/>
                 <wp:positionH relativeFrom="page">
-                  <wp:posOffset>4727574</wp:posOffset>
+                  <wp:posOffset>1734178</wp:posOffset>
                 </wp:positionH>
                 <wp:positionV relativeFrom="page">
-                  <wp:posOffset>2997200</wp:posOffset>
+                  <wp:posOffset>1788048</wp:posOffset>
                 </wp:positionV>
-                <wp:extent cx="835025" cy="0"/>
+                <wp:extent cx="1905000" cy="152400"/>
                 <wp:effectExtent l="0" t="0" r="0" b="0"/>
                 <wp:wrapNone/>
-                <wp:docPr id="26" name="Straight Connector 26"/>
-                <wp:cNvGraphicFramePr/>
-                <a:graphic xmlns:a="http://schemas.openxmlformats.org/drawingml/2006/main">
-                  <a:graphicData uri="http://schemas.microsoft.com/office/word/2010/wordprocessingShape">
-                    <wps:wsp>
-                      <wps:cNvCnPr/>
-                      <wps:spPr>
-                        <a:xfrm flipH="1">
-                          <a:off x="0" y="0"/>
-                          <a:ext cx="835025" cy="0"/>
-                        </a:xfrm>
-                        <a:prstGeom prst="line">
-                          <a:avLst/>
-                        </a:prstGeom>
-                        <a:ln w="10795">
-                          <a:solidFill>
-                            <a:srgbClr val="000000"/>
-                          </a:solidFill>
-                          <a:headEnd type="none"/>
-                          <a:tailEnd type="none"/>
-                        </a:ln>
-                      </wps:spPr>
-                      <wps:style>
-                        <a:lnRef idx="1">
-                          <a:schemeClr val="accent1"/>
-                        </a:lnRef>
-                        <a:fillRef idx="0">
-                          <a:schemeClr val="accent1"/>
-                        </a:fillRef>
-                        <a:effectRef idx="0">
-                          <a:schemeClr val="accent1"/>
-                        </a:effectRef>
-                        <a:fontRef idx="minor">
-                          <a:schemeClr val="tx1"/>
-                        </a:fontRef>
-                      </wps:style>
-                      <wps:bodyPr/>
-                    </wps:wsp>
-                  </a:graphicData>
-                </a:graphic>
-                <wp14:sizeRelH relativeFrom="margin">
-                  <wp14:pctWidth>0</wp14:pctWidth>
-                </wp14:sizeRelH>
-                <wp14:sizeRelV relativeFrom="margin">
-                  <wp14:pctHeight>0</wp14:pctHeight>
-                </wp14:sizeRelV>
-              </wp:anchor>
-            </w:drawing>
-          </mc:Choice>
-          <mc:Fallback>
-            <w:pict>
-              <v:line w14:anchorId="4B0AC424" id="Straight Connector 26" o:spid="_x0000_s1026" style="position:absolute;flip:x;z-index:251598336;visibility:visible;mso-wrap-style:square;mso-width-percent:0;mso-height-percent:0;mso-wrap-distance-left:9pt;mso-wrap-distance-top:0;mso-wrap-distance-right:9pt;mso-wrap-distance-bottom:0;mso-position-horizontal:absolute;mso-position-horizontal-relative:page;mso-position-vertical:absolute;mso-position-vertical-relative:page;mso-width-percent:0;mso-height-percent:0;mso-width-relative:margin;mso-height-relative:margin" from="372.25pt,236pt" to="438pt,236pt" o:gfxdata="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" o:allowincell="f" strokeweight=".85pt">
-                <w10:wrap anchorx="page" anchory="page"/>
-              </v:line>
-            </w:pict>
-          </mc:Fallback>
-        </mc:AlternateContent>
-      </w:r>
-      <w:r>
-        <w:rPr>
-          <w:noProof/>
-        </w:rPr>
-        <mc:AlternateContent>
-          <mc:Choice Requires="wps">
-            <w:drawing>
-              <wp:anchor distT="0" distB="0" distL="114300" distR="114300" simplePos="0" relativeHeight="251604480" behindDoc="0" locked="0" layoutInCell="0" allowOverlap="1" wp14:anchorId="3752A51A" wp14:editId="048AECC2">
-                <wp:simplePos x="0" y="0"/>
-                <wp:positionH relativeFrom="page">
-                  <wp:posOffset>4730750</wp:posOffset>
-                </wp:positionH>
-                <wp:positionV relativeFrom="page">
-                  <wp:posOffset>2997200</wp:posOffset>
-                </wp:positionV>
-                <wp:extent cx="0" cy="638175"/>
-                <wp:effectExtent l="76200" t="0" r="76200" b="47625"/>
-                <wp:wrapNone/>
-                <wp:docPr id="28" name="Straight Connector 28"/>
-                <wp:cNvGraphicFramePr/>
-                <a:graphic xmlns:a="http://schemas.openxmlformats.org/drawingml/2006/main">
-                  <a:graphicData uri="http://schemas.microsoft.com/office/word/2010/wordprocessingShape">
-                    <wps:wsp>
-                      <wps:cNvCnPr/>
-                      <wps:spPr>
-                        <a:xfrm flipH="1">
-                          <a:off x="0" y="0"/>
-                          <a:ext cx="0" cy="638175"/>
-                        </a:xfrm>
-                        <a:prstGeom prst="line">
-                          <a:avLst/>
-                        </a:prstGeom>
-                        <a:ln w="10795">
-                          <a:solidFill>
-                            <a:srgbClr val="000000"/>
-                          </a:solidFill>
-                          <a:headEnd type="none"/>
-                          <a:tailEnd type="triangle"/>
-                        </a:ln>
-                      </wps:spPr>
-                      <wps:style>
-                        <a:lnRef idx="1">
-                          <a:schemeClr val="accent1"/>
-                        </a:lnRef>
-                        <a:fillRef idx="0">
-                          <a:schemeClr val="accent1"/>
-                        </a:fillRef>
-                        <a:effectRef idx="0">
-                          <a:schemeClr val="accent1"/>
-                        </a:effectRef>
-                        <a:fontRef idx="minor">
-                          <a:schemeClr val="tx1"/>
-                        </a:fontRef>
-                      </wps:style>
-                      <wps:bodyPr/>
-                    </wps:wsp>
-                  </a:graphicData>
-                </a:graphic>
-                <wp14:sizeRelH relativeFrom="margin">
-                  <wp14:pctWidth>0</wp14:pctWidth>
-                </wp14:sizeRelH>
-                <wp14:sizeRelV relativeFrom="margin">
-                  <wp14:pctHeight>0</wp14:pctHeight>
-                </wp14:sizeRelV>
-              </wp:anchor>
-            </w:drawing>
-          </mc:Choice>
-          <mc:Fallback>
-            <w:pict>
-              <v:line w14:anchorId="15511AB9" id="Straight Connector 28" o:spid="_x0000_s1026" style="position:absolute;flip:x;z-index:251604480;visibility:visible;mso-wrap-style:square;mso-width-percent:0;mso-height-percent:0;mso-wrap-distance-left:9pt;mso-wrap-distance-top:0;mso-wrap-distance-right:9pt;mso-wrap-distance-bottom:0;mso-position-horizontal:absolute;mso-position-horizontal-relative:page;mso-position-vertical:absolute;mso-position-vertical-relative:page;mso-width-percent:0;mso-height-percent:0;mso-width-relative:margin;mso-height-relative:margin" from="372.5pt,236pt" to="372.5pt,286.25pt" o:gfxdata="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" o:allowincell="f" strokeweight=".85pt">
-                <v:stroke endarrow="block"/>
-                <w10:wrap anchorx="page" anchory="page"/>
-              </v:line>
-            </w:pict>
-          </mc:Fallback>
-        </mc:AlternateContent>
-      </w:r>
-      <w:r>
-        <w:rPr>
-          <w:noProof/>
-        </w:rPr>
-        <mc:AlternateContent>
-          <mc:Choice Requires="wps">
-            <w:drawing>
-              <wp:anchor distT="0" distB="0" distL="114300" distR="114300" simplePos="0" relativeHeight="251660800" behindDoc="0" locked="0" layoutInCell="0" allowOverlap="1" wp14:anchorId="7BE9485B" wp14:editId="7F54F32A">
-                <wp:simplePos x="0" y="0"/>
-                <wp:positionH relativeFrom="page">
-                  <wp:posOffset>4527550</wp:posOffset>
-                </wp:positionH>
-                <wp:positionV relativeFrom="page">
-                  <wp:posOffset>1981200</wp:posOffset>
-                </wp:positionV>
-                <wp:extent cx="704850" cy="279400"/>
-                <wp:effectExtent l="0" t="0" r="0" b="6350"/>
-                <wp:wrapNone/>
-                <wp:docPr id="53" name="Text Box 53"/>
+                <wp:docPr id="49" name="Text Box 49"/>
                 <wp:cNvGraphicFramePr/>
                 <a:graphic xmlns:a="http://schemas.openxmlformats.org/drawingml/2006/main">
                   <a:graphicData uri="http://schemas.microsoft.com/office/word/2010/wordprocessingShape">
@@ -1231,419 +1547,7 @@
                       <wps:spPr>
                         <a:xfrm>
                           <a:off x="0" y="0"/>
-                          <a:ext cx="704850" cy="279400"/>
-                        </a:xfrm>
-                        <a:prstGeom prst="rect">
-                          <a:avLst/>
-                        </a:prstGeom>
-                        <a:noFill/>
-                        <a:ln w="6350">
-                          <a:noFill/>
-                        </a:ln>
-                        <a:extLst>
-                          <a:ext uri="{91240B29-F687-4F45-9708-019B960494DF}">
-                            <a14:hiddenLine xmlns:a14="http://schemas.microsoft.com/office/drawing/2010/main" w="6350">
-                              <a:solidFill>
-                                <a:prstClr val="black"/>
-                              </a:solidFill>
-                            </a14:hiddenLine>
-                          </a:ext>
-                        </a:extLst>
-                      </wps:spPr>
-                      <wps:txbx>
-                        <w:txbxContent>
-                          <w:p>
-                            <w:pPr>
-                              <w:spacing w:after="0"/>
-                              <w:jc w:val="center"/>
-                              <w:rPr>
-                                <w:color w:val="000000"/>
-                                <w:sz w:val="13"/>
-                              </w:rPr>
-                            </w:pPr>
-                            <w:r>
-                              <w:rPr>
-                                <w:color w:val="000000"/>
-                                <w:sz w:val="13"/>
-                              </w:rPr>
-                              <w:t>Spatial references</w:t>
-                            </w:r>
-                          </w:p>
-                        </w:txbxContent>
-                      </wps:txbx>
-                      <wps:bodyPr rot="0" spcFirstLastPara="0" vertOverflow="overflow" horzOverflow="overflow" vert="horz" wrap="square" lIns="25400" tIns="12700" rIns="25400" bIns="12700" numCol="1" spcCol="0" rtlCol="0" fromWordArt="0" anchor="ctr" anchorCtr="0" forceAA="0" compatLnSpc="1">
-                        <a:prstTxWarp prst="textNoShape">
-                          <a:avLst/>
-                        </a:prstTxWarp>
-                        <a:noAutofit/>
-                      </wps:bodyPr>
-                    </wps:wsp>
-                  </a:graphicData>
-                </a:graphic>
-                <wp14:sizeRelH relativeFrom="margin">
-                  <wp14:pctWidth>0</wp14:pctWidth>
-                </wp14:sizeRelH>
-                <wp14:sizeRelV relativeFrom="margin">
-                  <wp14:pctHeight>0</wp14:pctHeight>
-                </wp14:sizeRelV>
-              </wp:anchor>
-            </w:drawing>
-          </mc:Choice>
-          <mc:Fallback>
-            <w:pict>
-              <v:shape w14:anchorId="7BE9485B" id="Text Box 53" o:spid="_x0000_s1033" type="#_x0000_t202" style="position:absolute;margin-left:356.5pt;margin-top:156pt;width:55.5pt;height:22pt;z-index:251660800;visibility:visible;mso-wrap-style:square;mso-width-percent:0;mso-height-percent:0;mso-wrap-distance-left:9pt;mso-wrap-distance-top:0;mso-wrap-distance-right:9pt;mso-wrap-distance-bottom:0;mso-position-horizontal:absolute;mso-position-horizontal-relative:page;mso-position-vertical:absolute;mso-position-vertical-relative:page;mso-width-percent:0;mso-height-percent:0;mso-width-relative:margin;mso-height-relative:margin;v-text-anchor:middle" o:gfxdata="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" o:allowincell="f" filled="f" stroked="f" strokeweight=".5pt">
-                <v:textbox inset="2pt,1pt,2pt,1pt">
-                  <w:txbxContent>
-                    <w:p>
-                      <w:pPr>
-                        <w:spacing w:after="0"/>
-                        <w:jc w:val="center"/>
-                        <w:rPr>
-                          <w:color w:val="000000"/>
-                          <w:sz w:val="13"/>
-                        </w:rPr>
-                      </w:pPr>
-                      <w:r>
-                        <w:rPr>
-                          <w:color w:val="000000"/>
-                          <w:sz w:val="13"/>
-                        </w:rPr>
-                        <w:t>Spatial references</w:t>
-                      </w:r>
-                    </w:p>
-                  </w:txbxContent>
-                </v:textbox>
-                <w10:wrap anchorx="page" anchory="page"/>
-              </v:shape>
-            </w:pict>
-          </mc:Fallback>
-        </mc:AlternateContent>
-      </w:r>
-      <w:r>
-        <w:rPr>
-          <w:noProof/>
-        </w:rPr>
-        <mc:AlternateContent>
-          <mc:Choice Requires="wps">
-            <w:drawing>
-              <wp:anchor distT="0" distB="0" distL="114300" distR="114300" simplePos="0" relativeHeight="251592192" behindDoc="0" locked="0" layoutInCell="0" allowOverlap="1" wp14:anchorId="2E2F4700" wp14:editId="74FB7939">
-                <wp:simplePos x="0" y="0"/>
-                <wp:positionH relativeFrom="page">
-                  <wp:posOffset>4315767</wp:posOffset>
-                </wp:positionH>
-                <wp:positionV relativeFrom="page">
-                  <wp:posOffset>1416818</wp:posOffset>
-                </wp:positionV>
-                <wp:extent cx="0" cy="2214266"/>
-                <wp:effectExtent l="76200" t="0" r="95250" b="52705"/>
-                <wp:wrapNone/>
-                <wp:docPr id="15" name="Straight Connector 15"/>
-                <wp:cNvGraphicFramePr/>
-                <a:graphic xmlns:a="http://schemas.openxmlformats.org/drawingml/2006/main">
-                  <a:graphicData uri="http://schemas.microsoft.com/office/word/2010/wordprocessingShape">
-                    <wps:wsp>
-                      <wps:cNvCnPr/>
-                      <wps:spPr>
-                        <a:xfrm>
-                          <a:off x="0" y="0"/>
-                          <a:ext cx="0" cy="2214266"/>
-                        </a:xfrm>
-                        <a:prstGeom prst="line">
-                          <a:avLst/>
-                        </a:prstGeom>
-                        <a:ln w="10795">
-                          <a:solidFill>
-                            <a:srgbClr val="000000"/>
-                          </a:solidFill>
-                          <a:headEnd type="none"/>
-                          <a:tailEnd type="triangle"/>
-                        </a:ln>
-                      </wps:spPr>
-                      <wps:style>
-                        <a:lnRef idx="1">
-                          <a:schemeClr val="accent1"/>
-                        </a:lnRef>
-                        <a:fillRef idx="0">
-                          <a:schemeClr val="accent1"/>
-                        </a:fillRef>
-                        <a:effectRef idx="0">
-                          <a:schemeClr val="accent1"/>
-                        </a:effectRef>
-                        <a:fontRef idx="minor">
-                          <a:schemeClr val="tx1"/>
-                        </a:fontRef>
-                      </wps:style>
-                      <wps:bodyPr/>
-                    </wps:wsp>
-                  </a:graphicData>
-                </a:graphic>
-                <wp14:sizeRelV relativeFrom="margin">
-                  <wp14:pctHeight>0</wp14:pctHeight>
-                </wp14:sizeRelV>
-              </wp:anchor>
-            </w:drawing>
-          </mc:Choice>
-          <mc:Fallback>
-            <w:pict>
-              <v:line w14:anchorId="0C6D63CD" id="Straight Connector 15" o:spid="_x0000_s1026" style="position:absolute;z-index:251592192;visibility:visible;mso-wrap-style:square;mso-height-percent:0;mso-wrap-distance-left:9pt;mso-wrap-distance-top:0;mso-wrap-distance-right:9pt;mso-wrap-distance-bottom:0;mso-position-horizontal:absolute;mso-position-horizontal-relative:page;mso-position-vertical:absolute;mso-position-vertical-relative:page;mso-height-percent:0;mso-height-relative:margin" from="339.8pt,111.55pt" to="339.8pt,285.9pt" o:gfxdata="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" o:allowincell="f" strokeweight=".85pt">
-                <v:stroke endarrow="block"/>
-                <w10:wrap anchorx="page" anchory="page"/>
-              </v:line>
-            </w:pict>
-          </mc:Fallback>
-        </mc:AlternateContent>
-      </w:r>
-      <w:r>
-        <w:rPr>
-          <w:noProof/>
-        </w:rPr>
-        <mc:AlternateContent>
-          <mc:Choice Requires="wps">
-            <w:drawing>
-              <wp:anchor distT="0" distB="0" distL="114300" distR="114300" simplePos="0" relativeHeight="251573760" behindDoc="0" locked="0" layoutInCell="0" allowOverlap="1" wp14:anchorId="598C95F7" wp14:editId="419A3A4C">
-                <wp:simplePos x="0" y="0"/>
-                <wp:positionH relativeFrom="page">
-                  <wp:posOffset>1421841</wp:posOffset>
-                </wp:positionH>
-                <wp:positionV relativeFrom="page">
-                  <wp:posOffset>1421842</wp:posOffset>
-                </wp:positionV>
-                <wp:extent cx="2893925" cy="0"/>
-                <wp:effectExtent l="0" t="0" r="0" b="0"/>
-                <wp:wrapNone/>
-                <wp:docPr id="8" name="Straight Connector 8"/>
-                <wp:cNvGraphicFramePr/>
-                <a:graphic xmlns:a="http://schemas.openxmlformats.org/drawingml/2006/main">
-                  <a:graphicData uri="http://schemas.microsoft.com/office/word/2010/wordprocessingShape">
-                    <wps:wsp>
-                      <wps:cNvCnPr/>
-                      <wps:spPr>
-                        <a:xfrm>
-                          <a:off x="0" y="0"/>
-                          <a:ext cx="2893925" cy="0"/>
-                        </a:xfrm>
-                        <a:prstGeom prst="line">
-                          <a:avLst/>
-                        </a:prstGeom>
-                        <a:ln w="10795">
-                          <a:solidFill>
-                            <a:srgbClr val="000000"/>
-                          </a:solidFill>
-                          <a:headEnd type="none"/>
-                          <a:tailEnd type="none"/>
-                        </a:ln>
-                      </wps:spPr>
-                      <wps:style>
-                        <a:lnRef idx="1">
-                          <a:schemeClr val="accent1"/>
-                        </a:lnRef>
-                        <a:fillRef idx="0">
-                          <a:schemeClr val="accent1"/>
-                        </a:fillRef>
-                        <a:effectRef idx="0">
-                          <a:schemeClr val="accent1"/>
-                        </a:effectRef>
-                        <a:fontRef idx="minor">
-                          <a:schemeClr val="tx1"/>
-                        </a:fontRef>
-                      </wps:style>
-                      <wps:bodyPr/>
-                    </wps:wsp>
-                  </a:graphicData>
-                </a:graphic>
-                <wp14:sizeRelH relativeFrom="margin">
-                  <wp14:pctWidth>0</wp14:pctWidth>
-                </wp14:sizeRelH>
-              </wp:anchor>
-            </w:drawing>
-          </mc:Choice>
-          <mc:Fallback>
-            <w:pict>
-              <v:line w14:anchorId="5D35D497" id="Straight Connector 8" o:spid="_x0000_s1026" style="position:absolute;z-index:251573760;visibility:visible;mso-wrap-style:square;mso-width-percent:0;mso-wrap-distance-left:9pt;mso-wrap-distance-top:0;mso-wrap-distance-right:9pt;mso-wrap-distance-bottom:0;mso-position-horizontal:absolute;mso-position-horizontal-relative:page;mso-position-vertical:absolute;mso-position-vertical-relative:page;mso-width-percent:0;mso-width-relative:margin" from="111.95pt,111.95pt" to="339.8pt,111.95pt" o:gfxdata="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" o:allowincell="f" strokeweight=".85pt">
-                <w10:wrap anchorx="page" anchory="page"/>
-              </v:line>
-            </w:pict>
-          </mc:Fallback>
-        </mc:AlternateContent>
-      </w:r>
-      <w:r>
-        <w:rPr>
-          <w:noProof/>
-        </w:rPr>
-        <mc:AlternateContent>
-          <mc:Choice Requires="wps">
-            <w:drawing>
-              <wp:anchor distT="0" distB="0" distL="114300" distR="114300" simplePos="0" relativeHeight="251579904" behindDoc="0" locked="0" layoutInCell="0" allowOverlap="1" wp14:anchorId="7BC5786F" wp14:editId="238B69BA">
-                <wp:simplePos x="0" y="0"/>
-                <wp:positionH relativeFrom="page">
-                  <wp:posOffset>3421052</wp:posOffset>
-                </wp:positionH>
-                <wp:positionV relativeFrom="page">
-                  <wp:posOffset>1933728</wp:posOffset>
-                </wp:positionV>
-                <wp:extent cx="5436" cy="1697913"/>
-                <wp:effectExtent l="76200" t="0" r="71120" b="55245"/>
-                <wp:wrapNone/>
-                <wp:docPr id="9" name="Straight Connector 9"/>
-                <wp:cNvGraphicFramePr/>
-                <a:graphic xmlns:a="http://schemas.openxmlformats.org/drawingml/2006/main">
-                  <a:graphicData uri="http://schemas.microsoft.com/office/word/2010/wordprocessingShape">
-                    <wps:wsp>
-                      <wps:cNvCnPr/>
-                      <wps:spPr>
-                        <a:xfrm>
-                          <a:off x="0" y="0"/>
-                          <a:ext cx="5436" cy="1697913"/>
-                        </a:xfrm>
-                        <a:prstGeom prst="line">
-                          <a:avLst/>
-                        </a:prstGeom>
-                        <a:ln w="10795">
-                          <a:solidFill>
-                            <a:srgbClr val="000000"/>
-                          </a:solidFill>
-                          <a:headEnd type="none"/>
-                          <a:tailEnd type="triangle"/>
-                        </a:ln>
-                      </wps:spPr>
-                      <wps:style>
-                        <a:lnRef idx="1">
-                          <a:schemeClr val="accent1"/>
-                        </a:lnRef>
-                        <a:fillRef idx="0">
-                          <a:schemeClr val="accent1"/>
-                        </a:fillRef>
-                        <a:effectRef idx="0">
-                          <a:schemeClr val="accent1"/>
-                        </a:effectRef>
-                        <a:fontRef idx="minor">
-                          <a:schemeClr val="tx1"/>
-                        </a:fontRef>
-                      </wps:style>
-                      <wps:bodyPr/>
-                    </wps:wsp>
-                  </a:graphicData>
-                </a:graphic>
-                <wp14:sizeRelH relativeFrom="margin">
-                  <wp14:pctWidth>0</wp14:pctWidth>
-                </wp14:sizeRelH>
-                <wp14:sizeRelV relativeFrom="margin">
-                  <wp14:pctHeight>0</wp14:pctHeight>
-                </wp14:sizeRelV>
-              </wp:anchor>
-            </w:drawing>
-          </mc:Choice>
-          <mc:Fallback>
-            <w:pict>
-              <v:line w14:anchorId="7FF97709" id="Straight Connector 9" o:spid="_x0000_s1026" style="position:absolute;z-index:251579904;visibility:visible;mso-wrap-style:square;mso-width-percent:0;mso-height-percent:0;mso-wrap-distance-left:9pt;mso-wrap-distance-top:0;mso-wrap-distance-right:9pt;mso-wrap-distance-bottom:0;mso-position-horizontal:absolute;mso-position-horizontal-relative:page;mso-position-vertical:absolute;mso-position-vertical-relative:page;mso-width-percent:0;mso-height-percent:0;mso-width-relative:margin;mso-height-relative:margin" from="269.35pt,152.25pt" to="269.8pt,285.95pt" o:gfxdata="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" o:allowincell="f" strokeweight=".85pt">
-                <v:stroke endarrow="block"/>
-                <w10:wrap anchorx="page" anchory="page"/>
-              </v:line>
-            </w:pict>
-          </mc:Fallback>
-        </mc:AlternateContent>
-      </w:r>
-      <w:r>
-        <w:rPr>
-          <w:noProof/>
-        </w:rPr>
-        <mc:AlternateContent>
-          <mc:Choice Requires="wps">
-            <w:drawing>
-              <wp:anchor distT="0" distB="0" distL="114300" distR="114300" simplePos="0" relativeHeight="251586048" behindDoc="0" locked="0" layoutInCell="0" allowOverlap="1" wp14:anchorId="08B5A1A5" wp14:editId="2D96D312">
-                <wp:simplePos x="0" y="0"/>
-                <wp:positionH relativeFrom="page">
-                  <wp:posOffset>2029767</wp:posOffset>
-                </wp:positionH>
-                <wp:positionV relativeFrom="page">
-                  <wp:posOffset>1929284</wp:posOffset>
-                </wp:positionV>
-                <wp:extent cx="1391697" cy="5024"/>
-                <wp:effectExtent l="0" t="0" r="37465" b="33655"/>
-                <wp:wrapNone/>
-                <wp:docPr id="14" name="Straight Connector 14"/>
-                <wp:cNvGraphicFramePr/>
-                <a:graphic xmlns:a="http://schemas.openxmlformats.org/drawingml/2006/main">
-                  <a:graphicData uri="http://schemas.microsoft.com/office/word/2010/wordprocessingShape">
-                    <wps:wsp>
-                      <wps:cNvCnPr/>
-                      <wps:spPr>
-                        <a:xfrm>
-                          <a:off x="0" y="0"/>
-                          <a:ext cx="1391697" cy="5024"/>
-                        </a:xfrm>
-                        <a:prstGeom prst="line">
-                          <a:avLst/>
-                        </a:prstGeom>
-                        <a:ln w="10795">
-                          <a:solidFill>
-                            <a:srgbClr val="000000"/>
-                          </a:solidFill>
-                          <a:headEnd type="none"/>
-                          <a:tailEnd type="none"/>
-                        </a:ln>
-                      </wps:spPr>
-                      <wps:style>
-                        <a:lnRef idx="1">
-                          <a:schemeClr val="accent1"/>
-                        </a:lnRef>
-                        <a:fillRef idx="0">
-                          <a:schemeClr val="accent1"/>
-                        </a:fillRef>
-                        <a:effectRef idx="0">
-                          <a:schemeClr val="accent1"/>
-                        </a:effectRef>
-                        <a:fontRef idx="minor">
-                          <a:schemeClr val="tx1"/>
-                        </a:fontRef>
-                      </wps:style>
-                      <wps:bodyPr/>
-                    </wps:wsp>
-                  </a:graphicData>
-                </a:graphic>
-                <wp14:sizeRelH relativeFrom="margin">
-                  <wp14:pctWidth>0</wp14:pctWidth>
-                </wp14:sizeRelH>
-              </wp:anchor>
-            </w:drawing>
-          </mc:Choice>
-          <mc:Fallback>
-            <w:pict>
-              <v:line w14:anchorId="03176ED1" id="Straight Connector 14" o:spid="_x0000_s1026" style="position:absolute;z-index:251586048;visibility:visible;mso-wrap-style:square;mso-width-percent:0;mso-wrap-distance-left:9pt;mso-wrap-distance-top:0;mso-wrap-distance-right:9pt;mso-wrap-distance-bottom:0;mso-position-horizontal:absolute;mso-position-horizontal-relative:page;mso-position-vertical:absolute;mso-position-vertical-relative:page;mso-width-percent:0;mso-width-relative:margin" from="159.8pt,151.9pt" to="269.4pt,152.3pt" o:gfxdata="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" o:allowincell="f" strokeweight=".85pt">
-                <w10:wrap anchorx="page" anchory="page"/>
-              </v:line>
-            </w:pict>
-          </mc:Fallback>
-        </mc:AlternateContent>
-      </w:r>
-      <w:r>
-        <w:rPr>
-          <w:noProof/>
-        </w:rPr>
-        <mc:AlternateContent>
-          <mc:Choice Requires="wps">
-            <w:drawing>
-              <wp:anchor distT="0" distB="0" distL="114300" distR="114300" simplePos="0" relativeHeight="251642368" behindDoc="0" locked="0" layoutInCell="0" allowOverlap="1" wp14:anchorId="511F6360" wp14:editId="140A5A8E">
-                <wp:simplePos x="0" y="0"/>
-                <wp:positionH relativeFrom="page">
-                  <wp:posOffset>1941663</wp:posOffset>
-                </wp:positionH>
-                <wp:positionV relativeFrom="page">
-                  <wp:posOffset>3420934</wp:posOffset>
-                </wp:positionV>
-                <wp:extent cx="1422400" cy="152400"/>
-                <wp:effectExtent l="0" t="0" r="6350" b="0"/>
-                <wp:wrapNone/>
-                <wp:docPr id="50" name="Text Box 50"/>
-                <wp:cNvGraphicFramePr/>
-                <a:graphic xmlns:a="http://schemas.openxmlformats.org/drawingml/2006/main">
-                  <a:graphicData uri="http://schemas.microsoft.com/office/word/2010/wordprocessingShape">
-                    <wps:wsp>
-                      <wps:cNvSpPr txBox="1"/>
-                      <wps:spPr>
-                        <a:xfrm>
-                          <a:off x="0" y="0"/>
-                          <a:ext cx="1422400" cy="152400"/>
+                          <a:ext cx="1905000" cy="152400"/>
                         </a:xfrm>
                         <a:prstGeom prst="rect">
                           <a:avLst/>
@@ -1675,446 +1579,10 @@
                             </w:pPr>
                             <w:r>
                               <w:rPr>
-                                <w:color w:val="000000"/>
+                                <w:rFonts w:ascii="Arial" w:hAnsi="Arial"/>
                                 <w:sz w:val="14"/>
                               </w:rPr>
-                              <w:t>View Susceptibility Map</w:t>
-                            </w:r>
-                          </w:p>
-                        </w:txbxContent>
-                      </wps:txbx>
-                      <wps:bodyPr rot="0" spcFirstLastPara="0" vertOverflow="overflow" horzOverflow="overflow" vert="horz" wrap="square" lIns="25400" tIns="12700" rIns="25400" bIns="12700" numCol="1" spcCol="0" rtlCol="0" fromWordArt="0" anchor="ctr" anchorCtr="0" forceAA="0" compatLnSpc="1">
-                        <a:prstTxWarp prst="textNoShape">
-                          <a:avLst/>
-                        </a:prstTxWarp>
-                        <a:noAutofit/>
-                      </wps:bodyPr>
-                    </wps:wsp>
-                  </a:graphicData>
-                </a:graphic>
-              </wp:anchor>
-            </w:drawing>
-          </mc:Choice>
-          <mc:Fallback>
-            <w:pict>
-              <v:shape w14:anchorId="511F6360" id="Text Box 50" o:spid="_x0000_s1034" type="#_x0000_t202" style="position:absolute;margin-left:152.9pt;margin-top:269.35pt;width:112pt;height:12pt;z-index:251642368;visibility:visible;mso-wrap-style:square;mso-wrap-distance-left:9pt;mso-wrap-distance-top:0;mso-wrap-distance-right:9pt;mso-wrap-distance-bottom:0;mso-position-horizontal:absolute;mso-position-horizontal-relative:page;mso-position-vertical:absolute;mso-position-vertical-relative:page;v-text-anchor:middle" o:gfxdata="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" o:allowincell="f" filled="f" stroked="f" strokeweight=".5pt">
-                <v:textbox inset="2pt,1pt,2pt,1pt">
-                  <w:txbxContent>
-                    <w:p>
-                      <w:pPr>
-                        <w:spacing w:after="0"/>
-                        <w:jc w:val="center"/>
-                        <w:rPr>
-                          <w:color w:val="000000"/>
-                          <w:sz w:val="14"/>
-                        </w:rPr>
-                      </w:pPr>
-                      <w:r>
-                        <w:rPr>
-                          <w:color w:val="000000"/>
-                          <w:sz w:val="14"/>
-                        </w:rPr>
-                        <w:t>View Susceptibility Map</w:t>
-                      </w:r>
-                    </w:p>
-                  </w:txbxContent>
-                </v:textbox>
-                <w10:wrap anchorx="page" anchory="page"/>
-              </v:shape>
-            </w:pict>
-          </mc:Fallback>
-        </mc:AlternateContent>
-      </w:r>
-      <w:r>
-        <w:rPr>
-          <w:noProof/>
-        </w:rPr>
-        <mc:AlternateContent>
-          <mc:Choice Requires="wps">
-            <w:drawing>
-              <wp:anchor distT="0" distB="0" distL="114300" distR="114300" simplePos="0" relativeHeight="251648512" behindDoc="0" locked="0" layoutInCell="0" allowOverlap="1" wp14:anchorId="6867DA3D" wp14:editId="751B5861">
-                <wp:simplePos x="0" y="0"/>
-                <wp:positionH relativeFrom="page">
-                  <wp:posOffset>1558053</wp:posOffset>
-                </wp:positionH>
-                <wp:positionV relativeFrom="page">
-                  <wp:posOffset>4046275</wp:posOffset>
-                </wp:positionV>
-                <wp:extent cx="1625600" cy="152400"/>
-                <wp:effectExtent l="0" t="0" r="0" b="0"/>
-                <wp:wrapNone/>
-                <wp:docPr id="51" name="Text Box 51"/>
-                <wp:cNvGraphicFramePr/>
-                <a:graphic xmlns:a="http://schemas.openxmlformats.org/drawingml/2006/main">
-                  <a:graphicData uri="http://schemas.microsoft.com/office/word/2010/wordprocessingShape">
-                    <wps:wsp>
-                      <wps:cNvSpPr txBox="1"/>
-                      <wps:spPr>
-                        <a:xfrm>
-                          <a:off x="0" y="0"/>
-                          <a:ext cx="1625600" cy="152400"/>
-                        </a:xfrm>
-                        <a:prstGeom prst="rect">
-                          <a:avLst/>
-                        </a:prstGeom>
-                        <a:noFill/>
-                        <a:ln w="6350">
-                          <a:noFill/>
-                        </a:ln>
-                        <a:extLst>
-                          <a:ext uri="{91240B29-F687-4F45-9708-019B960494DF}">
-                            <a14:hiddenLine xmlns:a14="http://schemas.microsoft.com/office/drawing/2010/main" w="6350">
-                              <a:solidFill>
-                                <a:prstClr val="black"/>
-                              </a:solidFill>
-                            </a14:hiddenLine>
-                          </a:ext>
-                        </a:extLst>
-                      </wps:spPr>
-                      <wps:txbx>
-                        <w:txbxContent>
-                          <w:p>
-                            <w:pPr>
-                              <w:spacing w:after="0"/>
-                              <w:jc w:val="center"/>
-                              <w:rPr>
-                                <w:color w:val="000000"/>
-                                <w:sz w:val="14"/>
-                              </w:rPr>
-                            </w:pPr>
-                            <w:r>
-                              <w:rPr>
-                                <w:color w:val="000000"/>
-                                <w:sz w:val="14"/>
-                              </w:rPr>
-                              <w:t>View Result and Explanation</w:t>
-                            </w:r>
-                          </w:p>
-                        </w:txbxContent>
-                      </wps:txbx>
-                      <wps:bodyPr rot="0" spcFirstLastPara="0" vertOverflow="overflow" horzOverflow="overflow" vert="horz" wrap="square" lIns="25400" tIns="12700" rIns="25400" bIns="12700" numCol="1" spcCol="0" rtlCol="0" fromWordArt="0" anchor="ctr" anchorCtr="0" forceAA="0" compatLnSpc="1">
-                        <a:prstTxWarp prst="textNoShape">
-                          <a:avLst/>
-                        </a:prstTxWarp>
-                        <a:noAutofit/>
-                      </wps:bodyPr>
-                    </wps:wsp>
-                  </a:graphicData>
-                </a:graphic>
-              </wp:anchor>
-            </w:drawing>
-          </mc:Choice>
-          <mc:Fallback>
-            <w:pict>
-              <v:shape w14:anchorId="6867DA3D" id="Text Box 51" o:spid="_x0000_s1035" type="#_x0000_t202" style="position:absolute;margin-left:122.7pt;margin-top:318.6pt;width:128pt;height:12pt;z-index:251648512;visibility:visible;mso-wrap-style:square;mso-wrap-distance-left:9pt;mso-wrap-distance-top:0;mso-wrap-distance-right:9pt;mso-wrap-distance-bottom:0;mso-position-horizontal:absolute;mso-position-horizontal-relative:page;mso-position-vertical:absolute;mso-position-vertical-relative:page;v-text-anchor:middle" o:gfxdata="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" o:allowincell="f" filled="f" stroked="f" strokeweight=".5pt">
-                <v:textbox inset="2pt,1pt,2pt,1pt">
-                  <w:txbxContent>
-                    <w:p>
-                      <w:pPr>
-                        <w:spacing w:after="0"/>
-                        <w:jc w:val="center"/>
-                        <w:rPr>
-                          <w:color w:val="000000"/>
-                          <w:sz w:val="14"/>
-                        </w:rPr>
-                      </w:pPr>
-                      <w:r>
-                        <w:rPr>
-                          <w:color w:val="000000"/>
-                          <w:sz w:val="14"/>
-                        </w:rPr>
-                        <w:t>View Result and Explanation</w:t>
-                      </w:r>
-                    </w:p>
-                  </w:txbxContent>
-                </v:textbox>
-                <w10:wrap anchorx="page" anchory="page"/>
-              </v:shape>
-            </w:pict>
-          </mc:Fallback>
-        </mc:AlternateContent>
-      </w:r>
-      <w:r>
-        <w:rPr>
-          <w:noProof/>
-        </w:rPr>
-        <mc:AlternateContent>
-          <mc:Choice Requires="wps">
-            <w:drawing>
-              <wp:anchor distT="0" distB="0" distL="114300" distR="114300" simplePos="0" relativeHeight="251654656" behindDoc="0" locked="0" layoutInCell="0" allowOverlap="1" wp14:anchorId="26385700" wp14:editId="33BF88B4">
-                <wp:simplePos x="0" y="0"/>
-                <wp:positionH relativeFrom="page">
-                  <wp:posOffset>1212222</wp:posOffset>
-                </wp:positionH>
-                <wp:positionV relativeFrom="page">
-                  <wp:posOffset>4254500</wp:posOffset>
-                </wp:positionV>
-                <wp:extent cx="2006600" cy="152400"/>
-                <wp:effectExtent l="0" t="0" r="0" b="0"/>
-                <wp:wrapNone/>
-                <wp:docPr id="52" name="Text Box 52"/>
-                <wp:cNvGraphicFramePr/>
-                <a:graphic xmlns:a="http://schemas.openxmlformats.org/drawingml/2006/main">
-                  <a:graphicData uri="http://schemas.microsoft.com/office/word/2010/wordprocessingShape">
-                    <wps:wsp>
-                      <wps:cNvSpPr txBox="1"/>
-                      <wps:spPr>
-                        <a:xfrm>
-                          <a:off x="0" y="0"/>
-                          <a:ext cx="2006600" cy="152400"/>
-                        </a:xfrm>
-                        <a:prstGeom prst="rect">
-                          <a:avLst/>
-                        </a:prstGeom>
-                        <a:noFill/>
-                        <a:ln w="6350">
-                          <a:noFill/>
-                        </a:ln>
-                        <a:extLst>
-                          <a:ext uri="{91240B29-F687-4F45-9708-019B960494DF}">
-                            <a14:hiddenLine xmlns:a14="http://schemas.microsoft.com/office/drawing/2010/main" w="6350">
-                              <a:solidFill>
-                                <a:prstClr val="black"/>
-                              </a:solidFill>
-                            </a14:hiddenLine>
-                          </a:ext>
-                        </a:extLst>
-                      </wps:spPr>
-                      <wps:txbx>
-                        <w:txbxContent>
-                          <w:p>
-                            <w:pPr>
-                              <w:spacing w:after="0"/>
-                              <w:jc w:val="center"/>
-                              <w:rPr>
-                                <w:color w:val="000000"/>
-                                <w:sz w:val="13"/>
-                              </w:rPr>
-                            </w:pPr>
-                            <w:r>
-                              <w:rPr>
-                                <w:color w:val="000000"/>
-                                <w:sz w:val="13"/>
-                              </w:rPr>
-                              <w:t>View Preparedness and Evacuation Info</w:t>
-                            </w:r>
-                          </w:p>
-                        </w:txbxContent>
-                      </wps:txbx>
-                      <wps:bodyPr rot="0" spcFirstLastPara="0" vertOverflow="overflow" horzOverflow="overflow" vert="horz" wrap="square" lIns="25400" tIns="12700" rIns="25400" bIns="12700" numCol="1" spcCol="0" rtlCol="0" fromWordArt="0" anchor="ctr" anchorCtr="0" forceAA="0" compatLnSpc="1">
-                        <a:prstTxWarp prst="textNoShape">
-                          <a:avLst/>
-                        </a:prstTxWarp>
-                        <a:noAutofit/>
-                      </wps:bodyPr>
-                    </wps:wsp>
-                  </a:graphicData>
-                </a:graphic>
-              </wp:anchor>
-            </w:drawing>
-          </mc:Choice>
-          <mc:Fallback>
-            <w:pict>
-              <v:shape w14:anchorId="26385700" id="Text Box 52" o:spid="_x0000_s1036" type="#_x0000_t202" style="position:absolute;margin-left:95.45pt;margin-top:335pt;width:158pt;height:12pt;z-index:251654656;visibility:visible;mso-wrap-style:square;mso-wrap-distance-left:9pt;mso-wrap-distance-top:0;mso-wrap-distance-right:9pt;mso-wrap-distance-bottom:0;mso-position-horizontal:absolute;mso-position-horizontal-relative:page;mso-position-vertical:absolute;mso-position-vertical-relative:page;v-text-anchor:middle" o:gfxdata="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" o:allowincell="f" filled="f" stroked="f" strokeweight=".5pt">
-                <v:textbox inset="2pt,1pt,2pt,1pt">
-                  <w:txbxContent>
-                    <w:p>
-                      <w:pPr>
-                        <w:spacing w:after="0"/>
-                        <w:jc w:val="center"/>
-                        <w:rPr>
-                          <w:color w:val="000000"/>
-                          <w:sz w:val="13"/>
-                        </w:rPr>
-                      </w:pPr>
-                      <w:r>
-                        <w:rPr>
-                          <w:color w:val="000000"/>
-                          <w:sz w:val="13"/>
-                        </w:rPr>
-                        <w:t>View Preparedness and Evacuation Info</w:t>
-                      </w:r>
-                    </w:p>
-                  </w:txbxContent>
-                </v:textbox>
-                <w10:wrap anchorx="page" anchory="page"/>
-              </v:shape>
-            </w:pict>
-          </mc:Fallback>
-        </mc:AlternateContent>
-      </w:r>
-      <w:r>
-        <w:rPr>
-          <w:noProof/>
-        </w:rPr>
-        <mc:AlternateContent>
-          <mc:Choice Requires="wps">
-            <w:drawing>
-              <wp:anchor distT="0" distB="0" distL="114300" distR="114300" simplePos="0" relativeHeight="251630080" behindDoc="0" locked="0" layoutInCell="0" allowOverlap="1" wp14:anchorId="5EA938F3" wp14:editId="6419E8B8">
-                <wp:simplePos x="0" y="0"/>
-                <wp:positionH relativeFrom="page">
-                  <wp:posOffset>1831410</wp:posOffset>
-                </wp:positionH>
-                <wp:positionV relativeFrom="page">
-                  <wp:posOffset>1538716</wp:posOffset>
-                </wp:positionV>
-                <wp:extent cx="1676400" cy="152400"/>
-                <wp:effectExtent l="0" t="0" r="0" b="0"/>
-                <wp:wrapNone/>
-                <wp:docPr id="48" name="Text Box 48"/>
-                <wp:cNvGraphicFramePr/>
-                <a:graphic xmlns:a="http://schemas.openxmlformats.org/drawingml/2006/main">
-                  <a:graphicData uri="http://schemas.microsoft.com/office/word/2010/wordprocessingShape">
-                    <wps:wsp>
-                      <wps:cNvSpPr txBox="1"/>
-                      <wps:spPr>
-                        <a:xfrm>
-                          <a:off x="0" y="0"/>
-                          <a:ext cx="1676400" cy="152400"/>
-                        </a:xfrm>
-                        <a:prstGeom prst="rect">
-                          <a:avLst/>
-                        </a:prstGeom>
-                        <a:noFill/>
-                        <a:ln w="6350">
-                          <a:noFill/>
-                        </a:ln>
-                        <a:extLst>
-                          <a:ext uri="{91240B29-F687-4F45-9708-019B960494DF}">
-                            <a14:hiddenLine xmlns:a14="http://schemas.microsoft.com/office/drawing/2010/main" w="6350">
-                              <a:solidFill>
-                                <a:prstClr val="black"/>
-                              </a:solidFill>
-                            </a14:hiddenLine>
-                          </a:ext>
-                        </a:extLst>
-                      </wps:spPr>
-                      <wps:txbx>
-                        <w:txbxContent>
-                          <w:p>
-                            <w:pPr>
-                              <w:spacing w:after="0"/>
-                              <w:jc w:val="center"/>
-                              <w:rPr>
-                                <w:color w:val="000000"/>
-                                <w:sz w:val="14"/>
-                              </w:rPr>
-                            </w:pPr>
-                            <w:r>
-                              <w:rPr>
-                                <w:color w:val="000000"/>
-                                <w:sz w:val="14"/>
-                              </w:rPr>
-                              <w:t>Set Rainfall Scenario</w:t>
-                            </w:r>
-                          </w:p>
-                        </w:txbxContent>
-                      </wps:txbx>
-                      <wps:bodyPr rot="0" spcFirstLastPara="0" vertOverflow="overflow" horzOverflow="overflow" vert="horz" wrap="square" lIns="25400" tIns="12700" rIns="25400" bIns="12700" numCol="1" spcCol="0" rtlCol="0" fromWordArt="0" anchor="ctr" anchorCtr="0" forceAA="0" compatLnSpc="1">
-                        <a:prstTxWarp prst="textNoShape">
-                          <a:avLst/>
-                        </a:prstTxWarp>
-                        <a:noAutofit/>
-                      </wps:bodyPr>
-                    </wps:wsp>
-                  </a:graphicData>
-                </a:graphic>
-              </wp:anchor>
-            </w:drawing>
-          </mc:Choice>
-          <mc:Fallback>
-            <w:pict>
-              <v:shape w14:anchorId="5EA938F3" id="Text Box 48" o:spid="_x0000_s1037" type="#_x0000_t202" style="position:absolute;margin-left:144.2pt;margin-top:121.15pt;width:132pt;height:12pt;z-index:251630080;visibility:visible;mso-wrap-style:square;mso-wrap-distance-left:9pt;mso-wrap-distance-top:0;mso-wrap-distance-right:9pt;mso-wrap-distance-bottom:0;mso-position-horizontal:absolute;mso-position-horizontal-relative:page;mso-position-vertical:absolute;mso-position-vertical-relative:page;v-text-anchor:middle" o:gfxdata="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" o:allowincell="f" filled="f" stroked="f" strokeweight=".5pt">
-                <v:textbox inset="2pt,1pt,2pt,1pt">
-                  <w:txbxContent>
-                    <w:p>
-                      <w:pPr>
-                        <w:spacing w:after="0"/>
-                        <w:jc w:val="center"/>
-                        <w:rPr>
-                          <w:color w:val="000000"/>
-                          <w:sz w:val="14"/>
-                        </w:rPr>
-                      </w:pPr>
-                      <w:r>
-                        <w:rPr>
-                          <w:color w:val="000000"/>
-                          <w:sz w:val="14"/>
-                        </w:rPr>
-                        <w:t>Set Rainfall Scenario</w:t>
-                      </w:r>
-                    </w:p>
-                  </w:txbxContent>
-                </v:textbox>
-                <w10:wrap anchorx="page" anchory="page"/>
-              </v:shape>
-            </w:pict>
-          </mc:Fallback>
-        </mc:AlternateContent>
-      </w:r>
-      <w:r>
-        <w:rPr>
-          <w:noProof/>
-        </w:rPr>
-        <mc:AlternateContent>
-          <mc:Choice Requires="wps">
-            <w:drawing>
-              <wp:anchor distT="0" distB="0" distL="114300" distR="114300" simplePos="0" relativeHeight="251636224" behindDoc="0" locked="0" layoutInCell="0" allowOverlap="1" wp14:anchorId="117ED4C6" wp14:editId="38F2285D">
-                <wp:simplePos x="0" y="0"/>
-                <wp:positionH relativeFrom="page">
-                  <wp:posOffset>1734178</wp:posOffset>
-                </wp:positionH>
-                <wp:positionV relativeFrom="page">
-                  <wp:posOffset>1788048</wp:posOffset>
-                </wp:positionV>
-                <wp:extent cx="1905000" cy="152400"/>
-                <wp:effectExtent l="0" t="0" r="0" b="0"/>
-                <wp:wrapNone/>
-                <wp:docPr id="49" name="Text Box 49"/>
-                <wp:cNvGraphicFramePr/>
-                <a:graphic xmlns:a="http://schemas.openxmlformats.org/drawingml/2006/main">
-                  <a:graphicData uri="http://schemas.microsoft.com/office/word/2010/wordprocessingShape">
-                    <wps:wsp>
-                      <wps:cNvSpPr txBox="1"/>
-                      <wps:spPr>
-                        <a:xfrm>
-                          <a:off x="0" y="0"/>
-                          <a:ext cx="1905000" cy="152400"/>
-                        </a:xfrm>
-                        <a:prstGeom prst="rect">
-                          <a:avLst/>
-                        </a:prstGeom>
-                        <a:noFill/>
-                        <a:ln w="6350">
-                          <a:noFill/>
-                        </a:ln>
-                        <a:extLst>
-                          <a:ext uri="{91240B29-F687-4F45-9708-019B960494DF}">
-                            <a14:hiddenLine xmlns:a14="http://schemas.microsoft.com/office/drawing/2010/main" w="6350">
-                              <a:solidFill>
-                                <a:prstClr val="black"/>
-                              </a:solidFill>
-                            </a14:hiddenLine>
-                          </a:ext>
-                        </a:extLst>
-                      </wps:spPr>
-                      <wps:txbx>
-                        <w:txbxContent>
-                          <w:p>
-                            <w:pPr>
-                              <w:spacing w:after="0"/>
-                              <w:jc w:val="center"/>
-                              <w:rPr>
-                                <w:color w:val="000000"/>
-                                <w:sz w:val="14"/>
-                              </w:rPr>
-                            </w:pPr>
-                            <w:r>
-                              <w:rPr>
-                                <w:color w:val="000000"/>
-                                <w:sz w:val="14"/>
-                              </w:rPr>
-                              <w:t>Submit Location and DSS Answers</w:t>
+                              <w:t>Preparedness / center request</w:t>
                             </w:r>
                           </w:p>
                         </w:txbxContent>
@@ -2147,10 +1615,10 @@
                       </w:pPr>
                       <w:r>
                         <w:rPr>
-                          <w:color w:val="000000"/>
+                          <w:rFonts w:ascii="Arial" w:hAnsi="Arial"/>
                           <w:sz w:val="14"/>
                         </w:rPr>
-                        <w:t>Submit Location and DSS Answers</w:t>
+                        <w:t>Preparedness / center request</w:t>
                       </w:r>
                     </w:p>
                   </w:txbxContent>
@@ -2492,110 +1960,6 @@
         <w:rPr>
           <w:noProof/>
         </w:rPr>
-        <mc:AlternateContent>
-          <mc:Choice Requires="wps">
-            <w:drawing>
-              <wp:anchor distT="0" distB="0" distL="114300" distR="114300" simplePos="0" relativeHeight="251675136" behindDoc="0" locked="0" layoutInCell="0" allowOverlap="1" wp14:anchorId="2E44E4BD" wp14:editId="27D19842">
-                <wp:simplePos x="0" y="0"/>
-                <wp:positionH relativeFrom="page">
-                  <wp:posOffset>4851400</wp:posOffset>
-                </wp:positionH>
-                <wp:positionV relativeFrom="page">
-                  <wp:posOffset>4165600</wp:posOffset>
-                </wp:positionV>
-                <wp:extent cx="1574800" cy="152400"/>
-                <wp:effectExtent l="0" t="0" r="6350" b="0"/>
-                <wp:wrapNone/>
-                <wp:docPr id="56" name="Text Box 56"/>
-                <wp:cNvGraphicFramePr/>
-                <a:graphic xmlns:a="http://schemas.openxmlformats.org/drawingml/2006/main">
-                  <a:graphicData uri="http://schemas.microsoft.com/office/word/2010/wordprocessingShape">
-                    <wps:wsp>
-                      <wps:cNvSpPr txBox="1"/>
-                      <wps:spPr>
-                        <a:xfrm>
-                          <a:off x="0" y="0"/>
-                          <a:ext cx="1574800" cy="152400"/>
-                        </a:xfrm>
-                        <a:prstGeom prst="rect">
-                          <a:avLst/>
-                        </a:prstGeom>
-                        <a:noFill/>
-                        <a:ln w="6350">
-                          <a:noFill/>
-                        </a:ln>
-                        <a:extLst>
-                          <a:ext uri="{91240B29-F687-4F45-9708-019B960494DF}">
-                            <a14:hiddenLine xmlns:a14="http://schemas.microsoft.com/office/drawing/2010/main" w="6350">
-                              <a:solidFill>
-                                <a:prstClr val="black"/>
-                              </a:solidFill>
-                            </a14:hiddenLine>
-                          </a:ext>
-                        </a:extLst>
-                      </wps:spPr>
-                      <wps:txbx>
-                        <w:txbxContent>
-                          <w:p>
-                            <w:pPr>
-                              <w:spacing w:after="0"/>
-                              <w:jc w:val="center"/>
-                              <w:rPr>
-                                <w:color w:val="000000"/>
-                                <w:sz w:val="13"/>
-                              </w:rPr>
-                            </w:pPr>
-                            <w:r>
-                              <w:rPr>
-                                <w:color w:val="000000"/>
-                                <w:sz w:val="13"/>
-                              </w:rPr>
-                              <w:t>Candidate Records for Review</w:t>
-                            </w:r>
-                          </w:p>
-                        </w:txbxContent>
-                      </wps:txbx>
-                      <wps:bodyPr rot="0" spcFirstLastPara="0" vertOverflow="overflow" horzOverflow="overflow" vert="horz" wrap="square" lIns="25400" tIns="12700" rIns="25400" bIns="12700" numCol="1" spcCol="0" rtlCol="0" fromWordArt="0" anchor="ctr" anchorCtr="0" forceAA="0" compatLnSpc="1">
-                        <a:prstTxWarp prst="textNoShape">
-                          <a:avLst/>
-                        </a:prstTxWarp>
-                        <a:noAutofit/>
-                      </wps:bodyPr>
-                    </wps:wsp>
-                  </a:graphicData>
-                </a:graphic>
-              </wp:anchor>
-            </w:drawing>
-          </mc:Choice>
-          <mc:Fallback>
-            <w:pict>
-              <v:shape w14:anchorId="2E44E4BD" id="Text Box 56" o:spid="_x0000_s1042" type="#_x0000_t202" style="position:absolute;margin-left:382pt;margin-top:328pt;width:124pt;height:12pt;z-index:251675136;visibility:visible;mso-wrap-style:square;mso-wrap-distance-left:9pt;mso-wrap-distance-top:0;mso-wrap-distance-right:9pt;mso-wrap-distance-bottom:0;mso-position-horizontal:absolute;mso-position-horizontal-relative:page;mso-position-vertical:absolute;mso-position-vertical-relative:page;v-text-anchor:middle" o:gfxdata="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" o:allowincell="f" filled="f" stroked="f" strokeweight=".5pt">
-                <v:textbox inset="2pt,1pt,2pt,1pt">
-                  <w:txbxContent>
-                    <w:p>
-                      <w:pPr>
-                        <w:spacing w:after="0"/>
-                        <w:jc w:val="center"/>
-                        <w:rPr>
-                          <w:color w:val="000000"/>
-                          <w:sz w:val="13"/>
-                        </w:rPr>
-                      </w:pPr>
-                      <w:r>
-                        <w:rPr>
-                          <w:color w:val="000000"/>
-                          <w:sz w:val="13"/>
-                        </w:rPr>
-                        <w:t>Candidate Records for Review</w:t>
-                      </w:r>
-                    </w:p>
-                  </w:txbxContent>
-                </v:textbox>
-                <w10:wrap anchorx="page" anchory="page"/>
-              </v:shape>
-            </w:pict>
-          </mc:Fallback>
-        </mc:AlternateContent>
       </w:r>
       <w:r>
         <w:rPr>
@@ -2656,10 +2020,10 @@
                             </w:pPr>
                             <w:r>
                               <w:rPr>
-                                <w:color w:val="000000"/>
+                                <w:rFonts w:ascii="Arial" w:hAnsi="Arial"/>
                                 <w:sz w:val="14"/>
                               </w:rPr>
-                              <w:t>Register / Log In</w:t>
+                              <w:t>Account details / access request</w:t>
                             </w:r>
                           </w:p>
                         </w:txbxContent>
@@ -2692,10 +2056,10 @@
                       </w:pPr>
                       <w:r>
                         <w:rPr>
-                          <w:color w:val="000000"/>
+                          <w:rFonts w:ascii="Arial" w:hAnsi="Arial"/>
                           <w:sz w:val="14"/>
                         </w:rPr>
-                        <w:t>Register / Log In</w:t>
+                        <w:t>Account details / access request</w:t>
                       </w:r>
                     </w:p>
                   </w:txbxContent>
@@ -2992,634 +2356,46 @@
         <w:rPr>
           <w:noProof/>
         </w:rPr>
-        <mc:AlternateContent>
-          <mc:Choice Requires="wps">
-            <w:drawing>
-              <wp:anchor distT="0" distB="0" distL="114300" distR="114300" simplePos="0" relativeHeight="251442688" behindDoc="0" locked="0" layoutInCell="0" allowOverlap="1" wp14:anchorId="4862F763" wp14:editId="08B3124F">
-                <wp:simplePos x="0" y="0"/>
-                <wp:positionH relativeFrom="page">
-                  <wp:posOffset>6477000</wp:posOffset>
-                </wp:positionH>
-                <wp:positionV relativeFrom="page">
-                  <wp:posOffset>2743200</wp:posOffset>
-                </wp:positionV>
-                <wp:extent cx="0" cy="1574800"/>
-                <wp:effectExtent l="76200" t="38100" r="57150" b="25400"/>
-                <wp:wrapNone/>
-                <wp:docPr id="34" name="Straight Connector 34"/>
-                <wp:cNvGraphicFramePr/>
-                <a:graphic xmlns:a="http://schemas.openxmlformats.org/drawingml/2006/main">
-                  <a:graphicData uri="http://schemas.microsoft.com/office/word/2010/wordprocessingShape">
-                    <wps:wsp>
-                      <wps:cNvCnPr/>
-                      <wps:spPr>
-                        <a:xfrm flipV="1">
-                          <a:off x="0" y="0"/>
-                          <a:ext cx="0" cy="1574800"/>
-                        </a:xfrm>
-                        <a:prstGeom prst="line">
-                          <a:avLst/>
-                        </a:prstGeom>
-                        <a:ln w="10795">
-                          <a:solidFill>
-                            <a:srgbClr val="000000"/>
-                          </a:solidFill>
-                          <a:headEnd type="none"/>
-                          <a:tailEnd type="triangle"/>
-                        </a:ln>
-                      </wps:spPr>
-                      <wps:style>
-                        <a:lnRef idx="1">
-                          <a:schemeClr val="accent1"/>
-                        </a:lnRef>
-                        <a:fillRef idx="0">
-                          <a:schemeClr val="accent1"/>
-                        </a:fillRef>
-                        <a:effectRef idx="0">
-                          <a:schemeClr val="accent1"/>
-                        </a:effectRef>
-                        <a:fontRef idx="minor">
-                          <a:schemeClr val="tx1"/>
-                        </a:fontRef>
-                      </wps:style>
-                      <wps:bodyPr/>
-                    </wps:wsp>
-                  </a:graphicData>
-                </a:graphic>
-              </wp:anchor>
-            </w:drawing>
-          </mc:Choice>
-          <mc:Fallback>
-            <w:pict>
-              <v:line w14:anchorId="7CDBAE7F" id="Straight Connector 34" o:spid="_x0000_s1026" style="position:absolute;flip:y;z-index:251442688;visibility:visible;mso-wrap-style:square;mso-wrap-distance-left:9pt;mso-wrap-distance-top:0;mso-wrap-distance-right:9pt;mso-wrap-distance-bottom:0;mso-position-horizontal:absolute;mso-position-horizontal-relative:page;mso-position-vertical:absolute;mso-position-vertical-relative:page" from="510pt,3in" to="510pt,340pt" o:gfxdata="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" o:allowincell="f" strokeweight=".85pt">
-                <v:stroke endarrow="block"/>
-                <w10:wrap anchorx="page" anchory="page"/>
-              </v:line>
-            </w:pict>
-          </mc:Fallback>
-        </mc:AlternateContent>
-      </w:r>
-      <w:r>
-        <w:rPr>
-          <w:noProof/>
-        </w:rPr>
-        <mc:AlternateContent>
-          <mc:Choice Requires="wps">
-            <w:drawing>
-              <wp:anchor distT="0" distB="0" distL="114300" distR="114300" simplePos="0" relativeHeight="251430400" behindDoc="0" locked="0" layoutInCell="0" allowOverlap="1" wp14:anchorId="096B5AA8" wp14:editId="49F7A054">
-                <wp:simplePos x="0" y="0"/>
-                <wp:positionH relativeFrom="page">
-                  <wp:posOffset>4851400</wp:posOffset>
-                </wp:positionH>
-                <wp:positionV relativeFrom="page">
-                  <wp:posOffset>4318000</wp:posOffset>
-                </wp:positionV>
-                <wp:extent cx="1625600" cy="0"/>
-                <wp:effectExtent l="0" t="0" r="0" b="0"/>
-                <wp:wrapNone/>
-                <wp:docPr id="33" name="Straight Connector 33"/>
-                <wp:cNvGraphicFramePr/>
-                <a:graphic xmlns:a="http://schemas.openxmlformats.org/drawingml/2006/main">
-                  <a:graphicData uri="http://schemas.microsoft.com/office/word/2010/wordprocessingShape">
-                    <wps:wsp>
-                      <wps:cNvCnPr/>
-                      <wps:spPr>
-                        <a:xfrm>
-                          <a:off x="0" y="0"/>
-                          <a:ext cx="1625600" cy="0"/>
-                        </a:xfrm>
-                        <a:prstGeom prst="line">
-                          <a:avLst/>
-                        </a:prstGeom>
-                        <a:ln w="10795">
-                          <a:solidFill>
-                            <a:srgbClr val="000000"/>
-                          </a:solidFill>
-                          <a:headEnd type="none"/>
-                          <a:tailEnd type="none"/>
-                        </a:ln>
-                      </wps:spPr>
-                      <wps:style>
-                        <a:lnRef idx="1">
-                          <a:schemeClr val="accent1"/>
-                        </a:lnRef>
-                        <a:fillRef idx="0">
-                          <a:schemeClr val="accent1"/>
-                        </a:fillRef>
-                        <a:effectRef idx="0">
-                          <a:schemeClr val="accent1"/>
-                        </a:effectRef>
-                        <a:fontRef idx="minor">
-                          <a:schemeClr val="tx1"/>
-                        </a:fontRef>
-                      </wps:style>
-                      <wps:bodyPr/>
-                    </wps:wsp>
-                  </a:graphicData>
-                </a:graphic>
-              </wp:anchor>
-            </w:drawing>
-          </mc:Choice>
-          <mc:Fallback>
-            <w:pict>
-              <v:line w14:anchorId="6361FB1D" id="Straight Connector 33" o:spid="_x0000_s1026" style="position:absolute;z-index:251430400;visibility:visible;mso-wrap-style:square;mso-wrap-distance-left:9pt;mso-wrap-distance-top:0;mso-wrap-distance-right:9pt;mso-wrap-distance-bottom:0;mso-position-horizontal:absolute;mso-position-horizontal-relative:page;mso-position-vertical:absolute;mso-position-vertical-relative:page" from="382pt,340pt" to="510pt,340pt" o:gfxdata="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" o:allowincell="f" strokeweight=".85pt">
-                <w10:wrap anchorx="page" anchory="page"/>
-              </v:line>
-            </w:pict>
-          </mc:Fallback>
-        </mc:AlternateContent>
-      </w:r>
-      <w:r>
-        <w:rPr>
-          <w:noProof/>
-        </w:rPr>
-        <mc:AlternateContent>
-          <mc:Choice Requires="wps">
-            <w:drawing>
-              <wp:anchor distT="0" distB="0" distL="114300" distR="114300" simplePos="0" relativeHeight="251418112" behindDoc="0" locked="0" layoutInCell="0" allowOverlap="1" wp14:anchorId="041DA5FA" wp14:editId="28FD58A1">
-                <wp:simplePos x="0" y="0"/>
-                <wp:positionH relativeFrom="page">
-                  <wp:posOffset>4851400</wp:posOffset>
-                </wp:positionH>
-                <wp:positionV relativeFrom="page">
-                  <wp:posOffset>4064000</wp:posOffset>
-                </wp:positionV>
-                <wp:extent cx="203200" cy="0"/>
-                <wp:effectExtent l="38100" t="76200" r="0" b="95250"/>
-                <wp:wrapNone/>
-                <wp:docPr id="32" name="Straight Connector 32"/>
-                <wp:cNvGraphicFramePr/>
-                <a:graphic xmlns:a="http://schemas.openxmlformats.org/drawingml/2006/main">
-                  <a:graphicData uri="http://schemas.microsoft.com/office/word/2010/wordprocessingShape">
-                    <wps:wsp>
-                      <wps:cNvCnPr/>
-                      <wps:spPr>
-                        <a:xfrm flipH="1">
-                          <a:off x="0" y="0"/>
-                          <a:ext cx="203200" cy="0"/>
-                        </a:xfrm>
-                        <a:prstGeom prst="line">
-                          <a:avLst/>
-                        </a:prstGeom>
-                        <a:ln w="10795">
-                          <a:solidFill>
-                            <a:srgbClr val="000000"/>
-                          </a:solidFill>
-                          <a:headEnd type="none"/>
-                          <a:tailEnd type="triangle"/>
-                        </a:ln>
-                      </wps:spPr>
-                      <wps:style>
-                        <a:lnRef idx="1">
-                          <a:schemeClr val="accent1"/>
-                        </a:lnRef>
-                        <a:fillRef idx="0">
-                          <a:schemeClr val="accent1"/>
-                        </a:fillRef>
-                        <a:effectRef idx="0">
-                          <a:schemeClr val="accent1"/>
-                        </a:effectRef>
-                        <a:fontRef idx="minor">
-                          <a:schemeClr val="tx1"/>
-                        </a:fontRef>
-                      </wps:style>
-                      <wps:bodyPr/>
-                    </wps:wsp>
-                  </a:graphicData>
-                </a:graphic>
-              </wp:anchor>
-            </w:drawing>
-          </mc:Choice>
-          <mc:Fallback>
-            <w:pict>
-              <v:line w14:anchorId="2D12CEDF" id="Straight Connector 32" o:spid="_x0000_s1026" style="position:absolute;flip:x;z-index:251418112;visibility:visible;mso-wrap-style:square;mso-wrap-distance-left:9pt;mso-wrap-distance-top:0;mso-wrap-distance-right:9pt;mso-wrap-distance-bottom:0;mso-position-horizontal:absolute;mso-position-horizontal-relative:page;mso-position-vertical:absolute;mso-position-vertical-relative:page" from="382pt,320pt" to="398pt,320pt" o:gfxdata="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" o:allowincell="f" strokeweight=".85pt">
-                <v:stroke endarrow="block"/>
-                <w10:wrap anchorx="page" anchory="page"/>
-              </v:line>
-            </w:pict>
-          </mc:Fallback>
-        </mc:AlternateContent>
-      </w:r>
-      <w:r>
-        <w:rPr>
-          <w:noProof/>
-        </w:rPr>
-        <mc:AlternateContent>
-          <mc:Choice Requires="wps">
-            <w:drawing>
-              <wp:anchor distT="0" distB="0" distL="114300" distR="114300" simplePos="0" relativeHeight="251405824" behindDoc="0" locked="0" layoutInCell="0" allowOverlap="1" wp14:anchorId="23F7A501" wp14:editId="4A482590">
-                <wp:simplePos x="0" y="0"/>
-                <wp:positionH relativeFrom="page">
-                  <wp:posOffset>5054600</wp:posOffset>
-                </wp:positionH>
-                <wp:positionV relativeFrom="page">
-                  <wp:posOffset>3276600</wp:posOffset>
-                </wp:positionV>
-                <wp:extent cx="0" cy="787400"/>
-                <wp:effectExtent l="0" t="0" r="38100" b="31750"/>
-                <wp:wrapNone/>
-                <wp:docPr id="31" name="Straight Connector 31"/>
-                <wp:cNvGraphicFramePr/>
-                <a:graphic xmlns:a="http://schemas.openxmlformats.org/drawingml/2006/main">
-                  <a:graphicData uri="http://schemas.microsoft.com/office/word/2010/wordprocessingShape">
-                    <wps:wsp>
-                      <wps:cNvCnPr/>
-                      <wps:spPr>
-                        <a:xfrm>
-                          <a:off x="0" y="0"/>
-                          <a:ext cx="0" cy="787400"/>
-                        </a:xfrm>
-                        <a:prstGeom prst="line">
-                          <a:avLst/>
-                        </a:prstGeom>
-                        <a:ln w="10795">
-                          <a:solidFill>
-                            <a:srgbClr val="000000"/>
-                          </a:solidFill>
-                          <a:headEnd type="none"/>
-                          <a:tailEnd type="none"/>
-                        </a:ln>
-                      </wps:spPr>
-                      <wps:style>
-                        <a:lnRef idx="1">
-                          <a:schemeClr val="accent1"/>
-                        </a:lnRef>
-                        <a:fillRef idx="0">
-                          <a:schemeClr val="accent1"/>
-                        </a:fillRef>
-                        <a:effectRef idx="0">
-                          <a:schemeClr val="accent1"/>
-                        </a:effectRef>
-                        <a:fontRef idx="minor">
-                          <a:schemeClr val="tx1"/>
-                        </a:fontRef>
-                      </wps:style>
-                      <wps:bodyPr/>
-                    </wps:wsp>
-                  </a:graphicData>
-                </a:graphic>
-              </wp:anchor>
-            </w:drawing>
-          </mc:Choice>
-          <mc:Fallback>
-            <w:pict>
-              <v:line w14:anchorId="711329BE" id="Straight Connector 31" o:spid="_x0000_s1026" style="position:absolute;z-index:251405824;visibility:visible;mso-wrap-style:square;mso-wrap-distance-left:9pt;mso-wrap-distance-top:0;mso-wrap-distance-right:9pt;mso-wrap-distance-bottom:0;mso-position-horizontal:absolute;mso-position-horizontal-relative:page;mso-position-vertical:absolute;mso-position-vertical-relative:page" from="398pt,258pt" to="398pt,320pt" o:gfxdata="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" o:allowincell="f" strokeweight=".85pt">
-                <w10:wrap anchorx="page" anchory="page"/>
-              </v:line>
-            </w:pict>
-          </mc:Fallback>
-        </mc:AlternateContent>
-      </w:r>
-      <w:r>
-        <w:rPr>
-          <w:noProof/>
-        </w:rPr>
-        <mc:AlternateContent>
-          <mc:Choice Requires="wps">
-            <w:drawing>
-              <wp:anchor distT="0" distB="0" distL="114300" distR="114300" simplePos="0" relativeHeight="251393536" behindDoc="0" locked="0" layoutInCell="0" allowOverlap="1" wp14:anchorId="6EA2DD3C" wp14:editId="4C6A6CBD">
-                <wp:simplePos x="0" y="0"/>
-                <wp:positionH relativeFrom="page">
-                  <wp:posOffset>5054600</wp:posOffset>
-                </wp:positionH>
-                <wp:positionV relativeFrom="page">
-                  <wp:posOffset>3276600</wp:posOffset>
-                </wp:positionV>
-                <wp:extent cx="1016000" cy="0"/>
-                <wp:effectExtent l="0" t="0" r="0" b="0"/>
-                <wp:wrapNone/>
-                <wp:docPr id="30" name="Straight Connector 30"/>
-                <wp:cNvGraphicFramePr/>
-                <a:graphic xmlns:a="http://schemas.openxmlformats.org/drawingml/2006/main">
-                  <a:graphicData uri="http://schemas.microsoft.com/office/word/2010/wordprocessingShape">
-                    <wps:wsp>
-                      <wps:cNvCnPr/>
-                      <wps:spPr>
-                        <a:xfrm flipH="1">
-                          <a:off x="0" y="0"/>
-                          <a:ext cx="1016000" cy="0"/>
-                        </a:xfrm>
-                        <a:prstGeom prst="line">
-                          <a:avLst/>
-                        </a:prstGeom>
-                        <a:ln w="10795">
-                          <a:solidFill>
-                            <a:srgbClr val="000000"/>
-                          </a:solidFill>
-                          <a:headEnd type="none"/>
-                          <a:tailEnd type="none"/>
-                        </a:ln>
-                      </wps:spPr>
-                      <wps:style>
-                        <a:lnRef idx="1">
-                          <a:schemeClr val="accent1"/>
-                        </a:lnRef>
-                        <a:fillRef idx="0">
-                          <a:schemeClr val="accent1"/>
-                        </a:fillRef>
-                        <a:effectRef idx="0">
-                          <a:schemeClr val="accent1"/>
-                        </a:effectRef>
-                        <a:fontRef idx="minor">
-                          <a:schemeClr val="tx1"/>
-                        </a:fontRef>
-                      </wps:style>
-                      <wps:bodyPr/>
-                    </wps:wsp>
-                  </a:graphicData>
-                </a:graphic>
-              </wp:anchor>
-            </w:drawing>
-          </mc:Choice>
-          <mc:Fallback>
-            <w:pict>
-              <v:line w14:anchorId="015F044B" id="Straight Connector 30" o:spid="_x0000_s1026" style="position:absolute;flip:x;z-index:251393536;visibility:visible;mso-wrap-style:square;mso-wrap-distance-left:9pt;mso-wrap-distance-top:0;mso-wrap-distance-right:9pt;mso-wrap-distance-bottom:0;mso-position-horizontal:absolute;mso-position-horizontal-relative:page;mso-position-vertical:absolute;mso-position-vertical-relative:page" from="398pt,258pt" to="478pt,258pt" o:gfxdata="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" o:allowincell="f" strokeweight=".85pt">
-                <w10:wrap anchorx="page" anchory="page"/>
-              </v:line>
-            </w:pict>
-          </mc:Fallback>
-        </mc:AlternateContent>
-      </w:r>
-      <w:r>
-        <w:rPr>
-          <w:noProof/>
-        </w:rPr>
-        <mc:AlternateContent>
-          <mc:Choice Requires="wps">
-            <w:drawing>
-              <wp:anchor distT="0" distB="0" distL="114300" distR="114300" simplePos="0" relativeHeight="251381248" behindDoc="0" locked="0" layoutInCell="0" allowOverlap="1" wp14:anchorId="4A43214B" wp14:editId="717A5CE7">
-                <wp:simplePos x="0" y="0"/>
-                <wp:positionH relativeFrom="page">
-                  <wp:posOffset>6070600</wp:posOffset>
-                </wp:positionH>
-                <wp:positionV relativeFrom="page">
-                  <wp:posOffset>2743200</wp:posOffset>
-                </wp:positionV>
-                <wp:extent cx="0" cy="533400"/>
-                <wp:effectExtent l="0" t="0" r="38100" b="19050"/>
-                <wp:wrapNone/>
-                <wp:docPr id="29" name="Straight Connector 29"/>
-                <wp:cNvGraphicFramePr/>
-                <a:graphic xmlns:a="http://schemas.openxmlformats.org/drawingml/2006/main">
-                  <a:graphicData uri="http://schemas.microsoft.com/office/word/2010/wordprocessingShape">
-                    <wps:wsp>
-                      <wps:cNvCnPr/>
-                      <wps:spPr>
-                        <a:xfrm>
-                          <a:off x="0" y="0"/>
-                          <a:ext cx="0" cy="533400"/>
-                        </a:xfrm>
-                        <a:prstGeom prst="line">
-                          <a:avLst/>
-                        </a:prstGeom>
-                        <a:ln w="10795">
-                          <a:solidFill>
-                            <a:srgbClr val="000000"/>
-                          </a:solidFill>
-                          <a:headEnd type="none"/>
-                          <a:tailEnd type="none"/>
-                        </a:ln>
-                      </wps:spPr>
-                      <wps:style>
-                        <a:lnRef idx="1">
-                          <a:schemeClr val="accent1"/>
-                        </a:lnRef>
-                        <a:fillRef idx="0">
-                          <a:schemeClr val="accent1"/>
-                        </a:fillRef>
-                        <a:effectRef idx="0">
-                          <a:schemeClr val="accent1"/>
-                        </a:effectRef>
-                        <a:fontRef idx="minor">
-                          <a:schemeClr val="tx1"/>
-                        </a:fontRef>
-                      </wps:style>
-                      <wps:bodyPr/>
-                    </wps:wsp>
-                  </a:graphicData>
-                </a:graphic>
-              </wp:anchor>
-            </w:drawing>
-          </mc:Choice>
-          <mc:Fallback>
-            <w:pict>
-              <v:line w14:anchorId="1F7C3F8D" id="Straight Connector 29" o:spid="_x0000_s1026" style="position:absolute;z-index:251381248;visibility:visible;mso-wrap-style:square;mso-wrap-distance-left:9pt;mso-wrap-distance-top:0;mso-wrap-distance-right:9pt;mso-wrap-distance-bottom:0;mso-position-horizontal:absolute;mso-position-horizontal-relative:page;mso-position-vertical:absolute;mso-position-vertical-relative:page" from="478pt,3in" to="478pt,258pt" o:gfxdata="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" o:allowincell="f" strokeweight=".85pt">
-                <w10:wrap anchorx="page" anchory="page"/>
-              </v:line>
-            </w:pict>
-          </mc:Fallback>
-        </mc:AlternateContent>
-      </w:r>
-      <w:r>
-        <w:rPr>
-          <w:noProof/>
-        </w:rPr>
-        <mc:AlternateContent>
-          <mc:Choice Requires="wps">
-            <w:drawing>
-              <wp:anchor distT="0" distB="0" distL="114300" distR="114300" simplePos="0" relativeHeight="251304448" behindDoc="0" locked="0" layoutInCell="0" allowOverlap="1" wp14:anchorId="402100AB" wp14:editId="3AE3CECC">
-                <wp:simplePos x="0" y="0"/>
-                <wp:positionH relativeFrom="page">
-                  <wp:posOffset>5562600</wp:posOffset>
-                </wp:positionH>
-                <wp:positionV relativeFrom="page">
-                  <wp:posOffset>2743200</wp:posOffset>
-                </wp:positionV>
-                <wp:extent cx="0" cy="254000"/>
-                <wp:effectExtent l="0" t="0" r="38100" b="31750"/>
-                <wp:wrapNone/>
-                <wp:docPr id="25" name="Straight Connector 25"/>
-                <wp:cNvGraphicFramePr/>
-                <a:graphic xmlns:a="http://schemas.openxmlformats.org/drawingml/2006/main">
-                  <a:graphicData uri="http://schemas.microsoft.com/office/word/2010/wordprocessingShape">
-                    <wps:wsp>
-                      <wps:cNvCnPr/>
-                      <wps:spPr>
-                        <a:xfrm>
-                          <a:off x="0" y="0"/>
-                          <a:ext cx="0" cy="254000"/>
-                        </a:xfrm>
-                        <a:prstGeom prst="line">
-                          <a:avLst/>
-                        </a:prstGeom>
-                        <a:ln w="10795">
-                          <a:solidFill>
-                            <a:srgbClr val="000000"/>
-                          </a:solidFill>
-                          <a:headEnd type="none"/>
-                          <a:tailEnd type="none"/>
-                        </a:ln>
-                      </wps:spPr>
-                      <wps:style>
-                        <a:lnRef idx="1">
-                          <a:schemeClr val="accent1"/>
-                        </a:lnRef>
-                        <a:fillRef idx="0">
-                          <a:schemeClr val="accent1"/>
-                        </a:fillRef>
-                        <a:effectRef idx="0">
-                          <a:schemeClr val="accent1"/>
-                        </a:effectRef>
-                        <a:fontRef idx="minor">
-                          <a:schemeClr val="tx1"/>
-                        </a:fontRef>
-                      </wps:style>
-                      <wps:bodyPr/>
-                    </wps:wsp>
-                  </a:graphicData>
-                </a:graphic>
-              </wp:anchor>
-            </w:drawing>
-          </mc:Choice>
-          <mc:Fallback>
-            <w:pict>
-              <v:line w14:anchorId="709BB2DB" id="Straight Connector 25" o:spid="_x0000_s1026" style="position:absolute;z-index:251304448;visibility:visible;mso-wrap-style:square;mso-wrap-distance-left:9pt;mso-wrap-distance-top:0;mso-wrap-distance-right:9pt;mso-wrap-distance-bottom:0;mso-position-horizontal:absolute;mso-position-horizontal-relative:page;mso-position-vertical:absolute;mso-position-vertical-relative:page" from="438pt,3in" to="438pt,236pt" o:gfxdata="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" o:allowincell="f" strokeweight=".85pt">
-                <w10:wrap anchorx="page" anchory="page"/>
-              </v:line>
-            </w:pict>
-          </mc:Fallback>
-        </mc:AlternateContent>
-      </w:r>
-      <w:r>
-        <w:rPr>
-          <w:noProof/>
-        </w:rPr>
-        <mc:AlternateContent>
-          <mc:Choice Requires="wps">
-            <w:drawing>
-              <wp:anchor distT="0" distB="0" distL="114300" distR="114300" simplePos="0" relativeHeight="251296256" behindDoc="0" locked="0" layoutInCell="0" allowOverlap="1" wp14:anchorId="3E2392D0" wp14:editId="3C64EABA">
-                <wp:simplePos x="0" y="0"/>
-                <wp:positionH relativeFrom="page">
-                  <wp:posOffset>4572000</wp:posOffset>
-                </wp:positionH>
-                <wp:positionV relativeFrom="page">
-                  <wp:posOffset>2260600</wp:posOffset>
-                </wp:positionV>
-                <wp:extent cx="0" cy="1371600"/>
-                <wp:effectExtent l="76200" t="0" r="57150" b="57150"/>
-                <wp:wrapNone/>
-                <wp:docPr id="24" name="Straight Connector 24"/>
-                <wp:cNvGraphicFramePr/>
-                <a:graphic xmlns:a="http://schemas.openxmlformats.org/drawingml/2006/main">
-                  <a:graphicData uri="http://schemas.microsoft.com/office/word/2010/wordprocessingShape">
-                    <wps:wsp>
-                      <wps:cNvCnPr/>
-                      <wps:spPr>
-                        <a:xfrm>
-                          <a:off x="0" y="0"/>
-                          <a:ext cx="0" cy="1371600"/>
-                        </a:xfrm>
-                        <a:prstGeom prst="line">
-                          <a:avLst/>
-                        </a:prstGeom>
-                        <a:ln w="10795">
-                          <a:solidFill>
-                            <a:srgbClr val="000000"/>
-                          </a:solidFill>
-                          <a:headEnd type="none"/>
-                          <a:tailEnd type="triangle"/>
-                        </a:ln>
-                      </wps:spPr>
-                      <wps:style>
-                        <a:lnRef idx="1">
-                          <a:schemeClr val="accent1"/>
-                        </a:lnRef>
-                        <a:fillRef idx="0">
-                          <a:schemeClr val="accent1"/>
-                        </a:fillRef>
-                        <a:effectRef idx="0">
-                          <a:schemeClr val="accent1"/>
-                        </a:effectRef>
-                        <a:fontRef idx="minor">
-                          <a:schemeClr val="tx1"/>
-                        </a:fontRef>
-                      </wps:style>
-                      <wps:bodyPr/>
-                    </wps:wsp>
-                  </a:graphicData>
-                </a:graphic>
-              </wp:anchor>
-            </w:drawing>
-          </mc:Choice>
-          <mc:Fallback>
-            <w:pict>
-              <v:line w14:anchorId="7AED7270" id="Straight Connector 24" o:spid="_x0000_s1026" style="position:absolute;z-index:251296256;visibility:visible;mso-wrap-style:square;mso-wrap-distance-left:9pt;mso-wrap-distance-top:0;mso-wrap-distance-right:9pt;mso-wrap-distance-bottom:0;mso-position-horizontal:absolute;mso-position-horizontal-relative:page;mso-position-vertical:absolute;mso-position-vertical-relative:page" from="5in,178pt" to="5in,286pt" o:gfxdata="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" o:allowincell="f" strokeweight=".85pt">
-                <v:stroke endarrow="block"/>
-                <w10:wrap anchorx="page" anchory="page"/>
-              </v:line>
-            </w:pict>
-          </mc:Fallback>
-        </mc:AlternateContent>
-      </w:r>
-      <w:r>
-        <w:rPr>
-          <w:noProof/>
-        </w:rPr>
-        <mc:AlternateContent>
-          <mc:Choice Requires="wps">
-            <w:drawing>
-              <wp:anchor distT="0" distB="0" distL="114300" distR="114300" simplePos="0" relativeHeight="251288064" behindDoc="0" locked="0" layoutInCell="0" allowOverlap="1" wp14:anchorId="791756BE" wp14:editId="1D3BCE15">
-                <wp:simplePos x="0" y="0"/>
-                <wp:positionH relativeFrom="page">
-                  <wp:posOffset>4572000</wp:posOffset>
-                </wp:positionH>
-                <wp:positionV relativeFrom="page">
-                  <wp:posOffset>2260600</wp:posOffset>
-                </wp:positionV>
-                <wp:extent cx="685800" cy="0"/>
-                <wp:effectExtent l="0" t="0" r="0" b="0"/>
-                <wp:wrapNone/>
-                <wp:docPr id="23" name="Straight Connector 23"/>
-                <wp:cNvGraphicFramePr/>
-                <a:graphic xmlns:a="http://schemas.openxmlformats.org/drawingml/2006/main">
-                  <a:graphicData uri="http://schemas.microsoft.com/office/word/2010/wordprocessingShape">
-                    <wps:wsp>
-                      <wps:cNvCnPr/>
-                      <wps:spPr>
-                        <a:xfrm flipH="1">
-                          <a:off x="0" y="0"/>
-                          <a:ext cx="685800" cy="0"/>
-                        </a:xfrm>
-                        <a:prstGeom prst="line">
-                          <a:avLst/>
-                        </a:prstGeom>
-                        <a:ln w="10795">
-                          <a:solidFill>
-                            <a:srgbClr val="000000"/>
-                          </a:solidFill>
-                          <a:headEnd type="none"/>
-                          <a:tailEnd type="none"/>
-                        </a:ln>
-                      </wps:spPr>
-                      <wps:style>
-                        <a:lnRef idx="1">
-                          <a:schemeClr val="accent1"/>
-                        </a:lnRef>
-                        <a:fillRef idx="0">
-                          <a:schemeClr val="accent1"/>
-                        </a:fillRef>
-                        <a:effectRef idx="0">
-                          <a:schemeClr val="accent1"/>
-                        </a:effectRef>
-                        <a:fontRef idx="minor">
-                          <a:schemeClr val="tx1"/>
-                        </a:fontRef>
-                      </wps:style>
-                      <wps:bodyPr/>
-                    </wps:wsp>
-                  </a:graphicData>
-                </a:graphic>
-              </wp:anchor>
-            </w:drawing>
-          </mc:Choice>
-          <mc:Fallback>
-            <w:pict>
-              <v:line w14:anchorId="438BDC09" id="Straight Connector 23" o:spid="_x0000_s1026" style="position:absolute;flip:x;z-index:251288064;visibility:visible;mso-wrap-style:square;mso-wrap-distance-left:9pt;mso-wrap-distance-top:0;mso-wrap-distance-right:9pt;mso-wrap-distance-bottom:0;mso-position-horizontal:absolute;mso-position-horizontal-relative:page;mso-position-vertical:absolute;mso-position-vertical-relative:page" from="5in,178pt" to="414pt,178pt" o:gfxdata="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" o:allowincell="f" strokeweight=".85pt">
-                <w10:wrap anchorx="page" anchory="page"/>
-              </v:line>
-            </w:pict>
-          </mc:Fallback>
-        </mc:AlternateContent>
+      </w:r>
+      <w:r>
+        <w:rPr>
+          <w:noProof/>
+        </w:rPr>
+      </w:r>
+      <w:r>
+        <w:rPr>
+          <w:noProof/>
+        </w:rPr>
+      </w:r>
+      <w:r>
+        <w:rPr>
+          <w:noProof/>
+        </w:rPr>
+      </w:r>
+      <w:r>
+        <w:rPr>
+          <w:noProof/>
+        </w:rPr>
+      </w:r>
+      <w:r>
+        <w:rPr>
+          <w:noProof/>
+        </w:rPr>
+      </w:r>
+      <w:r>
+        <w:rPr>
+          <w:noProof/>
+        </w:rPr>
+      </w:r>
+      <w:r>
+        <w:rPr>
+          <w:noProof/>
+        </w:rPr>
+      </w:r>
+      <w:r>
+        <w:rPr>
+          <w:noProof/>
+        </w:rPr>
       </w:r>
       <w:r>
         <w:rPr>
@@ -4716,7 +3492,7 @@
                                 <w:color w:val="000000"/>
                                 <w:sz w:val="16"/>
                               </w:rPr>
-                              <w:t>Authorized Administrator</w:t>
+                              <w:t>Authorized Admin</w:t>
                             </w:r>
                           </w:p>
                         </w:txbxContent>
@@ -4754,7 +3530,7 @@
                           <w:color w:val="000000"/>
                           <w:sz w:val="16"/>
                         </w:rPr>
-                        <w:t>Authorized Administrator</w:t>
+                        <w:t>Authorized Admin</w:t>
                       </w:r>
                     </w:p>
                   </w:txbxContent>
@@ -4769,185 +3545,6 @@
         <w:rPr>
           <w:noProof/>
         </w:rPr>
-        <mc:AlternateContent>
-          <mc:Choice Requires="wps">
-            <w:drawing>
-              <wp:anchor distT="0" distB="0" distL="114300" distR="114300" simplePos="0" relativeHeight="251725824" behindDoc="0" locked="0" layoutInCell="0" allowOverlap="1" wp14:anchorId="5153AAD7" wp14:editId="708301E3">
-                <wp:simplePos x="0" y="0"/>
-                <wp:positionH relativeFrom="page">
-                  <wp:posOffset>5257800</wp:posOffset>
-                </wp:positionH>
-                <wp:positionV relativeFrom="page">
-                  <wp:posOffset>2032000</wp:posOffset>
-                </wp:positionV>
-                <wp:extent cx="1397000" cy="711200"/>
-                <wp:effectExtent l="0" t="0" r="12700" b="12700"/>
-                <wp:wrapNone/>
-                <wp:docPr id="3" name="Rectangle 3"/>
-                <wp:cNvGraphicFramePr/>
-                <a:graphic xmlns:a="http://schemas.openxmlformats.org/drawingml/2006/main">
-                  <a:graphicData uri="http://schemas.microsoft.com/office/word/2010/wordprocessingShape">
-                    <wps:wsp>
-                      <wps:cNvSpPr/>
-                      <wps:spPr>
-                        <a:xfrm>
-                          <a:off x="0" y="0"/>
-                          <a:ext cx="1397000" cy="711200"/>
-                        </a:xfrm>
-                        <a:prstGeom prst="rect">
-                          <a:avLst/>
-                        </a:prstGeom>
-                        <a:solidFill>
-                          <a:srgbClr val="FFFFFF"/>
-                        </a:solidFill>
-                        <a:ln w="12700">
-                          <a:solidFill>
-                            <a:srgbClr val="000000"/>
-                          </a:solidFill>
-                        </a:ln>
-                      </wps:spPr>
-                      <wps:style>
-                        <a:lnRef idx="2">
-                          <a:schemeClr val="accent1">
-                            <a:shade val="50000"/>
-                          </a:schemeClr>
-                        </a:lnRef>
-                        <a:fillRef idx="1">
-                          <a:schemeClr val="accent1"/>
-                        </a:fillRef>
-                        <a:effectRef idx="0">
-                          <a:schemeClr val="accent1"/>
-                        </a:effectRef>
-                        <a:fontRef idx="minor">
-                          <a:schemeClr val="lt1"/>
-                        </a:fontRef>
-                      </wps:style>
-                      <wps:txbx>
-                        <w:txbxContent>
-                          <w:p>
-                            <w:pPr>
-                              <w:spacing w:after="0"/>
-                              <w:jc w:val="center"/>
-                              <w:rPr>
-                                <w:b/>
-                                <w:color w:val="000000"/>
-                                <w:sz w:val="13"/>
-                              </w:rPr>
-                            </w:pPr>
-                            <w:r>
-                              <w:rPr>
-                                <w:b/>
-                                <w:color w:val="000000"/>
-                                <w:sz w:val="13"/>
-                              </w:rPr>
-                              <w:t>Data Sources /</w:t>
-                            </w:r>
-                          </w:p>
-                          <w:p>
-                            <w:pPr>
-                              <w:spacing w:after="0"/>
-                              <w:jc w:val="center"/>
-                              <w:rPr>
-                                <w:b/>
-                                <w:color w:val="000000"/>
-                                <w:sz w:val="13"/>
-                              </w:rPr>
-                            </w:pPr>
-                            <w:r>
-                              <w:rPr>
-                                <w:b/>
-                                <w:color w:val="000000"/>
-                                <w:sz w:val="13"/>
-                              </w:rPr>
-                              <w:t>Expert Reviewers</w:t>
-                            </w:r>
-                          </w:p>
-                          <w:p>
-                            <w:pPr>
-                              <w:spacing w:after="0"/>
-                              <w:jc w:val="center"/>
-                              <w:rPr>
-                                <w:b/>
-                                <w:color w:val="000000"/>
-                                <w:sz w:val="13"/>
-                              </w:rPr>
-                            </w:pPr>
-                          </w:p>
-                        </w:txbxContent>
-                      </wps:txbx>
-                      <wps:bodyPr rot="0" spcFirstLastPara="0" vertOverflow="overflow" horzOverflow="overflow" vert="horz" wrap="square" lIns="25400" tIns="12700" rIns="25400" bIns="12700" numCol="1" spcCol="0" rtlCol="0" fromWordArt="0" anchor="ctr" anchorCtr="0" forceAA="0" compatLnSpc="1">
-                        <a:prstTxWarp prst="textNoShape">
-                          <a:avLst/>
-                        </a:prstTxWarp>
-                        <a:noAutofit/>
-                      </wps:bodyPr>
-                    </wps:wsp>
-                  </a:graphicData>
-                </a:graphic>
-              </wp:anchor>
-            </w:drawing>
-          </mc:Choice>
-          <mc:Fallback>
-            <w:pict>
-              <v:rect w14:anchorId="5153AAD7" id="Rectangle 3" o:spid="_x0000_s1046" style="position:absolute;margin-left:414pt;margin-top:160pt;width:110pt;height:56pt;z-index:251725824;visibility:visible;mso-wrap-style:square;mso-wrap-distance-left:9pt;mso-wrap-distance-top:0;mso-wrap-distance-right:9pt;mso-wrap-distance-bottom:0;mso-position-horizontal:absolute;mso-position-horizontal-relative:page;mso-position-vertical:absolute;mso-position-vertical-relative:page;v-text-anchor:middle" o:gfxdata="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" o:allowincell="f" strokeweight="1pt">
-                <v:textbox inset="2pt,1pt,2pt,1pt">
-                  <w:txbxContent>
-                    <w:p>
-                      <w:pPr>
-                        <w:spacing w:after="0"/>
-                        <w:jc w:val="center"/>
-                        <w:rPr>
-                          <w:b/>
-                          <w:color w:val="000000"/>
-                          <w:sz w:val="13"/>
-                        </w:rPr>
-                      </w:pPr>
-                      <w:r>
-                        <w:rPr>
-                          <w:b/>
-                          <w:color w:val="000000"/>
-                          <w:sz w:val="13"/>
-                        </w:rPr>
-                        <w:t>Data Sources /</w:t>
-                      </w:r>
-                    </w:p>
-                    <w:p>
-                      <w:pPr>
-                        <w:spacing w:after="0"/>
-                        <w:jc w:val="center"/>
-                        <w:rPr>
-                          <w:b/>
-                          <w:color w:val="000000"/>
-                          <w:sz w:val="13"/>
-                        </w:rPr>
-                      </w:pPr>
-                      <w:r>
-                        <w:rPr>
-                          <w:b/>
-                          <w:color w:val="000000"/>
-                          <w:sz w:val="13"/>
-                        </w:rPr>
-                        <w:t>Expert Reviewers</w:t>
-                      </w:r>
-                    </w:p>
-                    <w:p>
-                      <w:pPr>
-                        <w:spacing w:after="0"/>
-                        <w:jc w:val="center"/>
-                        <w:rPr>
-                          <w:b/>
-                          <w:color w:val="000000"/>
-                          <w:sz w:val="13"/>
-                        </w:rPr>
-                      </w:pPr>
-                    </w:p>
-                  </w:txbxContent>
-                </v:textbox>
-                <w10:wrap anchorx="page" anchory="page"/>
-              </v:rect>
-            </w:pict>
-          </mc:Fallback>
-        </mc:AlternateContent>
       </w:r>
       <w:r>
         <w:rPr>
@@ -5175,6 +3772,71 @@
             </w:pict>
           </mc:Fallback>
         </mc:AlternateContent>
+      </w:r>
+      <w:r>
+        <w:pict>
+          <v:line id="Resident access response 1" style="position:absolute;mso-position-horizontal-relative:page;mso-position-vertical-relative:page" from="244pt,295pt" to="200pt,295pt" strokecolor="#000000" strokeweight="0.8pt"/>
+          <v:line id="Resident access response 2" style="position:absolute;mso-position-horizontal-relative:page;mso-position-vertical-relative:page" from="200pt,295pt" to="200pt,190pt" strokecolor="#000000" strokeweight="0.8pt"/>
+          <v:line id="Resident access response 3" style="position:absolute;mso-position-horizontal-relative:page;mso-position-vertical-relative:page" from="200pt,190pt" to="182pt,190pt" strokecolor="#000000" strokeweight="0.8pt">
+            <v:stroke endarrow="block" endarrowlength="short" endarrowwidth="narrow"/>
+          </v:line>
+          <v:rect id="Resident access response label" style="position:absolute;margin-left:205.000pt;margin-top:230.000pt;width:66.000pt;height:28.000pt;mso-position-horizontal-relative:page;mso-position-vertical-relative:page;v-text-anchor:middle" fillcolor="#FFFFFF" strokecolor="#000000" strokeweight=".8pt" stroked="f" filled="f">
+            <v:textbox inset="1pt,1pt,1pt,1pt">
+              <w:txbxContent>
+                <w:p>
+                  <w:pPr>
+                    <w:spacing w:before="0" w:after="0" w:line="240" w:lineRule="auto"/>
+                    <w:jc w:val="center"/>
+                  </w:pPr>
+                  <w:r>
+                    <w:rPr>
+                      <w:rFonts w:ascii="Arial" w:hAnsi="Arial"/>
+                      <w:sz w:val="14"/>
+                    </w:rPr>
+                    <w:t>Access</w:t>
+                  </w:r>
+                </w:p>
+                <w:p>
+                  <w:pPr>
+                    <w:spacing w:before="0" w:after="0" w:line="240" w:lineRule="auto"/>
+                    <w:jc w:val="center"/>
+                  </w:pPr>
+                  <w:r>
+                    <w:rPr>
+                      <w:rFonts w:ascii="Arial" w:hAnsi="Arial"/>
+                      <w:sz w:val="14"/>
+                    </w:rPr>
+                    <w:t>response</w:t>
+                  </w:r>
+                </w:p>
+              </w:txbxContent>
+            </v:textbox>
+          </v:rect>
+          <v:line id="Admin access response 1" style="position:absolute;mso-position-horizontal-relative:page;mso-position-vertical-relative:page" from="382pt,350pt" to="400pt,350pt" strokecolor="#000000" strokeweight="0.8pt"/>
+          <v:line id="Admin access response 2" style="position:absolute;mso-position-horizontal-relative:page;mso-position-vertical-relative:page" from="400pt,350pt" to="400pt,515pt" strokecolor="#000000" strokeweight="0.8pt"/>
+          <v:line id="Admin access response 3" style="position:absolute;mso-position-horizontal-relative:page;mso-position-vertical-relative:page" from="400pt,515pt" to="377pt,515pt" strokecolor="#000000" strokeweight="0.8pt">
+            <v:stroke endarrow="block" endarrowlength="short" endarrowwidth="narrow"/>
+          </v:line>
+          <v:rect id="Admin access response label" style="position:absolute;margin-left:402.000pt;margin-top:468.000pt;width:78.000pt;height:20.000pt;mso-position-horizontal-relative:page;mso-position-vertical-relative:page;v-text-anchor:middle" fillcolor="#FFFFFF" strokecolor="#000000" strokeweight=".8pt" stroked="f" filled="f">
+            <v:textbox inset="1pt,1pt,1pt,1pt">
+              <w:txbxContent>
+                <w:p>
+                  <w:pPr>
+                    <w:spacing w:before="0" w:after="0" w:line="240" w:lineRule="auto"/>
+                    <w:jc w:val="center"/>
+                  </w:pPr>
+                  <w:r>
+                    <w:rPr>
+                      <w:rFonts w:ascii="Arial" w:hAnsi="Arial"/>
+                      <w:sz w:val="14"/>
+                    </w:rPr>
+                    <w:t>Access response</w:t>
+                  </w:r>
+                </w:p>
+              </w:txbxContent>
+            </v:textbox>
+          </v:rect>
+        </w:pict>
       </w:r>
     </w:p>
     <w:sectPr>

</xml_diff>